<commit_message>
finished the redis questions
</commit_message>
<xml_diff>
--- a/hfifa_questions_1.docx
+++ b/hfifa_questions_1.docx
@@ -56,8 +56,13 @@
       <w:pPr>
         <w:bidi/>
       </w:pPr>
-      <w:r>
-        <w:t>[ ] word</w:t>
+      <w:proofErr w:type="gramStart"/>
+      <w:r>
+        <w:t>[ ]</w:t>
+      </w:r>
+      <w:proofErr w:type="gramEnd"/>
+      <w:r>
+        <w:t xml:space="preserve"> word</w:t>
       </w:r>
       <w:r>
         <w:rPr>
@@ -74,7 +79,21 @@
         <w:rPr>
           <w:rtl/>
         </w:rPr>
-        <w:t xml:space="preserve">וכל למידה חדשה תוסיפו כברנאץ. </w:t>
+        <w:t xml:space="preserve">וכל למידה חדשה תוסיפו </w:t>
+      </w:r>
+      <w:proofErr w:type="spellStart"/>
+      <w:r>
+        <w:rPr>
+          <w:rtl/>
+        </w:rPr>
+        <w:t>כברנאץ</w:t>
+      </w:r>
+      <w:proofErr w:type="spellEnd"/>
+      <w:r>
+        <w:rPr>
+          <w:rtl/>
+        </w:rPr>
+        <w:t xml:space="preserve">. </w:t>
       </w:r>
       <w:r>
         <w:t>git</w:t>
@@ -111,9 +130,11 @@
       <w:pPr>
         <w:bidi/>
       </w:pPr>
+      <w:proofErr w:type="gramStart"/>
       <w:r>
         <w:t>?SQL</w:t>
       </w:r>
+      <w:proofErr w:type="gramEnd"/>
       <w:r>
         <w:rPr>
           <w:rtl/>
@@ -148,7 +169,21 @@
         <w:rPr>
           <w:rtl/>
         </w:rPr>
-        <w:t xml:space="preserve"> המידע נשמר במבנה רלציוני בטבל</w:t>
+        <w:t xml:space="preserve"> המידע נשמר במבנה </w:t>
+      </w:r>
+      <w:proofErr w:type="spellStart"/>
+      <w:r>
+        <w:rPr>
+          <w:rtl/>
+        </w:rPr>
+        <w:t>רלציוני</w:t>
+      </w:r>
+      <w:proofErr w:type="spellEnd"/>
+      <w:r>
+        <w:rPr>
+          <w:rtl/>
+        </w:rPr>
+        <w:t xml:space="preserve"> בטבל</w:t>
       </w:r>
       <w:r>
         <w:rPr>
@@ -200,8 +235,16 @@
         <w:rPr>
           <w:rtl/>
         </w:rPr>
-        <w:t xml:space="preserve"> מראש), וב</w:t>
-      </w:r>
+        <w:t xml:space="preserve"> מראש), </w:t>
+      </w:r>
+      <w:proofErr w:type="spellStart"/>
+      <w:r>
+        <w:rPr>
+          <w:rtl/>
+        </w:rPr>
+        <w:t>וב</w:t>
+      </w:r>
+      <w:proofErr w:type="spellEnd"/>
       <w:r>
         <w:t>NOSQL</w:t>
       </w:r>
@@ -246,6 +289,7 @@
         </w:rPr>
         <w:t xml:space="preserve">, </w:t>
       </w:r>
+      <w:proofErr w:type="spellStart"/>
       <w:r>
         <w:rPr>
           <w:color w:val="273239"/>
@@ -254,6 +298,7 @@
         </w:rPr>
         <w:t>וכו</w:t>
       </w:r>
+      <w:proofErr w:type="spellEnd"/>
       <w:r>
         <w:rPr>
           <w:color w:val="273239"/>
@@ -325,14 +370,44 @@
         </w:rPr>
         <w:t xml:space="preserve">נעדיף להשתמש ב </w:t>
       </w:r>
+      <w:proofErr w:type="spellStart"/>
       <w:r>
         <w:t>mongoDB</w:t>
       </w:r>
-      <w:r>
-        <w:rPr>
-          <w:rtl/>
-        </w:rPr>
-        <w:t xml:space="preserve"> כאשר למידע שאחנו שומרים אין סכמה מוגדרת מראש, וכאשר לא נרצה לשמור מידע רלציוני, בניגוד ל </w:t>
+      <w:proofErr w:type="spellEnd"/>
+      <w:r>
+        <w:rPr>
+          <w:rtl/>
+        </w:rPr>
+        <w:t xml:space="preserve"> כאשר למידע </w:t>
+      </w:r>
+      <w:proofErr w:type="spellStart"/>
+      <w:r>
+        <w:rPr>
+          <w:rtl/>
+        </w:rPr>
+        <w:t>שאחנו</w:t>
+      </w:r>
+      <w:proofErr w:type="spellEnd"/>
+      <w:r>
+        <w:rPr>
+          <w:rtl/>
+        </w:rPr>
+        <w:t xml:space="preserve"> שומרים אין סכמה מוגדרת מראש, וכאשר לא נרצה לשמור מידע </w:t>
+      </w:r>
+      <w:proofErr w:type="spellStart"/>
+      <w:r>
+        <w:rPr>
+          <w:rtl/>
+        </w:rPr>
+        <w:t>רלציוני</w:t>
+      </w:r>
+      <w:proofErr w:type="spellEnd"/>
+      <w:r>
+        <w:rPr>
+          <w:rtl/>
+        </w:rPr>
+        <w:t xml:space="preserve">, בניגוד ל </w:t>
       </w:r>
       <w:r>
         <w:t>SQL</w:t>
@@ -380,7 +455,14 @@
         <w:rPr>
           <w:rtl/>
         </w:rPr>
-        <w:t xml:space="preserve"> רלציוני</w:t>
+        <w:t xml:space="preserve"> </w:t>
+      </w:r>
+      <w:proofErr w:type="spellStart"/>
+      <w:r>
+        <w:rPr>
+          <w:rtl/>
+        </w:rPr>
+        <w:t>רלציוני</w:t>
       </w:r>
       <w:r>
         <w:rPr>
@@ -389,11 +471,26 @@
         </w:rPr>
         <w:t>ת</w:t>
       </w:r>
-      <w:r>
-        <w:rPr>
-          <w:rtl/>
-        </w:rPr>
-        <w:t xml:space="preserve"> ( טבלאות שונות מקושרות אחת לשניה בעזרת </w:t>
+      <w:proofErr w:type="spellEnd"/>
+      <w:r>
+        <w:rPr>
+          <w:rtl/>
+        </w:rPr>
+        <w:t xml:space="preserve"> ( טבלאות שונות מקושרות אחת </w:t>
+      </w:r>
+      <w:proofErr w:type="spellStart"/>
+      <w:r>
+        <w:rPr>
+          <w:rtl/>
+        </w:rPr>
+        <w:t>לשניה</w:t>
+      </w:r>
+      <w:proofErr w:type="spellEnd"/>
+      <w:r>
+        <w:rPr>
+          <w:rtl/>
+        </w:rPr>
+        <w:t xml:space="preserve"> בעזרת </w:t>
       </w:r>
       <w:r>
         <w:t>foreign keys</w:t>
@@ -651,14 +748,7 @@
           <w:rFonts w:hint="cs"/>
           <w:rtl/>
         </w:rPr>
-        <w:t xml:space="preserve"> נשמר גם שם השדה ולכן יש בזבוז של מקום אחסון</w:t>
-      </w:r>
-      <w:r>
-        <w:rPr>
-          <w:rFonts w:hint="cs"/>
-          <w:rtl/>
-        </w:rPr>
-        <w:t>.</w:t>
+        <w:t xml:space="preserve"> נשמר גם שם השדה ולכן יש בזבוז של מקום אחסון.</w:t>
       </w:r>
     </w:p>
     <w:p>
@@ -698,7 +788,55 @@
           <w:rFonts w:hint="cs"/>
           <w:rtl/>
         </w:rPr>
-        <w:t xml:space="preserve"> בניוגד לדאטאבייסים רלציונים </w:t>
+        <w:t xml:space="preserve"> </w:t>
+      </w:r>
+      <w:proofErr w:type="spellStart"/>
+      <w:r>
+        <w:rPr>
+          <w:rFonts w:hint="cs"/>
+          <w:rtl/>
+        </w:rPr>
+        <w:t>בניוגד</w:t>
+      </w:r>
+      <w:proofErr w:type="spellEnd"/>
+      <w:r>
+        <w:rPr>
+          <w:rFonts w:hint="cs"/>
+          <w:rtl/>
+        </w:rPr>
+        <w:t xml:space="preserve"> </w:t>
+      </w:r>
+      <w:proofErr w:type="spellStart"/>
+      <w:r>
+        <w:rPr>
+          <w:rFonts w:hint="cs"/>
+          <w:rtl/>
+        </w:rPr>
+        <w:t>לדאטאבייסים</w:t>
+      </w:r>
+      <w:proofErr w:type="spellEnd"/>
+      <w:r>
+        <w:rPr>
+          <w:rFonts w:hint="cs"/>
+          <w:rtl/>
+        </w:rPr>
+        <w:t xml:space="preserve"> </w:t>
+      </w:r>
+      <w:proofErr w:type="spellStart"/>
+      <w:r>
+        <w:rPr>
+          <w:rFonts w:hint="cs"/>
+          <w:rtl/>
+        </w:rPr>
+        <w:t>רלציונים</w:t>
+      </w:r>
+      <w:proofErr w:type="spellEnd"/>
+      <w:r>
+        <w:rPr>
+          <w:rFonts w:hint="cs"/>
+          <w:rtl/>
+        </w:rPr>
+        <w:t xml:space="preserve"> </w:t>
       </w:r>
       <w:r>
         <w:rPr>
@@ -720,15 +858,7 @@
           <w:rtl/>
           <w:lang w:val="en-US"/>
         </w:rPr>
-        <w:t xml:space="preserve">-ים </w:t>
-      </w:r>
-      <w:r>
-        <w:rPr>
-          <w:rFonts w:hint="cs"/>
-          <w:rtl/>
-          <w:lang w:val="en-US"/>
-        </w:rPr>
-        <w:t xml:space="preserve">בין </w:t>
+        <w:t xml:space="preserve">-ים בין </w:t>
       </w:r>
       <w:r>
         <w:t>Document</w:t>
@@ -752,7 +882,6 @@
         <w:bidi/>
         <w:ind w:left="720"/>
         <w:rPr>
-          <w:rFonts w:hint="cs"/>
           <w:rtl/>
           <w:lang w:val="en-US"/>
         </w:rPr>
@@ -767,9 +896,11 @@
       <w:r>
         <w:t xml:space="preserve"> </w:t>
       </w:r>
+      <w:proofErr w:type="spellStart"/>
       <w:r>
         <w:t>Documen</w:t>
       </w:r>
+      <w:proofErr w:type="spellEnd"/>
       <w:r>
         <w:rPr>
           <w:rFonts w:hint="cs"/>
@@ -845,16 +976,146 @@
         <w:rPr>
           <w:rtl/>
         </w:rPr>
-        <w:t xml:space="preserve"> - מדוע</w:t>
-      </w:r>
-    </w:p>
-    <w:p>
-      <w:pPr>
-        <w:bidi/>
-      </w:pPr>
+        <w:t xml:space="preserve"> – מדוע</w:t>
+      </w:r>
+    </w:p>
+    <w:p>
+      <w:pPr>
+        <w:bidi/>
+        <w:ind w:left="720"/>
+        <w:rPr>
+          <w:rFonts w:hint="cs"/>
+          <w:rtl/>
+          <w:lang w:val="en-US"/>
+        </w:rPr>
+      </w:pPr>
+      <w:proofErr w:type="spellStart"/>
+      <w:r>
+        <w:rPr>
+          <w:rFonts w:hint="cs"/>
+          <w:rtl/>
+          <w:lang w:val="en-US"/>
+        </w:rPr>
+        <w:t>ברדיס</w:t>
+      </w:r>
+      <w:proofErr w:type="spellEnd"/>
+      <w:r>
+        <w:rPr>
+          <w:rFonts w:hint="cs"/>
+          <w:rtl/>
+          <w:lang w:val="en-US"/>
+        </w:rPr>
+        <w:t xml:space="preserve"> המידע נשמר על זיכרו</w:t>
+      </w:r>
+      <w:r>
+        <w:rPr>
+          <w:rFonts w:hint="eastAsia"/>
+          <w:rtl/>
+          <w:lang w:val="en-US"/>
+        </w:rPr>
+        <w:t>ן</w:t>
+      </w:r>
+      <w:r>
+        <w:rPr>
+          <w:rFonts w:hint="cs"/>
+          <w:rtl/>
+          <w:lang w:val="en-US"/>
+        </w:rPr>
+        <w:t xml:space="preserve"> </w:t>
+      </w:r>
+      <w:r>
+        <w:rPr>
+          <w:lang w:val="en-US"/>
+        </w:rPr>
+        <w:t>RAM</w:t>
+      </w:r>
+      <w:r>
+        <w:rPr>
+          <w:rFonts w:hint="cs"/>
+          <w:rtl/>
+          <w:lang w:val="en-US"/>
+        </w:rPr>
+        <w:t xml:space="preserve"> אשר מהיר בהרבה מדיסק אחסון רגיל. בנוסף, </w:t>
+      </w:r>
+      <w:proofErr w:type="spellStart"/>
+      <w:r>
+        <w:rPr>
+          <w:rFonts w:hint="cs"/>
+          <w:rtl/>
+          <w:lang w:val="en-US"/>
+        </w:rPr>
+        <w:t>רדיס</w:t>
+      </w:r>
+      <w:proofErr w:type="spellEnd"/>
+      <w:r>
+        <w:rPr>
+          <w:rFonts w:hint="cs"/>
+          <w:rtl/>
+          <w:lang w:val="en-US"/>
+        </w:rPr>
+        <w:t xml:space="preserve"> פועל על </w:t>
+      </w:r>
+      <w:r>
+        <w:rPr>
+          <w:lang w:val="en-US"/>
+        </w:rPr>
+        <w:t>thread</w:t>
+      </w:r>
+      <w:r>
+        <w:rPr>
+          <w:rFonts w:hint="cs"/>
+          <w:rtl/>
+          <w:lang w:val="en-US"/>
+        </w:rPr>
+        <w:t xml:space="preserve"> אחד ו </w:t>
+      </w:r>
+      <w:r>
+        <w:rPr>
+          <w:lang w:val="en-US"/>
+        </w:rPr>
+        <w:t>event loop</w:t>
+      </w:r>
+      <w:r>
+        <w:rPr>
+          <w:rFonts w:hint="cs"/>
+          <w:rtl/>
+          <w:lang w:val="en-US"/>
+        </w:rPr>
+        <w:t xml:space="preserve"> וכך נמנע מ</w:t>
+      </w:r>
+      <w:r>
+        <w:rPr>
+          <w:lang w:val="en-US"/>
+        </w:rPr>
+        <w:t>overhead</w:t>
+      </w:r>
+      <w:r>
+        <w:rPr>
+          <w:rFonts w:hint="cs"/>
+          <w:rtl/>
+          <w:lang w:val="en-US"/>
+        </w:rPr>
+        <w:t xml:space="preserve"> שנגרם מ</w:t>
+      </w:r>
+      <w:r>
+        <w:rPr>
+          <w:lang w:val="en-US"/>
+        </w:rPr>
+        <w:t>context switch</w:t>
+      </w:r>
+    </w:p>
+    <w:p>
+      <w:pPr>
+        <w:bidi/>
+        <w:rPr>
+          <w:rtl/>
+        </w:rPr>
+      </w:pPr>
+      <w:proofErr w:type="gramStart"/>
       <w:r>
         <w:t>?Redis</w:t>
       </w:r>
+      <w:proofErr w:type="gramEnd"/>
       <w:r>
         <w:rPr>
           <w:rtl/>
@@ -865,10 +1126,214 @@
     <w:p>
       <w:pPr>
         <w:bidi/>
-      </w:pPr>
+        <w:rPr>
+          <w:rtl/>
+          <w:lang w:val="en-US"/>
+        </w:rPr>
+      </w:pPr>
+      <w:r>
+        <w:rPr>
+          <w:rtl/>
+        </w:rPr>
+        <w:tab/>
+      </w:r>
+      <w:r>
+        <w:rPr>
+          <w:rFonts w:hint="cs"/>
+          <w:rtl/>
+        </w:rPr>
+        <w:t xml:space="preserve">הסיבות הנפוצות ביותר לשימוש </w:t>
+      </w:r>
+      <w:proofErr w:type="spellStart"/>
+      <w:r>
+        <w:rPr>
+          <w:rFonts w:hint="cs"/>
+          <w:rtl/>
+        </w:rPr>
+        <w:t>ברדיס</w:t>
+      </w:r>
+      <w:proofErr w:type="spellEnd"/>
+      <w:r>
+        <w:rPr>
+          <w:rFonts w:hint="cs"/>
+          <w:rtl/>
+        </w:rPr>
+        <w:t xml:space="preserve"> הן</w:t>
+      </w:r>
+      <w:r>
+        <w:rPr>
+          <w:lang w:val="en-US"/>
+        </w:rPr>
+        <w:t xml:space="preserve"> </w:t>
+      </w:r>
+      <w:r>
+        <w:rPr>
+          <w:rFonts w:hint="cs"/>
+          <w:rtl/>
+          <w:lang w:val="en-US"/>
+        </w:rPr>
+        <w:t>:</w:t>
+      </w:r>
+    </w:p>
+    <w:p>
+      <w:pPr>
+        <w:bidi/>
+        <w:ind w:left="720"/>
+        <w:rPr>
+          <w:rtl/>
+          <w:lang w:val="en-US"/>
+        </w:rPr>
+      </w:pPr>
+      <w:r>
+        <w:rPr>
+          <w:lang w:val="en-US"/>
+        </w:rPr>
+        <w:t>Caching</w:t>
+      </w:r>
+      <w:r>
+        <w:rPr>
+          <w:rFonts w:hint="cs"/>
+          <w:rtl/>
+          <w:lang w:val="en-US"/>
+        </w:rPr>
+        <w:t xml:space="preserve"> </w:t>
+      </w:r>
+      <w:r>
+        <w:rPr>
+          <w:rtl/>
+          <w:lang w:val="en-US"/>
+        </w:rPr>
+        <w:t>–</w:t>
+      </w:r>
+      <w:r>
+        <w:rPr>
+          <w:rFonts w:hint="cs"/>
+          <w:rtl/>
+          <w:lang w:val="en-US"/>
+        </w:rPr>
+        <w:t xml:space="preserve"> שמירת מידע שמשתמשים בו בתדירות גבוהה לזמן מוגבל כדי לאפשר </w:t>
+      </w:r>
+      <w:proofErr w:type="spellStart"/>
+      <w:r>
+        <w:rPr>
+          <w:rFonts w:hint="cs"/>
+          <w:rtl/>
+          <w:lang w:val="en-US"/>
+        </w:rPr>
+        <w:t>איחזור</w:t>
+      </w:r>
+      <w:proofErr w:type="spellEnd"/>
+      <w:r>
+        <w:rPr>
+          <w:rFonts w:hint="cs"/>
+          <w:rtl/>
+          <w:lang w:val="en-US"/>
+        </w:rPr>
+        <w:t xml:space="preserve"> של המידע מהר יותר</w:t>
+      </w:r>
+    </w:p>
+    <w:p>
+      <w:pPr>
+        <w:bidi/>
+        <w:ind w:left="720"/>
+        <w:rPr>
+          <w:rFonts w:hint="cs"/>
+          <w:rtl/>
+          <w:lang w:val="en-US"/>
+        </w:rPr>
+      </w:pPr>
+      <w:r>
+        <w:rPr>
+          <w:lang w:val="en-US"/>
+        </w:rPr>
+        <w:t>Message broker</w:t>
+      </w:r>
+      <w:r>
+        <w:rPr>
+          <w:rFonts w:hint="cs"/>
+          <w:rtl/>
+          <w:lang w:val="en-US"/>
+        </w:rPr>
+        <w:t xml:space="preserve"> </w:t>
+      </w:r>
+      <w:r>
+        <w:rPr>
+          <w:rtl/>
+          <w:lang w:val="en-US"/>
+        </w:rPr>
+        <w:t>–</w:t>
+      </w:r>
+      <w:r>
+        <w:rPr>
+          <w:rFonts w:hint="cs"/>
+          <w:rtl/>
+          <w:lang w:val="en-US"/>
+        </w:rPr>
+        <w:t xml:space="preserve"> מאפשר למפרסמים לפרסם הודעות לנושאים </w:t>
+      </w:r>
+      <w:proofErr w:type="spellStart"/>
+      <w:r>
+        <w:rPr>
+          <w:rFonts w:hint="cs"/>
+          <w:rtl/>
+          <w:lang w:val="en-US"/>
+        </w:rPr>
+        <w:t>מסויימים</w:t>
+      </w:r>
+      <w:proofErr w:type="spellEnd"/>
+      <w:r>
+        <w:rPr>
+          <w:rFonts w:hint="cs"/>
+          <w:rtl/>
+          <w:lang w:val="en-US"/>
+        </w:rPr>
+        <w:t xml:space="preserve"> ולרשומים להירשם לנושא </w:t>
+      </w:r>
+      <w:proofErr w:type="spellStart"/>
+      <w:r>
+        <w:rPr>
+          <w:rFonts w:hint="cs"/>
+          <w:rtl/>
+          <w:lang w:val="en-US"/>
+        </w:rPr>
+        <w:t>מסויים</w:t>
+      </w:r>
+      <w:proofErr w:type="spellEnd"/>
+      <w:r>
+        <w:rPr>
+          <w:rFonts w:hint="cs"/>
+          <w:rtl/>
+          <w:lang w:val="en-US"/>
+        </w:rPr>
+        <w:t xml:space="preserve"> ולקבל כל הודעה בנושא הזה מבלי שהרשום והמפרסם יכירו אחד את השני (</w:t>
+      </w:r>
+      <w:r>
+        <w:rPr>
+          <w:lang w:val="en-US"/>
+        </w:rPr>
+        <w:t>decoupling</w:t>
+      </w:r>
+      <w:r>
+        <w:rPr>
+          <w:rFonts w:hint="cs"/>
+          <w:rtl/>
+          <w:lang w:val="en-US"/>
+        </w:rPr>
+        <w:t xml:space="preserve"> בין שירותים שמתקשרים)</w:t>
+      </w:r>
+    </w:p>
+    <w:p>
+      <w:pPr>
+        <w:bidi/>
+        <w:rPr>
+          <w:lang w:val="en-US"/>
+        </w:rPr>
+      </w:pPr>
+      <w:proofErr w:type="gramStart"/>
       <w:r>
         <w:t>?Redis</w:t>
       </w:r>
+      <w:proofErr w:type="gramEnd"/>
       <w:r>
         <w:rPr>
           <w:rtl/>
@@ -879,6 +1344,392 @@
     <w:p>
       <w:pPr>
         <w:bidi/>
+        <w:rPr>
+          <w:rtl/>
+          <w:lang w:val="en-US"/>
+        </w:rPr>
+      </w:pPr>
+      <w:r>
+        <w:rPr>
+          <w:rtl/>
+          <w:lang w:val="en-US"/>
+        </w:rPr>
+        <w:tab/>
+      </w:r>
+      <w:r>
+        <w:rPr>
+          <w:lang w:val="en-US"/>
+        </w:rPr>
+        <w:t>Strings</w:t>
+      </w:r>
+      <w:r>
+        <w:rPr>
+          <w:rFonts w:hint="cs"/>
+          <w:rtl/>
+          <w:lang w:val="en-US"/>
+        </w:rPr>
+        <w:t xml:space="preserve"> </w:t>
+      </w:r>
+      <w:r>
+        <w:rPr>
+          <w:rtl/>
+          <w:lang w:val="en-US"/>
+        </w:rPr>
+        <w:t>–</w:t>
+      </w:r>
+      <w:r>
+        <w:rPr>
+          <w:rFonts w:hint="cs"/>
+          <w:rtl/>
+          <w:lang w:val="en-US"/>
+        </w:rPr>
+        <w:t xml:space="preserve"> מערך של </w:t>
+      </w:r>
+      <w:proofErr w:type="spellStart"/>
+      <w:r>
+        <w:rPr>
+          <w:rFonts w:hint="cs"/>
+          <w:rtl/>
+          <w:lang w:val="en-US"/>
+        </w:rPr>
+        <w:t>ביתים</w:t>
+      </w:r>
+      <w:proofErr w:type="spellEnd"/>
+      <w:r>
+        <w:rPr>
+          <w:rFonts w:hint="cs"/>
+          <w:rtl/>
+          <w:lang w:val="en-US"/>
+        </w:rPr>
+        <w:t xml:space="preserve"> או מילים ששומר </w:t>
+      </w:r>
+      <w:proofErr w:type="gramStart"/>
+      <w:r>
+        <w:rPr>
+          <w:rFonts w:hint="cs"/>
+          <w:rtl/>
+          <w:lang w:val="en-US"/>
+        </w:rPr>
+        <w:t>אלמנטים(</w:t>
+      </w:r>
+      <w:proofErr w:type="gramEnd"/>
+      <w:r>
+        <w:rPr>
+          <w:rFonts w:hint="cs"/>
+          <w:rtl/>
+          <w:lang w:val="en-US"/>
+        </w:rPr>
+        <w:t>בדרך כלל אותיות) בעזרת קידוד</w:t>
+      </w:r>
+    </w:p>
+    <w:p>
+      <w:pPr>
+        <w:bidi/>
+        <w:rPr>
+          <w:rtl/>
+          <w:lang w:val="en-US"/>
+        </w:rPr>
+      </w:pPr>
+      <w:r>
+        <w:rPr>
+          <w:rtl/>
+          <w:lang w:val="en-US"/>
+        </w:rPr>
+        <w:lastRenderedPageBreak/>
+        <w:tab/>
+      </w:r>
+      <w:proofErr w:type="gramStart"/>
+      <w:r>
+        <w:rPr>
+          <w:lang w:val="en-US"/>
+        </w:rPr>
+        <w:t xml:space="preserve">Sets </w:t>
+      </w:r>
+      <w:r>
+        <w:rPr>
+          <w:rFonts w:hint="cs"/>
+          <w:rtl/>
+          <w:lang w:val="en-US"/>
+        </w:rPr>
+        <w:t xml:space="preserve"> -</w:t>
+      </w:r>
+      <w:proofErr w:type="gramEnd"/>
+      <w:r>
+        <w:rPr>
+          <w:rFonts w:hint="cs"/>
+          <w:rtl/>
+          <w:lang w:val="en-US"/>
+        </w:rPr>
+        <w:t xml:space="preserve"> מבנה נתונים ששומר סט של אלמנטים ייחודיים</w:t>
+      </w:r>
+    </w:p>
+    <w:p>
+      <w:pPr>
+        <w:bidi/>
+        <w:rPr>
+          <w:rtl/>
+          <w:lang w:val="en-US"/>
+        </w:rPr>
+      </w:pPr>
+      <w:r>
+        <w:rPr>
+          <w:rtl/>
+          <w:lang w:val="en-US"/>
+        </w:rPr>
+        <w:tab/>
+      </w:r>
+      <w:r>
+        <w:rPr>
+          <w:lang w:val="en-US"/>
+        </w:rPr>
+        <w:t>Sorted Sets</w:t>
+      </w:r>
+      <w:r>
+        <w:rPr>
+          <w:rFonts w:hint="cs"/>
+          <w:rtl/>
+          <w:lang w:val="en-US"/>
+        </w:rPr>
+        <w:t xml:space="preserve"> </w:t>
+      </w:r>
+      <w:r>
+        <w:rPr>
+          <w:rtl/>
+          <w:lang w:val="en-US"/>
+        </w:rPr>
+        <w:t>–</w:t>
+      </w:r>
+      <w:r>
+        <w:rPr>
+          <w:rFonts w:hint="cs"/>
+          <w:rtl/>
+          <w:lang w:val="en-US"/>
+        </w:rPr>
+        <w:t xml:space="preserve"> מבנה נתונים ששומר סט של אלמנטים ייחודיי</w:t>
+      </w:r>
+      <w:r>
+        <w:rPr>
+          <w:rFonts w:hint="eastAsia"/>
+          <w:rtl/>
+          <w:lang w:val="en-US"/>
+        </w:rPr>
+        <w:t>ם</w:t>
+      </w:r>
+      <w:r>
+        <w:rPr>
+          <w:rFonts w:hint="cs"/>
+          <w:rtl/>
+          <w:lang w:val="en-US"/>
+        </w:rPr>
+        <w:t xml:space="preserve"> המסודרים לפי דירוג </w:t>
+      </w:r>
+      <w:proofErr w:type="spellStart"/>
+      <w:r>
+        <w:rPr>
+          <w:rFonts w:hint="cs"/>
+          <w:rtl/>
+          <w:lang w:val="en-US"/>
+        </w:rPr>
+        <w:t>מסויים</w:t>
+      </w:r>
+      <w:proofErr w:type="spellEnd"/>
+    </w:p>
+    <w:p>
+      <w:pPr>
+        <w:bidi/>
+        <w:rPr>
+          <w:rtl/>
+          <w:lang w:val="en-US"/>
+        </w:rPr>
+      </w:pPr>
+      <w:r>
+        <w:rPr>
+          <w:rtl/>
+          <w:lang w:val="en-US"/>
+        </w:rPr>
+        <w:tab/>
+      </w:r>
+      <w:r>
+        <w:rPr>
+          <w:lang w:val="en-US"/>
+        </w:rPr>
+        <w:t>List</w:t>
+      </w:r>
+      <w:r>
+        <w:rPr>
+          <w:rFonts w:hint="cs"/>
+          <w:rtl/>
+          <w:lang w:val="en-US"/>
+        </w:rPr>
+        <w:t xml:space="preserve"> </w:t>
+      </w:r>
+      <w:r>
+        <w:rPr>
+          <w:rtl/>
+          <w:lang w:val="en-US"/>
+        </w:rPr>
+        <w:t>–</w:t>
+      </w:r>
+      <w:r>
+        <w:rPr>
+          <w:rFonts w:hint="cs"/>
+          <w:rtl/>
+          <w:lang w:val="en-US"/>
+        </w:rPr>
+        <w:t xml:space="preserve"> אוסף של </w:t>
+      </w:r>
+      <w:r>
+        <w:rPr>
+          <w:lang w:val="en-US"/>
+        </w:rPr>
+        <w:t>string</w:t>
+      </w:r>
+      <w:r>
+        <w:rPr>
+          <w:rFonts w:hint="cs"/>
+          <w:rtl/>
+          <w:lang w:val="en-US"/>
+        </w:rPr>
+        <w:t>-ים המסודרים לפי סדר ההכנסה לרשימה</w:t>
+      </w:r>
+    </w:p>
+    <w:p>
+      <w:pPr>
+        <w:bidi/>
+        <w:rPr>
+          <w:lang w:val="en-US"/>
+        </w:rPr>
+      </w:pPr>
+      <w:r>
+        <w:rPr>
+          <w:rtl/>
+          <w:lang w:val="en-US"/>
+        </w:rPr>
+        <w:tab/>
+      </w:r>
+      <w:r>
+        <w:rPr>
+          <w:lang w:val="en-US"/>
+        </w:rPr>
+        <w:t>Hash</w:t>
+      </w:r>
+      <w:r>
+        <w:rPr>
+          <w:rFonts w:hint="cs"/>
+          <w:rtl/>
+          <w:lang w:val="en-US"/>
+        </w:rPr>
+        <w:t xml:space="preserve"> </w:t>
+      </w:r>
+      <w:r>
+        <w:rPr>
+          <w:rtl/>
+          <w:lang w:val="en-US"/>
+        </w:rPr>
+        <w:t>–</w:t>
+      </w:r>
+      <w:r>
+        <w:rPr>
+          <w:rFonts w:hint="cs"/>
+          <w:rtl/>
+          <w:lang w:val="en-US"/>
+        </w:rPr>
+        <w:t xml:space="preserve"> מיפוי בין שדה וערך</w:t>
+      </w:r>
+    </w:p>
+    <w:p>
+      <w:pPr>
+        <w:bidi/>
+        <w:rPr>
+          <w:rFonts w:hint="cs"/>
+          <w:lang w:val="en-US"/>
+        </w:rPr>
+      </w:pPr>
+      <w:r>
+        <w:rPr>
+          <w:lang w:val="en-US"/>
+        </w:rPr>
+        <w:tab/>
+        <w:t>Bitmaps</w:t>
+      </w:r>
+      <w:r>
+        <w:rPr>
+          <w:rFonts w:hint="cs"/>
+          <w:rtl/>
+          <w:lang w:val="en-US"/>
+        </w:rPr>
+        <w:t xml:space="preserve"> </w:t>
+      </w:r>
+      <w:r>
+        <w:rPr>
+          <w:rtl/>
+          <w:lang w:val="en-US"/>
+        </w:rPr>
+        <w:t>–</w:t>
+      </w:r>
+      <w:r>
+        <w:rPr>
+          <w:rFonts w:hint="cs"/>
+          <w:rtl/>
+          <w:lang w:val="en-US"/>
+        </w:rPr>
+        <w:t xml:space="preserve"> אוסף של מידע בינארי</w:t>
+      </w:r>
+    </w:p>
+    <w:p>
+      <w:pPr>
+        <w:bidi/>
+        <w:rPr>
+          <w:rtl/>
+          <w:lang w:val="en-US"/>
+        </w:rPr>
+      </w:pPr>
+      <w:r>
+        <w:rPr>
+          <w:rtl/>
+          <w:lang w:val="en-US"/>
+        </w:rPr>
+        <w:tab/>
+      </w:r>
+      <w:r>
+        <w:rPr>
+          <w:lang w:val="en-US"/>
+        </w:rPr>
+        <w:t>Streams</w:t>
+      </w:r>
+      <w:r>
+        <w:rPr>
+          <w:rFonts w:hint="cs"/>
+          <w:rtl/>
+          <w:lang w:val="en-US"/>
+        </w:rPr>
+        <w:t xml:space="preserve"> - רשימה שאפשר רק להוסיף לה </w:t>
+      </w:r>
+    </w:p>
+    <w:p>
+      <w:pPr>
+        <w:bidi/>
+        <w:rPr>
+          <w:rFonts w:hint="cs"/>
+          <w:rtl/>
+          <w:lang w:val="en-US"/>
+        </w:rPr>
+      </w:pPr>
+      <w:r>
+        <w:rPr>
+          <w:rFonts w:hint="cs"/>
+          <w:rtl/>
+          <w:lang w:val="en-US"/>
+        </w:rPr>
+        <w:t xml:space="preserve"> </w:t>
+      </w:r>
+    </w:p>
+    <w:p>
+      <w:pPr>
+        <w:bidi/>
+        <w:rPr>
+          <w:rtl/>
+        </w:rPr>
       </w:pPr>
       <w:r>
         <w:rPr>
@@ -902,7 +1753,82 @@
         <w:rPr>
           <w:rtl/>
         </w:rPr>
-        <w:t xml:space="preserve"> - אם</w:t>
+        <w:t xml:space="preserve"> – אם</w:t>
+      </w:r>
+    </w:p>
+    <w:p>
+      <w:pPr>
+        <w:bidi/>
+        <w:ind w:left="720"/>
+        <w:rPr>
+          <w:rFonts w:hint="cs"/>
+          <w:rtl/>
+          <w:lang w:val="en-US"/>
+        </w:rPr>
+      </w:pPr>
+      <w:r>
+        <w:rPr>
+          <w:rFonts w:hint="cs"/>
+          <w:rtl/>
+          <w:lang w:val="en-US"/>
+        </w:rPr>
+        <w:t>במידה ושמרנו את המידע רק על ה</w:t>
+      </w:r>
+      <w:r>
+        <w:rPr>
+          <w:lang w:val="en-US"/>
+        </w:rPr>
+        <w:t>RAM</w:t>
+      </w:r>
+      <w:r>
+        <w:rPr>
+          <w:rFonts w:hint="cs"/>
+          <w:rtl/>
+          <w:lang w:val="en-US"/>
+        </w:rPr>
+        <w:t xml:space="preserve"> רז במידה והשרת נופל כל המידע יימחק. יש מנגנונים שנודעו לשמור את המידע גם אם השרת נופל כמו </w:t>
+      </w:r>
+      <w:r>
+        <w:rPr>
+          <w:lang w:val="en-US"/>
+        </w:rPr>
+        <w:t>RDB snapshotting</w:t>
+      </w:r>
+      <w:r>
+        <w:rPr>
+          <w:rFonts w:hint="cs"/>
+          <w:rtl/>
+          <w:lang w:val="en-US"/>
+        </w:rPr>
+        <w:t xml:space="preserve"> (בשיטה זו שומרים עותק של מצב השרת כל תקופת זמן מוגדרת וכך אפשר לשחזר את השרת במידה והוא נופל) או </w:t>
+      </w:r>
+      <w:r>
+        <w:rPr>
+          <w:lang w:val="en-US"/>
+        </w:rPr>
+        <w:t>append only file</w:t>
+      </w:r>
+      <w:r>
+        <w:rPr>
+          <w:rFonts w:hint="cs"/>
+          <w:rtl/>
+          <w:lang w:val="en-US"/>
+        </w:rPr>
+        <w:t xml:space="preserve"> (בשיטה זו שומרים </w:t>
+      </w:r>
+      <w:r>
+        <w:rPr>
+          <w:lang w:val="en-US"/>
+        </w:rPr>
+        <w:t>log</w:t>
+      </w:r>
+      <w:r>
+        <w:rPr>
+          <w:rFonts w:hint="cs"/>
+          <w:rtl/>
+          <w:lang w:val="en-US"/>
+        </w:rPr>
+        <w:t xml:space="preserve"> של כל פעולת כתיבה לשרת ובמידה והשרת קורס ניתן להריץ את כל הפעולות מחדש)</w:t>
       </w:r>
     </w:p>
     <w:p>
@@ -914,6 +1840,90 @@
           <w:rtl/>
         </w:rPr>
         <w:t>- מהי חשיבות מנגנון פינוי הזיכרון ולמה היא חשובה?</w:t>
+      </w:r>
+    </w:p>
+    <w:p>
+      <w:pPr>
+        <w:bidi/>
+        <w:ind w:left="720"/>
+        <w:rPr>
+          <w:rFonts w:hint="cs"/>
+          <w:lang w:val="en-US"/>
+        </w:rPr>
+      </w:pPr>
+      <w:proofErr w:type="spellStart"/>
+      <w:r>
+        <w:rPr>
+          <w:rFonts w:hint="cs"/>
+          <w:rtl/>
+        </w:rPr>
+        <w:t>מנגון</w:t>
+      </w:r>
+      <w:proofErr w:type="spellEnd"/>
+      <w:r>
+        <w:rPr>
+          <w:rFonts w:hint="cs"/>
+          <w:rtl/>
+        </w:rPr>
+        <w:t xml:space="preserve"> פינוי הזיכרון </w:t>
+      </w:r>
+      <w:r>
+        <w:rPr>
+          <w:rFonts w:hint="cs"/>
+          <w:rtl/>
+          <w:lang w:val="en-US"/>
+        </w:rPr>
+        <w:t xml:space="preserve">מונע מהשרת לקרוס עקב עומס בזיכרון, שומר על ביצועיים </w:t>
+      </w:r>
+      <w:proofErr w:type="spellStart"/>
+      <w:r>
+        <w:rPr>
+          <w:rFonts w:hint="cs"/>
+          <w:rtl/>
+          <w:lang w:val="en-US"/>
+        </w:rPr>
+        <w:t>אפטימלים</w:t>
+      </w:r>
+      <w:proofErr w:type="spellEnd"/>
+      <w:r>
+        <w:rPr>
+          <w:rFonts w:hint="cs"/>
+          <w:rtl/>
+          <w:lang w:val="en-US"/>
+        </w:rPr>
+        <w:t xml:space="preserve">, ומונע ממידע לא מעודכן להישאר בשרת. למנגנון יש חשיבות רבה ובלעדיו השרת עלול לקרוס או </w:t>
+      </w:r>
+      <w:proofErr w:type="spellStart"/>
+      <w:r>
+        <w:rPr>
+          <w:rFonts w:hint="cs"/>
+          <w:rtl/>
+          <w:lang w:val="en-US"/>
+        </w:rPr>
+        <w:t>שביצוכעיו</w:t>
+      </w:r>
+      <w:proofErr w:type="spellEnd"/>
+      <w:r>
+        <w:rPr>
+          <w:rFonts w:hint="cs"/>
+          <w:rtl/>
+          <w:lang w:val="en-US"/>
+        </w:rPr>
+        <w:t xml:space="preserve"> יהיו איטיים.</w:t>
+      </w:r>
+    </w:p>
+    <w:p>
+      <w:pPr>
+        <w:bidi/>
+        <w:rPr>
+          <w:lang w:val="en-US"/>
+        </w:rPr>
+      </w:pPr>
+      <w:r>
+        <w:rPr>
+          <w:lang w:val="en-US"/>
+        </w:rPr>
+        <w:tab/>
       </w:r>
     </w:p>
     <w:p>
@@ -937,22 +1947,43 @@
         <w:bidi/>
       </w:pPr>
       <w:r>
-        <w:t>’topics, partitions, producers, consumers</w:t>
-      </w:r>
-      <w:r>
-        <w:rPr>
-          <w:rtl/>
-        </w:rPr>
-        <w:t xml:space="preserve"> : - הסבר את המושגים הבאים</w:t>
-      </w:r>
-    </w:p>
-    <w:p>
-      <w:pPr>
-        <w:bidi/>
-      </w:pPr>
+        <w:t>’</w:t>
+      </w:r>
+      <w:proofErr w:type="gramStart"/>
+      <w:r>
+        <w:t>topics</w:t>
+      </w:r>
+      <w:proofErr w:type="gramEnd"/>
+      <w:r>
+        <w:t xml:space="preserve">, partitions, producers, </w:t>
+      </w:r>
+      <w:proofErr w:type="gramStart"/>
+      <w:r>
+        <w:t>consumers</w:t>
+      </w:r>
+      <w:r>
+        <w:rPr>
+          <w:rtl/>
+        </w:rPr>
+        <w:t xml:space="preserve"> :</w:t>
+      </w:r>
+      <w:proofErr w:type="gramEnd"/>
+      <w:r>
+        <w:rPr>
+          <w:rtl/>
+        </w:rPr>
+        <w:t xml:space="preserve"> - הסבר את המושגים הבאים</w:t>
+      </w:r>
+    </w:p>
+    <w:p>
+      <w:pPr>
+        <w:bidi/>
+      </w:pPr>
+      <w:proofErr w:type="gramStart"/>
       <w:r>
         <w:t>?RabbitMQ</w:t>
       </w:r>
+      <w:proofErr w:type="gramEnd"/>
       <w:r>
         <w:rPr>
           <w:rtl/>
@@ -1041,9 +2072,13 @@
         <w:bidi/>
       </w:pPr>
       <w:r>
-        <w:lastRenderedPageBreak/>
-        <w:t>connections, processors, FlowFiles</w:t>
-      </w:r>
+        <w:t xml:space="preserve">connections, processors, </w:t>
+      </w:r>
+      <w:proofErr w:type="spellStart"/>
+      <w:r>
+        <w:t>FlowFiles</w:t>
+      </w:r>
+      <w:proofErr w:type="spellEnd"/>
       <w:r>
         <w:rPr>
           <w:rtl/>
@@ -1422,6 +2457,7 @@
         <w:rPr>
           <w:rtl/>
         </w:rPr>
+        <w:lastRenderedPageBreak/>
         <w:t xml:space="preserve">ואיזו בעיה הוא בא לפתור? </w:t>
       </w:r>
       <w:r>
@@ -1487,9 +2523,11 @@
       <w:pPr>
         <w:bidi/>
       </w:pPr>
+      <w:proofErr w:type="gramStart"/>
       <w:r>
         <w:t>?BE</w:t>
       </w:r>
+      <w:proofErr w:type="gramEnd"/>
       <w:r>
         <w:rPr>
           <w:rtl/>
@@ -1539,9 +2577,11 @@
       <w:pPr>
         <w:bidi/>
       </w:pPr>
+      <w:proofErr w:type="gramStart"/>
       <w:r>
         <w:t>?API</w:t>
       </w:r>
+      <w:proofErr w:type="gramEnd"/>
       <w:r>
         <w:rPr>
           <w:rtl/>
@@ -1565,6 +2605,7 @@
         <w:bidi/>
       </w:pPr>
     </w:p>
+    <w:p/>
     <w:sectPr>
       <w:pgSz w:w="11909" w:h="16834"/>
       <w:pgMar w:top="1440" w:right="1440" w:bottom="1440" w:left="1440" w:header="720" w:footer="720" w:gutter="0"/>
@@ -2091,6 +3132,7 @@
   <w:style w:type="character" w:default="1" w:styleId="a0">
     <w:name w:val="Default Paragraph Font"/>
     <w:uiPriority w:val="1"/>
+    <w:semiHidden/>
     <w:unhideWhenUsed/>
   </w:style>
   <w:style w:type="table" w:default="1" w:styleId="a1">

</xml_diff>

<commit_message>
finished the kafka questions
</commit_message>
<xml_diff>
--- a/hfifa_questions_1.docx
+++ b/hfifa_questions_1.docx
@@ -1978,9 +1978,334 @@
     <w:p>
       <w:pPr>
         <w:bidi/>
-      </w:pPr>
+        <w:ind w:left="720"/>
+        <w:rPr>
+          <w:rFonts w:hint="cs"/>
+          <w:rtl/>
+          <w:lang w:val="en-US"/>
+        </w:rPr>
+      </w:pPr>
+      <w:r>
+        <w:t>Topic</w:t>
+      </w:r>
+      <w:r>
+        <w:rPr>
+          <w:rFonts w:hint="cs"/>
+          <w:rtl/>
+        </w:rPr>
+        <w:t xml:space="preserve"> </w:t>
+      </w:r>
+      <w:r>
+        <w:rPr>
+          <w:rtl/>
+        </w:rPr>
+        <w:t>–</w:t>
+      </w:r>
+      <w:r>
+        <w:rPr>
+          <w:rFonts w:hint="cs"/>
+          <w:rtl/>
+        </w:rPr>
+        <w:t xml:space="preserve"> נושא </w:t>
+      </w:r>
+      <w:proofErr w:type="spellStart"/>
+      <w:r>
+        <w:rPr>
+          <w:rFonts w:hint="cs"/>
+          <w:rtl/>
+        </w:rPr>
+        <w:t>מסויים</w:t>
+      </w:r>
+      <w:proofErr w:type="spellEnd"/>
+      <w:r>
+        <w:rPr>
+          <w:rFonts w:hint="cs"/>
+          <w:rtl/>
+        </w:rPr>
+        <w:t xml:space="preserve"> שאליו </w:t>
+      </w:r>
+      <w:r>
+        <w:rPr>
+          <w:lang w:val="en-US"/>
+        </w:rPr>
+        <w:t>consumers</w:t>
+      </w:r>
+      <w:r>
+        <w:rPr>
+          <w:rFonts w:hint="cs"/>
+          <w:rtl/>
+          <w:lang w:val="en-US"/>
+        </w:rPr>
+        <w:t xml:space="preserve"> נרשמים וממנו הם קוראים הודעות ואליו </w:t>
+      </w:r>
+      <w:r>
+        <w:rPr>
+          <w:lang w:val="en-US"/>
+        </w:rPr>
+        <w:t>producers</w:t>
+      </w:r>
+      <w:r>
+        <w:rPr>
+          <w:rFonts w:hint="cs"/>
+          <w:rtl/>
+          <w:lang w:val="en-US"/>
+        </w:rPr>
+        <w:t xml:space="preserve"> מפרסמים הודעות</w:t>
+      </w:r>
+    </w:p>
+    <w:p>
+      <w:pPr>
+        <w:bidi/>
+        <w:rPr>
+          <w:rtl/>
+          <w:lang w:val="en-US"/>
+        </w:rPr>
+      </w:pPr>
+      <w:r>
+        <w:rPr>
+          <w:rtl/>
+        </w:rPr>
+        <w:tab/>
+      </w:r>
       <w:proofErr w:type="gramStart"/>
       <w:r>
+        <w:rPr>
+          <w:lang w:val="en-US"/>
+        </w:rPr>
+        <w:t xml:space="preserve">Producer </w:t>
+      </w:r>
+      <w:r>
+        <w:rPr>
+          <w:rFonts w:hint="cs"/>
+          <w:rtl/>
+          <w:lang w:val="en-US"/>
+        </w:rPr>
+        <w:t xml:space="preserve"> -</w:t>
+      </w:r>
+      <w:proofErr w:type="gramEnd"/>
+      <w:r>
+        <w:rPr>
+          <w:rFonts w:hint="cs"/>
+          <w:rtl/>
+          <w:lang w:val="en-US"/>
+        </w:rPr>
+        <w:t xml:space="preserve"> תוכנה או שירות אשר מפרסמים הודעות אל </w:t>
+      </w:r>
+      <w:r>
+        <w:rPr>
+          <w:lang w:val="en-US"/>
+        </w:rPr>
+        <w:t>topic</w:t>
+      </w:r>
+      <w:r>
+        <w:rPr>
+          <w:rFonts w:hint="cs"/>
+          <w:rtl/>
+          <w:lang w:val="en-US"/>
+        </w:rPr>
+        <w:t xml:space="preserve"> </w:t>
+      </w:r>
+      <w:proofErr w:type="spellStart"/>
+      <w:r>
+        <w:rPr>
+          <w:rFonts w:hint="cs"/>
+          <w:rtl/>
+          <w:lang w:val="en-US"/>
+        </w:rPr>
+        <w:t>מסויים</w:t>
+      </w:r>
+      <w:proofErr w:type="spellEnd"/>
+    </w:p>
+    <w:p>
+      <w:pPr>
+        <w:bidi/>
+        <w:rPr>
+          <w:rtl/>
+          <w:lang w:val="en-US"/>
+        </w:rPr>
+      </w:pPr>
+      <w:r>
+        <w:rPr>
+          <w:rtl/>
+          <w:lang w:val="en-US"/>
+        </w:rPr>
+        <w:tab/>
+      </w:r>
+      <w:r>
+        <w:rPr>
+          <w:lang w:val="en-US"/>
+        </w:rPr>
+        <w:t>Consu</w:t>
+      </w:r>
+      <w:r>
+        <w:rPr>
+          <w:lang w:val="en-US"/>
+        </w:rPr>
+        <w:t>mer</w:t>
+      </w:r>
+      <w:r>
+        <w:rPr>
+          <w:rFonts w:hint="cs"/>
+          <w:rtl/>
+          <w:lang w:val="en-US"/>
+        </w:rPr>
+        <w:t xml:space="preserve"> </w:t>
+      </w:r>
+      <w:r>
+        <w:rPr>
+          <w:rtl/>
+          <w:lang w:val="en-US"/>
+        </w:rPr>
+        <w:t>–</w:t>
+      </w:r>
+      <w:r>
+        <w:rPr>
+          <w:rFonts w:hint="cs"/>
+          <w:rtl/>
+          <w:lang w:val="en-US"/>
+        </w:rPr>
+        <w:t xml:space="preserve"> תוכנה או שירות אשר קורא הודעות מ</w:t>
+      </w:r>
+      <w:proofErr w:type="gramStart"/>
+      <w:r>
+        <w:rPr>
+          <w:lang w:val="en-US"/>
+        </w:rPr>
+        <w:t xml:space="preserve">topic </w:t>
+      </w:r>
+      <w:r>
+        <w:rPr>
+          <w:rFonts w:hint="cs"/>
+          <w:rtl/>
+          <w:lang w:val="en-US"/>
+        </w:rPr>
+        <w:t xml:space="preserve"> אחד</w:t>
+      </w:r>
+      <w:proofErr w:type="gramEnd"/>
+      <w:r>
+        <w:rPr>
+          <w:rFonts w:hint="cs"/>
+          <w:rtl/>
+          <w:lang w:val="en-US"/>
+        </w:rPr>
+        <w:t xml:space="preserve"> או יותר</w:t>
+      </w:r>
+    </w:p>
+    <w:p>
+      <w:pPr>
+        <w:bidi/>
+        <w:ind w:left="720"/>
+        <w:rPr>
+          <w:rFonts w:hint="cs"/>
+          <w:rtl/>
+          <w:lang w:val="en-US"/>
+        </w:rPr>
+      </w:pPr>
+      <w:r>
+        <w:rPr>
+          <w:lang w:val="en-US"/>
+        </w:rPr>
+        <w:t>Partitions</w:t>
+      </w:r>
+      <w:r>
+        <w:rPr>
+          <w:rFonts w:hint="cs"/>
+          <w:rtl/>
+          <w:lang w:val="en-US"/>
+        </w:rPr>
+        <w:t xml:space="preserve"> </w:t>
+      </w:r>
+      <w:r>
+        <w:rPr>
+          <w:rtl/>
+          <w:lang w:val="en-US"/>
+        </w:rPr>
+        <w:t>–</w:t>
+      </w:r>
+      <w:r>
+        <w:rPr>
+          <w:rFonts w:hint="cs"/>
+          <w:rtl/>
+          <w:lang w:val="en-US"/>
+        </w:rPr>
+        <w:t xml:space="preserve"> חלוקות של </w:t>
+      </w:r>
+      <w:proofErr w:type="gramStart"/>
+      <w:r>
+        <w:rPr>
+          <w:lang w:val="en-US"/>
+        </w:rPr>
+        <w:t>topic</w:t>
+      </w:r>
+      <w:r>
+        <w:rPr>
+          <w:rFonts w:hint="cs"/>
+          <w:rtl/>
+          <w:lang w:val="en-US"/>
+        </w:rPr>
+        <w:t xml:space="preserve"> .</w:t>
+      </w:r>
+      <w:proofErr w:type="gramEnd"/>
+      <w:r>
+        <w:rPr>
+          <w:rFonts w:hint="cs"/>
+          <w:rtl/>
+          <w:lang w:val="en-US"/>
+        </w:rPr>
+        <w:t xml:space="preserve"> המידע שנמצא ב</w:t>
+      </w:r>
+      <w:r>
+        <w:rPr>
+          <w:lang w:val="en-US"/>
+        </w:rPr>
+        <w:t>topic</w:t>
+      </w:r>
+      <w:r>
+        <w:rPr>
+          <w:rFonts w:hint="cs"/>
+          <w:rtl/>
+          <w:lang w:val="en-US"/>
+        </w:rPr>
+        <w:t xml:space="preserve"> מתחלק בין ה </w:t>
+      </w:r>
+      <w:r>
+        <w:rPr>
+          <w:lang w:val="en-US"/>
+        </w:rPr>
+        <w:t>partition</w:t>
+      </w:r>
+      <w:r>
+        <w:rPr>
+          <w:rFonts w:hint="cs"/>
+          <w:rtl/>
+          <w:lang w:val="en-US"/>
+        </w:rPr>
+        <w:t>-ים וכך אפשר לקרוא את המידע מ</w:t>
+      </w:r>
+      <w:r>
+        <w:rPr>
+          <w:lang w:val="en-US"/>
+        </w:rPr>
+        <w:t>topic</w:t>
+      </w:r>
+      <w:r>
+        <w:rPr>
+          <w:rFonts w:hint="cs"/>
+          <w:rtl/>
+          <w:lang w:val="en-US"/>
+        </w:rPr>
+        <w:t xml:space="preserve"> מהר יותר</w:t>
+      </w:r>
+    </w:p>
+    <w:p>
+      <w:pPr>
+        <w:bidi/>
+        <w:rPr>
+          <w:rtl/>
+        </w:rPr>
+      </w:pPr>
+      <w:proofErr w:type="gramStart"/>
+      <w:r>
         <w:t>?RabbitMQ</w:t>
       </w:r>
       <w:proofErr w:type="gramEnd"/>
@@ -2003,6 +2328,86 @@
     <w:p>
       <w:pPr>
         <w:bidi/>
+        <w:ind w:left="720"/>
+        <w:rPr>
+          <w:rFonts w:hint="cs"/>
+          <w:rtl/>
+          <w:lang w:val="en-US"/>
+        </w:rPr>
+      </w:pPr>
+      <w:r>
+        <w:rPr>
+          <w:lang w:val="en-US"/>
+        </w:rPr>
+        <w:t>RabbitMQ</w:t>
+      </w:r>
+      <w:r>
+        <w:rPr>
+          <w:rFonts w:hint="cs"/>
+          <w:rtl/>
+          <w:lang w:val="en-US"/>
+        </w:rPr>
+        <w:t xml:space="preserve"> משמש לניתוב מורכב של הודעות </w:t>
+      </w:r>
+      <w:r>
+        <w:rPr>
+          <w:rFonts w:hint="cs"/>
+          <w:rtl/>
+          <w:lang w:val="en-US"/>
+        </w:rPr>
+        <w:t>והעברת משימות לשירותים שונים במערכת וכאשר הודעה נקראת מתור היא נמחקת מאותו התור, בעוד ש</w:t>
+      </w:r>
+      <w:r>
+        <w:rPr>
+          <w:lang w:val="en-US"/>
+        </w:rPr>
+        <w:t>Kafka</w:t>
+      </w:r>
+      <w:r>
+        <w:rPr>
+          <w:rFonts w:hint="cs"/>
+          <w:rtl/>
+          <w:lang w:val="en-US"/>
+        </w:rPr>
+        <w:t xml:space="preserve"> משמש כ</w:t>
+      </w:r>
+      <w:r>
+        <w:rPr>
+          <w:lang w:val="en-US"/>
+        </w:rPr>
+        <w:t>log</w:t>
+      </w:r>
+      <w:r>
+        <w:rPr>
+          <w:rFonts w:hint="cs"/>
+          <w:rtl/>
+          <w:lang w:val="en-US"/>
+        </w:rPr>
+        <w:t xml:space="preserve"> מבוזר וכאשר הודעה נכתבת ל</w:t>
+      </w:r>
+      <w:proofErr w:type="spellStart"/>
+      <w:r>
+        <w:rPr>
+          <w:lang w:val="en-US"/>
+        </w:rPr>
+        <w:t>kafka</w:t>
+      </w:r>
+      <w:proofErr w:type="spellEnd"/>
+      <w:r>
+        <w:rPr>
+          <w:rFonts w:hint="cs"/>
+          <w:rtl/>
+          <w:lang w:val="en-US"/>
+        </w:rPr>
+        <w:t xml:space="preserve"> היא נשארת שם לכמות זמן מוגדרת גם אם קראו אותה (מה שמאפשר שמספר צרכנים יקראו את אותה הודעה)</w:t>
+      </w:r>
+    </w:p>
+    <w:p>
+      <w:pPr>
+        <w:bidi/>
+        <w:rPr>
+          <w:rtl/>
+        </w:rPr>
       </w:pPr>
       <w:r>
         <w:rPr>
@@ -2014,6 +2419,57 @@
     <w:p>
       <w:pPr>
         <w:bidi/>
+        <w:ind w:left="720"/>
+        <w:rPr>
+          <w:rFonts w:hint="cs"/>
+          <w:rtl/>
+          <w:lang w:val="en-US"/>
+        </w:rPr>
+      </w:pPr>
+      <w:r>
+        <w:rPr>
+          <w:rFonts w:hint="cs"/>
+          <w:rtl/>
+        </w:rPr>
+        <w:t>הודעות נשמרות כמות מוגדרת של זמן ונמחקות לאחר מכן,</w:t>
+      </w:r>
+      <w:r>
+        <w:rPr>
+          <w:lang w:val="en-US"/>
+        </w:rPr>
+        <w:t xml:space="preserve"> </w:t>
+      </w:r>
+      <w:r>
+        <w:rPr>
+          <w:rFonts w:hint="cs"/>
+          <w:rtl/>
+          <w:lang w:val="en-US"/>
+        </w:rPr>
+        <w:t xml:space="preserve"> ניתן להגדיר גם שההודעות יישאר</w:t>
+      </w:r>
+      <w:r>
+        <w:rPr>
+          <w:rFonts w:hint="eastAsia"/>
+          <w:rtl/>
+          <w:lang w:val="en-US"/>
+        </w:rPr>
+        <w:t>ו</w:t>
+      </w:r>
+      <w:r>
+        <w:rPr>
+          <w:rFonts w:hint="cs"/>
+          <w:rtl/>
+          <w:lang w:val="en-US"/>
+        </w:rPr>
+        <w:t xml:space="preserve"> לנצח</w:t>
+      </w:r>
+    </w:p>
+    <w:p>
+      <w:pPr>
+        <w:bidi/>
+        <w:rPr>
+          <w:rtl/>
+        </w:rPr>
       </w:pPr>
       <w:r>
         <w:rPr>
@@ -2028,7 +2484,112 @@
         <w:rPr>
           <w:rtl/>
         </w:rPr>
-        <w:t xml:space="preserve"> - כיצד</w:t>
+        <w:t xml:space="preserve"> </w:t>
+      </w:r>
+      <w:r>
+        <w:rPr>
+          <w:rtl/>
+        </w:rPr>
+        <w:t>–</w:t>
+      </w:r>
+      <w:r>
+        <w:rPr>
+          <w:rtl/>
+        </w:rPr>
+        <w:t xml:space="preserve"> כיצד</w:t>
+      </w:r>
+    </w:p>
+    <w:p>
+      <w:pPr>
+        <w:bidi/>
+        <w:ind w:left="720"/>
+        <w:rPr>
+          <w:rFonts w:hint="cs"/>
+          <w:rtl/>
+          <w:lang w:val="en-US"/>
+        </w:rPr>
+      </w:pPr>
+      <w:r>
+        <w:rPr>
+          <w:rFonts w:hint="cs"/>
+          <w:rtl/>
+          <w:lang w:val="en-US"/>
+        </w:rPr>
+        <w:t>כשמידע נכנס ל</w:t>
+      </w:r>
+      <w:r>
+        <w:rPr>
+          <w:lang w:val="en-US"/>
+        </w:rPr>
+        <w:t>topic</w:t>
+      </w:r>
+      <w:r>
+        <w:rPr>
+          <w:rFonts w:hint="cs"/>
+          <w:rtl/>
+          <w:lang w:val="en-US"/>
+        </w:rPr>
+        <w:t xml:space="preserve"> הוא מחולק ל</w:t>
+      </w:r>
+      <w:r>
+        <w:rPr>
+          <w:lang w:val="en-US"/>
+        </w:rPr>
+        <w:t>partition</w:t>
+      </w:r>
+      <w:r>
+        <w:rPr>
+          <w:rFonts w:hint="cs"/>
+          <w:rtl/>
+          <w:lang w:val="en-US"/>
+        </w:rPr>
+        <w:t>-ים אשר כל אחד מהם הוא קובץ לוגים אשר שמור על הדיסק וכך גם אם השרת קורס ההודעות נמצאות על הדיסק. בנוסף, ניתן להגדיר שכאשר מידע נכתב ל</w:t>
+      </w:r>
+      <w:r>
+        <w:rPr>
+          <w:lang w:val="en-US"/>
+        </w:rPr>
+        <w:t>partition</w:t>
+      </w:r>
+      <w:r>
+        <w:rPr>
+          <w:rFonts w:hint="cs"/>
+          <w:rtl/>
+          <w:lang w:val="en-US"/>
+        </w:rPr>
+        <w:t xml:space="preserve"> </w:t>
+      </w:r>
+      <w:proofErr w:type="spellStart"/>
+      <w:r>
+        <w:rPr>
+          <w:rFonts w:hint="cs"/>
+          <w:rtl/>
+          <w:lang w:val="en-US"/>
+        </w:rPr>
+        <w:t>מסויים</w:t>
+      </w:r>
+      <w:proofErr w:type="spellEnd"/>
+      <w:r>
+        <w:rPr>
+          <w:rFonts w:hint="cs"/>
+          <w:rtl/>
+          <w:lang w:val="en-US"/>
+        </w:rPr>
+        <w:t xml:space="preserve"> הוא ייכתב גם ל</w:t>
+      </w:r>
+      <w:r>
+        <w:rPr>
+          <w:lang w:val="en-US"/>
+        </w:rPr>
+        <w:t>partition</w:t>
+      </w:r>
+      <w:r>
+        <w:rPr>
+          <w:rFonts w:hint="cs"/>
+          <w:rtl/>
+          <w:lang w:val="en-US"/>
+        </w:rPr>
+        <w:t>-ים אחרים וכך המידע תמיד יהיה זמין</w:t>
       </w:r>
     </w:p>
     <w:p>
@@ -2193,6 +2754,7 @@
           <w:b/>
           <w:bCs/>
         </w:rPr>
+        <w:lastRenderedPageBreak/>
         <w:t>6. API</w:t>
       </w:r>
     </w:p>
@@ -2457,7 +3019,6 @@
         <w:rPr>
           <w:rtl/>
         </w:rPr>
-        <w:lastRenderedPageBreak/>
         <w:t xml:space="preserve">ואיזו בעיה הוא בא לפתור? </w:t>
       </w:r>
       <w:r>

</xml_diff>

<commit_message>
finished the microservices questions
</commit_message>
<xml_diff>
--- a/hfifa_questions_1.docx
+++ b/hfifa_questions_1.docx
@@ -56,13 +56,8 @@
       <w:pPr>
         <w:bidi/>
       </w:pPr>
-      <w:proofErr w:type="gramStart"/>
-      <w:r>
-        <w:t>[ ]</w:t>
-      </w:r>
-      <w:proofErr w:type="gramEnd"/>
-      <w:r>
-        <w:t xml:space="preserve"> word</w:t>
+      <w:r>
+        <w:t>[ ] word</w:t>
       </w:r>
       <w:r>
         <w:rPr>
@@ -130,11 +125,9 @@
       <w:pPr>
         <w:bidi/>
       </w:pPr>
-      <w:proofErr w:type="gramStart"/>
       <w:r>
         <w:t>?SQL</w:t>
       </w:r>
-      <w:proofErr w:type="gramEnd"/>
       <w:r>
         <w:rPr>
           <w:rtl/>
@@ -1111,11 +1104,9 @@
           <w:rtl/>
         </w:rPr>
       </w:pPr>
-      <w:proofErr w:type="gramStart"/>
       <w:r>
         <w:t>?Redis</w:t>
       </w:r>
-      <w:proofErr w:type="gramEnd"/>
       <w:r>
         <w:rPr>
           <w:rtl/>
@@ -1329,11 +1320,9 @@
           <w:lang w:val="en-US"/>
         </w:rPr>
       </w:pPr>
-      <w:proofErr w:type="gramStart"/>
       <w:r>
         <w:t>?Redis</w:t>
       </w:r>
-      <w:proofErr w:type="gramEnd"/>
       <w:r>
         <w:rPr>
           <w:rtl/>
@@ -1401,25 +1390,7 @@
           <w:rtl/>
           <w:lang w:val="en-US"/>
         </w:rPr>
-        <w:t xml:space="preserve"> או מילים ששומר </w:t>
-      </w:r>
-      <w:proofErr w:type="gramStart"/>
-      <w:r>
-        <w:rPr>
-          <w:rFonts w:hint="cs"/>
-          <w:rtl/>
-          <w:lang w:val="en-US"/>
-        </w:rPr>
-        <w:t>אלמנטים(</w:t>
-      </w:r>
-      <w:proofErr w:type="gramEnd"/>
-      <w:r>
-        <w:rPr>
-          <w:rFonts w:hint="cs"/>
-          <w:rtl/>
-          <w:lang w:val="en-US"/>
-        </w:rPr>
-        <w:t>בדרך כלל אותיות) בעזרת קידוד</w:t>
+        <w:t xml:space="preserve"> או מילים ששומר אלמנטים(בדרך כלל אותיות) בעזרת קידוד</w:t>
       </w:r>
     </w:p>
     <w:p>
@@ -1438,7 +1409,6 @@
         <w:lastRenderedPageBreak/>
         <w:tab/>
       </w:r>
-      <w:proofErr w:type="gramStart"/>
       <w:r>
         <w:rPr>
           <w:lang w:val="en-US"/>
@@ -1451,16 +1421,7 @@
           <w:rtl/>
           <w:lang w:val="en-US"/>
         </w:rPr>
-        <w:t xml:space="preserve"> -</w:t>
-      </w:r>
-      <w:proofErr w:type="gramEnd"/>
-      <w:r>
-        <w:rPr>
-          <w:rFonts w:hint="cs"/>
-          <w:rtl/>
-          <w:lang w:val="en-US"/>
-        </w:rPr>
-        <w:t xml:space="preserve"> מבנה נתונים ששומר סט של אלמנטים ייחודיים</w:t>
+        <w:t xml:space="preserve"> - מבנה נתונים ששומר סט של אלמנטים ייחודיים</w:t>
       </w:r>
     </w:p>
     <w:p>
@@ -1947,32 +1908,209 @@
         <w:bidi/>
       </w:pPr>
       <w:r>
-        <w:t>’</w:t>
-      </w:r>
-      <w:proofErr w:type="gramStart"/>
-      <w:r>
-        <w:t>topics</w:t>
-      </w:r>
-      <w:proofErr w:type="gramEnd"/>
-      <w:r>
-        <w:t xml:space="preserve">, partitions, producers, </w:t>
-      </w:r>
-      <w:proofErr w:type="gramStart"/>
-      <w:r>
+        <w:t>’topics, partitions, producers, consumers</w:t>
+      </w:r>
+      <w:r>
+        <w:rPr>
+          <w:rtl/>
+        </w:rPr>
+        <w:t xml:space="preserve"> : - הסבר את המושגים הבאים</w:t>
+      </w:r>
+    </w:p>
+    <w:p>
+      <w:pPr>
+        <w:bidi/>
+        <w:ind w:left="720"/>
+        <w:rPr>
+          <w:rFonts w:hint="cs"/>
+          <w:rtl/>
+          <w:lang w:val="en-US"/>
+        </w:rPr>
+      </w:pPr>
+      <w:r>
+        <w:t>Topic</w:t>
+      </w:r>
+      <w:r>
+        <w:rPr>
+          <w:rFonts w:hint="cs"/>
+          <w:rtl/>
+        </w:rPr>
+        <w:t xml:space="preserve"> </w:t>
+      </w:r>
+      <w:r>
+        <w:rPr>
+          <w:rtl/>
+        </w:rPr>
+        <w:t>–</w:t>
+      </w:r>
+      <w:r>
+        <w:rPr>
+          <w:rFonts w:hint="cs"/>
+          <w:rtl/>
+        </w:rPr>
+        <w:t xml:space="preserve"> נושא </w:t>
+      </w:r>
+      <w:proofErr w:type="spellStart"/>
+      <w:r>
+        <w:rPr>
+          <w:rFonts w:hint="cs"/>
+          <w:rtl/>
+        </w:rPr>
+        <w:t>מסויים</w:t>
+      </w:r>
+      <w:proofErr w:type="spellEnd"/>
+      <w:r>
+        <w:rPr>
+          <w:rFonts w:hint="cs"/>
+          <w:rtl/>
+        </w:rPr>
+        <w:t xml:space="preserve"> שאליו </w:t>
+      </w:r>
+      <w:r>
+        <w:rPr>
+          <w:lang w:val="en-US"/>
+        </w:rPr>
         <w:t>consumers</w:t>
       </w:r>
       <w:r>
         <w:rPr>
-          <w:rtl/>
-        </w:rPr>
-        <w:t xml:space="preserve"> :</w:t>
-      </w:r>
-      <w:proofErr w:type="gramEnd"/>
-      <w:r>
-        <w:rPr>
-          <w:rtl/>
-        </w:rPr>
-        <w:t xml:space="preserve"> - הסבר את המושגים הבאים</w:t>
+          <w:rFonts w:hint="cs"/>
+          <w:rtl/>
+          <w:lang w:val="en-US"/>
+        </w:rPr>
+        <w:t xml:space="preserve"> נרשמים וממנו הם קוראים הודעות ואליו </w:t>
+      </w:r>
+      <w:r>
+        <w:rPr>
+          <w:lang w:val="en-US"/>
+        </w:rPr>
+        <w:t>producers</w:t>
+      </w:r>
+      <w:r>
+        <w:rPr>
+          <w:rFonts w:hint="cs"/>
+          <w:rtl/>
+          <w:lang w:val="en-US"/>
+        </w:rPr>
+        <w:t xml:space="preserve"> מפרסמים הודעות</w:t>
+      </w:r>
+    </w:p>
+    <w:p>
+      <w:pPr>
+        <w:bidi/>
+        <w:rPr>
+          <w:rtl/>
+          <w:lang w:val="en-US"/>
+        </w:rPr>
+      </w:pPr>
+      <w:r>
+        <w:rPr>
+          <w:rtl/>
+        </w:rPr>
+        <w:tab/>
+      </w:r>
+      <w:r>
+        <w:rPr>
+          <w:lang w:val="en-US"/>
+        </w:rPr>
+        <w:t xml:space="preserve">Producer </w:t>
+      </w:r>
+      <w:r>
+        <w:rPr>
+          <w:rFonts w:hint="cs"/>
+          <w:rtl/>
+          <w:lang w:val="en-US"/>
+        </w:rPr>
+        <w:t xml:space="preserve"> - תוכנה או שירות אשר מפרסמים הודעות אל </w:t>
+      </w:r>
+      <w:r>
+        <w:rPr>
+          <w:lang w:val="en-US"/>
+        </w:rPr>
+        <w:t>topic</w:t>
+      </w:r>
+      <w:r>
+        <w:rPr>
+          <w:rFonts w:hint="cs"/>
+          <w:rtl/>
+          <w:lang w:val="en-US"/>
+        </w:rPr>
+        <w:t xml:space="preserve"> </w:t>
+      </w:r>
+      <w:proofErr w:type="spellStart"/>
+      <w:r>
+        <w:rPr>
+          <w:rFonts w:hint="cs"/>
+          <w:rtl/>
+          <w:lang w:val="en-US"/>
+        </w:rPr>
+        <w:t>מסויים</w:t>
+      </w:r>
+      <w:proofErr w:type="spellEnd"/>
+    </w:p>
+    <w:p>
+      <w:pPr>
+        <w:bidi/>
+        <w:rPr>
+          <w:rtl/>
+          <w:lang w:val="en-US"/>
+        </w:rPr>
+      </w:pPr>
+      <w:r>
+        <w:rPr>
+          <w:rtl/>
+          <w:lang w:val="en-US"/>
+        </w:rPr>
+        <w:tab/>
+      </w:r>
+      <w:r>
+        <w:rPr>
+          <w:lang w:val="en-US"/>
+        </w:rPr>
+        <w:t>Consu</w:t>
+      </w:r>
+      <w:r>
+        <w:rPr>
+          <w:lang w:val="en-US"/>
+        </w:rPr>
+        <w:t>mer</w:t>
+      </w:r>
+      <w:r>
+        <w:rPr>
+          <w:rFonts w:hint="cs"/>
+          <w:rtl/>
+          <w:lang w:val="en-US"/>
+        </w:rPr>
+        <w:t xml:space="preserve"> </w:t>
+      </w:r>
+      <w:r>
+        <w:rPr>
+          <w:rtl/>
+          <w:lang w:val="en-US"/>
+        </w:rPr>
+        <w:t>–</w:t>
+      </w:r>
+      <w:r>
+        <w:rPr>
+          <w:rFonts w:hint="cs"/>
+          <w:rtl/>
+          <w:lang w:val="en-US"/>
+        </w:rPr>
+        <w:t xml:space="preserve"> תוכנה או שירות אשר קורא הודעות מ</w:t>
+      </w:r>
+      <w:r>
+        <w:rPr>
+          <w:lang w:val="en-US"/>
+        </w:rPr>
+        <w:t xml:space="preserve">topic </w:t>
+      </w:r>
+      <w:r>
+        <w:rPr>
+          <w:rFonts w:hint="cs"/>
+          <w:rtl/>
+          <w:lang w:val="en-US"/>
+        </w:rPr>
+        <w:t xml:space="preserve"> אחד או יותר</w:t>
       </w:r>
     </w:p>
     <w:p>
@@ -1986,18 +2124,23 @@
         </w:rPr>
       </w:pPr>
       <w:r>
-        <w:t>Topic</w:t>
-      </w:r>
-      <w:r>
-        <w:rPr>
-          <w:rFonts w:hint="cs"/>
-          <w:rtl/>
+        <w:rPr>
+          <w:lang w:val="en-US"/>
+        </w:rPr>
+        <w:t>Partitions</w:t>
+      </w:r>
+      <w:r>
+        <w:rPr>
+          <w:rFonts w:hint="cs"/>
+          <w:rtl/>
+          <w:lang w:val="en-US"/>
         </w:rPr>
         <w:t xml:space="preserve"> </w:t>
       </w:r>
       <w:r>
         <w:rPr>
           <w:rtl/>
+          <w:lang w:val="en-US"/>
         </w:rPr>
         <w:t>–</w:t>
       </w:r>
@@ -2005,91 +2148,9 @@
         <w:rPr>
           <w:rFonts w:hint="cs"/>
           <w:rtl/>
-        </w:rPr>
-        <w:t xml:space="preserve"> נושא </w:t>
-      </w:r>
-      <w:proofErr w:type="spellStart"/>
-      <w:r>
-        <w:rPr>
-          <w:rFonts w:hint="cs"/>
-          <w:rtl/>
-        </w:rPr>
-        <w:t>מסויים</w:t>
-      </w:r>
-      <w:proofErr w:type="spellEnd"/>
-      <w:r>
-        <w:rPr>
-          <w:rFonts w:hint="cs"/>
-          <w:rtl/>
-        </w:rPr>
-        <w:t xml:space="preserve"> שאליו </w:t>
-      </w:r>
-      <w:r>
-        <w:rPr>
-          <w:lang w:val="en-US"/>
-        </w:rPr>
-        <w:t>consumers</w:t>
-      </w:r>
-      <w:r>
-        <w:rPr>
-          <w:rFonts w:hint="cs"/>
-          <w:rtl/>
-          <w:lang w:val="en-US"/>
-        </w:rPr>
-        <w:t xml:space="preserve"> נרשמים וממנו הם קוראים הודעות ואליו </w:t>
-      </w:r>
-      <w:r>
-        <w:rPr>
-          <w:lang w:val="en-US"/>
-        </w:rPr>
-        <w:t>producers</w:t>
-      </w:r>
-      <w:r>
-        <w:rPr>
-          <w:rFonts w:hint="cs"/>
-          <w:rtl/>
-          <w:lang w:val="en-US"/>
-        </w:rPr>
-        <w:t xml:space="preserve"> מפרסמים הודעות</w:t>
-      </w:r>
-    </w:p>
-    <w:p>
-      <w:pPr>
-        <w:bidi/>
-        <w:rPr>
-          <w:rtl/>
-          <w:lang w:val="en-US"/>
-        </w:rPr>
-      </w:pPr>
-      <w:r>
-        <w:rPr>
-          <w:rtl/>
-        </w:rPr>
-        <w:tab/>
-      </w:r>
-      <w:proofErr w:type="gramStart"/>
-      <w:r>
-        <w:rPr>
-          <w:lang w:val="en-US"/>
-        </w:rPr>
-        <w:t xml:space="preserve">Producer </w:t>
-      </w:r>
-      <w:r>
-        <w:rPr>
-          <w:rFonts w:hint="cs"/>
-          <w:rtl/>
-          <w:lang w:val="en-US"/>
-        </w:rPr>
-        <w:t xml:space="preserve"> -</w:t>
-      </w:r>
-      <w:proofErr w:type="gramEnd"/>
-      <w:r>
-        <w:rPr>
-          <w:rFonts w:hint="cs"/>
-          <w:rtl/>
-          <w:lang w:val="en-US"/>
-        </w:rPr>
-        <w:t xml:space="preserve"> תוכנה או שירות אשר מפרסמים הודעות אל </w:t>
+          <w:lang w:val="en-US"/>
+        </w:rPr>
+        <w:t xml:space="preserve"> חלוקות של </w:t>
       </w:r>
       <w:r>
         <w:rPr>
@@ -2103,134 +2164,8 @@
           <w:rtl/>
           <w:lang w:val="en-US"/>
         </w:rPr>
-        <w:t xml:space="preserve"> </w:t>
-      </w:r>
-      <w:proofErr w:type="spellStart"/>
-      <w:r>
-        <w:rPr>
-          <w:rFonts w:hint="cs"/>
-          <w:rtl/>
-          <w:lang w:val="en-US"/>
-        </w:rPr>
-        <w:t>מסויים</w:t>
-      </w:r>
-      <w:proofErr w:type="spellEnd"/>
-    </w:p>
-    <w:p>
-      <w:pPr>
-        <w:bidi/>
-        <w:rPr>
-          <w:rtl/>
-          <w:lang w:val="en-US"/>
-        </w:rPr>
-      </w:pPr>
-      <w:r>
-        <w:rPr>
-          <w:rtl/>
-          <w:lang w:val="en-US"/>
-        </w:rPr>
-        <w:tab/>
-      </w:r>
-      <w:r>
-        <w:rPr>
-          <w:lang w:val="en-US"/>
-        </w:rPr>
-        <w:t>Consu</w:t>
-      </w:r>
-      <w:r>
-        <w:rPr>
-          <w:lang w:val="en-US"/>
-        </w:rPr>
-        <w:t>mer</w:t>
-      </w:r>
-      <w:r>
-        <w:rPr>
-          <w:rFonts w:hint="cs"/>
-          <w:rtl/>
-          <w:lang w:val="en-US"/>
-        </w:rPr>
-        <w:t xml:space="preserve"> </w:t>
-      </w:r>
-      <w:r>
-        <w:rPr>
-          <w:rtl/>
-          <w:lang w:val="en-US"/>
-        </w:rPr>
-        <w:t>–</w:t>
-      </w:r>
-      <w:r>
-        <w:rPr>
-          <w:rFonts w:hint="cs"/>
-          <w:rtl/>
-          <w:lang w:val="en-US"/>
-        </w:rPr>
-        <w:t xml:space="preserve"> תוכנה או שירות אשר קורא הודעות מ</w:t>
-      </w:r>
-      <w:proofErr w:type="gramStart"/>
-      <w:r>
-        <w:rPr>
-          <w:lang w:val="en-US"/>
-        </w:rPr>
-        <w:t xml:space="preserve">topic </w:t>
-      </w:r>
-      <w:r>
-        <w:rPr>
-          <w:rFonts w:hint="cs"/>
-          <w:rtl/>
-          <w:lang w:val="en-US"/>
-        </w:rPr>
-        <w:t xml:space="preserve"> אחד</w:t>
-      </w:r>
-      <w:proofErr w:type="gramEnd"/>
-      <w:r>
-        <w:rPr>
-          <w:rFonts w:hint="cs"/>
-          <w:rtl/>
-          <w:lang w:val="en-US"/>
-        </w:rPr>
-        <w:t xml:space="preserve"> או יותר</w:t>
-      </w:r>
-    </w:p>
-    <w:p>
-      <w:pPr>
-        <w:bidi/>
-        <w:ind w:left="720"/>
-        <w:rPr>
-          <w:rFonts w:hint="cs"/>
-          <w:rtl/>
-          <w:lang w:val="en-US"/>
-        </w:rPr>
-      </w:pPr>
-      <w:r>
-        <w:rPr>
-          <w:lang w:val="en-US"/>
-        </w:rPr>
-        <w:t>Partitions</w:t>
-      </w:r>
-      <w:r>
-        <w:rPr>
-          <w:rFonts w:hint="cs"/>
-          <w:rtl/>
-          <w:lang w:val="en-US"/>
-        </w:rPr>
-        <w:t xml:space="preserve"> </w:t>
-      </w:r>
-      <w:r>
-        <w:rPr>
-          <w:rtl/>
-          <w:lang w:val="en-US"/>
-        </w:rPr>
-        <w:t>–</w:t>
-      </w:r>
-      <w:r>
-        <w:rPr>
-          <w:rFonts w:hint="cs"/>
-          <w:rtl/>
-          <w:lang w:val="en-US"/>
-        </w:rPr>
-        <w:t xml:space="preserve"> חלוקות של </w:t>
-      </w:r>
-      <w:proofErr w:type="gramStart"/>
+        <w:t xml:space="preserve"> . המידע שנמצא ב</w:t>
+      </w:r>
       <w:r>
         <w:rPr>
           <w:lang w:val="en-US"/>
@@ -2243,16 +2178,21 @@
           <w:rtl/>
           <w:lang w:val="en-US"/>
         </w:rPr>
-        <w:t xml:space="preserve"> .</w:t>
-      </w:r>
-      <w:proofErr w:type="gramEnd"/>
-      <w:r>
-        <w:rPr>
-          <w:rFonts w:hint="cs"/>
-          <w:rtl/>
-          <w:lang w:val="en-US"/>
-        </w:rPr>
-        <w:t xml:space="preserve"> המידע שנמצא ב</w:t>
+        <w:t xml:space="preserve"> מתחלק בין ה </w:t>
+      </w:r>
+      <w:r>
+        <w:rPr>
+          <w:lang w:val="en-US"/>
+        </w:rPr>
+        <w:t>partition</w:t>
+      </w:r>
+      <w:r>
+        <w:rPr>
+          <w:rFonts w:hint="cs"/>
+          <w:rtl/>
+          <w:lang w:val="en-US"/>
+        </w:rPr>
+        <w:t>-ים וכך אפשר לקרוא את המידע מ</w:t>
       </w:r>
       <w:r>
         <w:rPr>
@@ -2266,34 +2206,6 @@
           <w:rtl/>
           <w:lang w:val="en-US"/>
         </w:rPr>
-        <w:t xml:space="preserve"> מתחלק בין ה </w:t>
-      </w:r>
-      <w:r>
-        <w:rPr>
-          <w:lang w:val="en-US"/>
-        </w:rPr>
-        <w:t>partition</w:t>
-      </w:r>
-      <w:r>
-        <w:rPr>
-          <w:rFonts w:hint="cs"/>
-          <w:rtl/>
-          <w:lang w:val="en-US"/>
-        </w:rPr>
-        <w:t>-ים וכך אפשר לקרוא את המידע מ</w:t>
-      </w:r>
-      <w:r>
-        <w:rPr>
-          <w:lang w:val="en-US"/>
-        </w:rPr>
-        <w:t>topic</w:t>
-      </w:r>
-      <w:r>
-        <w:rPr>
-          <w:rFonts w:hint="cs"/>
-          <w:rtl/>
-          <w:lang w:val="en-US"/>
-        </w:rPr>
         <w:t xml:space="preserve"> מהר יותר</w:t>
       </w:r>
     </w:p>
@@ -2304,11 +2216,9 @@
           <w:rtl/>
         </w:rPr>
       </w:pPr>
-      <w:proofErr w:type="gramStart"/>
       <w:r>
         <w:t>?RabbitMQ</w:t>
       </w:r>
-      <w:proofErr w:type="gramEnd"/>
       <w:r>
         <w:rPr>
           <w:rtl/>
@@ -2631,6 +2541,55 @@
     <w:p>
       <w:pPr>
         <w:bidi/>
+        <w:ind w:left="720"/>
+        <w:rPr>
+          <w:rFonts w:hint="cs"/>
+          <w:rtl/>
+          <w:lang w:val="en-US"/>
+        </w:rPr>
+      </w:pPr>
+      <w:r>
+        <w:rPr>
+          <w:rFonts w:hint="cs"/>
+          <w:rtl/>
+        </w:rPr>
+        <w:t xml:space="preserve">המטרה העיקרית של </w:t>
+      </w:r>
+      <w:r>
+        <w:rPr>
+          <w:lang w:val="en-US"/>
+        </w:rPr>
+        <w:t>NIFI</w:t>
+      </w:r>
+      <w:r>
+        <w:rPr>
+          <w:rFonts w:hint="cs"/>
+          <w:rtl/>
+          <w:lang w:val="en-US"/>
+        </w:rPr>
+        <w:t xml:space="preserve"> היא לאפשר ליצור תהליכי עיבוד והזרמת מידע בקלות ובצורה ויזואלית בזמן אמת</w:t>
+      </w:r>
+      <w:r>
+        <w:rPr>
+          <w:lang w:val="en-US"/>
+        </w:rPr>
+        <w:t>.</w:t>
+      </w:r>
+      <w:r>
+        <w:rPr>
+          <w:rFonts w:hint="cs"/>
+          <w:rtl/>
+          <w:lang w:val="en-US"/>
+        </w:rPr>
+        <w:t xml:space="preserve"> הצורך שהיא פותרת הוא הצורך ליצור את אותם תהליכים בקלות ללא צורך בכתיבת קוד</w:t>
+      </w:r>
+    </w:p>
+    <w:p>
+      <w:pPr>
+        <w:bidi/>
+        <w:rPr>
+          <w:rtl/>
+        </w:rPr>
       </w:pPr>
       <w:r>
         <w:t xml:space="preserve">connections, processors, </w:t>
@@ -2646,27 +2605,491 @@
         </w:rPr>
         <w:t xml:space="preserve"> - הסבר מהם</w:t>
       </w:r>
-    </w:p>
-    <w:p>
-      <w:pPr>
-        <w:bidi/>
-      </w:pPr>
-      <w:r>
-        <w:rPr>
-          <w:rtl/>
-        </w:rPr>
+      <w:r>
+        <w:rPr>
+          <w:rtl/>
+        </w:rPr>
+        <w:tab/>
+      </w:r>
+      <w:r>
+        <w:rPr>
+          <w:rtl/>
+        </w:rPr>
+        <w:tab/>
+      </w:r>
+      <w:r>
+        <w:rPr>
+          <w:rtl/>
+        </w:rPr>
+        <w:tab/>
+      </w:r>
+      <w:r>
+        <w:rPr>
+          <w:rtl/>
+        </w:rPr>
+        <w:tab/>
+      </w:r>
+      <w:r>
+        <w:rPr>
+          <w:rtl/>
+        </w:rPr>
+        <w:tab/>
+      </w:r>
+    </w:p>
+    <w:p>
+      <w:pPr>
+        <w:bidi/>
+        <w:ind w:left="720"/>
+        <w:rPr>
+          <w:rtl/>
+          <w:lang w:val="en-US"/>
+        </w:rPr>
+      </w:pPr>
+      <w:r>
+        <w:rPr>
+          <w:lang w:val="en-US"/>
+        </w:rPr>
+        <w:t>processors</w:t>
+      </w:r>
+      <w:r>
+        <w:rPr>
+          <w:rFonts w:hint="cs"/>
+          <w:rtl/>
+          <w:lang w:val="en-US"/>
+        </w:rPr>
+        <w:t xml:space="preserve">- הם תהליכי העיבוד השונים אשר ניתן להעביר את המידע בהם. רוב ה </w:t>
+      </w:r>
+      <w:r>
+        <w:rPr>
+          <w:lang w:val="en-US"/>
+        </w:rPr>
+        <w:t>processor</w:t>
+      </w:r>
+      <w:r>
+        <w:rPr>
+          <w:rFonts w:hint="cs"/>
+          <w:rtl/>
+          <w:lang w:val="en-US"/>
+        </w:rPr>
+        <w:t xml:space="preserve">-ים מקבלים </w:t>
+      </w:r>
+      <w:proofErr w:type="spellStart"/>
+      <w:r>
+        <w:rPr>
+          <w:lang w:val="en-US"/>
+        </w:rPr>
+        <w:t>FlowFile</w:t>
+      </w:r>
+      <w:proofErr w:type="spellEnd"/>
+      <w:r>
+        <w:rPr>
+          <w:rFonts w:hint="cs"/>
+          <w:rtl/>
+          <w:lang w:val="en-US"/>
+        </w:rPr>
+        <w:t xml:space="preserve"> </w:t>
+      </w:r>
+      <w:r>
+        <w:rPr>
+          <w:lang w:val="en-US"/>
+        </w:rPr>
+        <w:t xml:space="preserve"> processor</w:t>
+      </w:r>
+      <w:r>
+        <w:rPr>
+          <w:rFonts w:hint="cs"/>
+          <w:rtl/>
+          <w:lang w:val="en-US"/>
+        </w:rPr>
+        <w:t xml:space="preserve"> שקודם להם ומעבירים </w:t>
+      </w:r>
+      <w:proofErr w:type="spellStart"/>
+      <w:r>
+        <w:rPr>
+          <w:lang w:val="en-US"/>
+        </w:rPr>
+        <w:t>FlowFile</w:t>
+      </w:r>
+      <w:proofErr w:type="spellEnd"/>
+      <w:r>
+        <w:rPr>
+          <w:rFonts w:hint="cs"/>
+          <w:rtl/>
+          <w:lang w:val="en-US"/>
+        </w:rPr>
+        <w:t xml:space="preserve"> ל</w:t>
+      </w:r>
+      <w:r>
+        <w:rPr>
+          <w:lang w:val="en-US"/>
+        </w:rPr>
+        <w:t>processor</w:t>
+      </w:r>
+      <w:r>
+        <w:rPr>
+          <w:rFonts w:hint="cs"/>
+          <w:rtl/>
+          <w:lang w:val="en-US"/>
+        </w:rPr>
+        <w:t xml:space="preserve"> הבא בתהליך</w:t>
+      </w:r>
+    </w:p>
+    <w:p>
+      <w:pPr>
+        <w:bidi/>
+        <w:ind w:left="720"/>
+        <w:rPr>
+          <w:rtl/>
+          <w:lang w:val="en-US"/>
+        </w:rPr>
+      </w:pPr>
+      <w:proofErr w:type="spellStart"/>
+      <w:r>
+        <w:rPr>
+          <w:lang w:val="en-US"/>
+        </w:rPr>
+        <w:t>FlowFile</w:t>
+      </w:r>
+      <w:proofErr w:type="spellEnd"/>
+      <w:r>
+        <w:rPr>
+          <w:rFonts w:hint="cs"/>
+          <w:rtl/>
+          <w:lang w:val="en-US"/>
+        </w:rPr>
+        <w:t xml:space="preserve"> </w:t>
+      </w:r>
+      <w:r>
+        <w:rPr>
+          <w:rtl/>
+          <w:lang w:val="en-US"/>
+        </w:rPr>
+        <w:t>–</w:t>
+      </w:r>
+      <w:r>
+        <w:rPr>
+          <w:rFonts w:hint="cs"/>
+          <w:rtl/>
+          <w:lang w:val="en-US"/>
+        </w:rPr>
+        <w:t xml:space="preserve"> פלט או קלט מ</w:t>
+      </w:r>
+      <w:r>
+        <w:rPr>
+          <w:lang w:val="en-US"/>
+        </w:rPr>
+        <w:t>processor</w:t>
+      </w:r>
+    </w:p>
+    <w:p>
+      <w:pPr>
+        <w:bidi/>
+        <w:ind w:left="720"/>
+        <w:rPr>
+          <w:rFonts w:hint="cs"/>
+          <w:rtl/>
+          <w:lang w:val="en-US"/>
+        </w:rPr>
+      </w:pPr>
+      <w:r>
+        <w:rPr>
+          <w:lang w:val="en-US"/>
+        </w:rPr>
+        <w:t>Connections</w:t>
+      </w:r>
+      <w:r>
+        <w:rPr>
+          <w:rFonts w:hint="cs"/>
+          <w:rtl/>
+          <w:lang w:val="en-US"/>
+        </w:rPr>
+        <w:t xml:space="preserve"> </w:t>
+      </w:r>
+      <w:r>
+        <w:rPr>
+          <w:rtl/>
+          <w:lang w:val="en-US"/>
+        </w:rPr>
+        <w:t>–</w:t>
+      </w:r>
+      <w:r>
+        <w:rPr>
+          <w:rFonts w:hint="cs"/>
+          <w:rtl/>
+          <w:lang w:val="en-US"/>
+        </w:rPr>
+        <w:t xml:space="preserve"> חיבורים בין </w:t>
+      </w:r>
+      <w:r>
+        <w:rPr>
+          <w:lang w:val="en-US"/>
+        </w:rPr>
+        <w:t>processor</w:t>
+      </w:r>
+      <w:r>
+        <w:rPr>
+          <w:rFonts w:hint="cs"/>
+          <w:rtl/>
+          <w:lang w:val="en-US"/>
+        </w:rPr>
+        <w:t xml:space="preserve">ים שונים אשר מעבירים </w:t>
+      </w:r>
+      <w:proofErr w:type="spellStart"/>
+      <w:r>
+        <w:rPr>
+          <w:lang w:val="en-US"/>
+        </w:rPr>
+        <w:t>FlowFile</w:t>
+      </w:r>
+      <w:proofErr w:type="spellEnd"/>
+      <w:r>
+        <w:rPr>
+          <w:rFonts w:hint="cs"/>
+          <w:rtl/>
+          <w:lang w:val="en-US"/>
+        </w:rPr>
+        <w:t>ים בין ה</w:t>
+      </w:r>
+      <w:r>
+        <w:rPr>
+          <w:lang w:val="en-US"/>
+        </w:rPr>
+        <w:t>Processor</w:t>
+      </w:r>
+      <w:r>
+        <w:rPr>
+          <w:rFonts w:hint="cs"/>
+          <w:rtl/>
+          <w:lang w:val="en-US"/>
+        </w:rPr>
+        <w:t>ים השונים</w:t>
+      </w:r>
+    </w:p>
+    <w:p>
+      <w:pPr>
+        <w:bidi/>
+        <w:rPr>
+          <w:rtl/>
+        </w:rPr>
+      </w:pPr>
+      <w:r>
+        <w:rPr>
+          <w:rtl/>
+        </w:rPr>
+        <w:lastRenderedPageBreak/>
         <w:t>- איך המערכת מתמודדת עם צוואר בקבוק במערכת היעד?</w:t>
       </w:r>
     </w:p>
     <w:p>
       <w:pPr>
         <w:bidi/>
+        <w:ind w:left="720"/>
+        <w:rPr>
+          <w:rFonts w:hint="cs"/>
+          <w:rtl/>
+          <w:lang w:val="en-US"/>
+        </w:rPr>
+      </w:pPr>
+      <w:r>
+        <w:rPr>
+          <w:rFonts w:hint="cs"/>
+          <w:rtl/>
+        </w:rPr>
+        <w:t xml:space="preserve">במערכת יש תורים מובנים אשר מחזיקים בהם את המידע שעובר בכל </w:t>
+      </w:r>
+      <w:r>
+        <w:rPr>
+          <w:rFonts w:hint="cs"/>
+          <w:rtl/>
+          <w:lang w:val="en-US"/>
+        </w:rPr>
+        <w:t>חיבור כך שאם יש צוואר בקבוק במערכת היעד התורים פשוט ייפרקו בקצב שמתאים לאותה מערכת יעד</w:t>
+      </w:r>
+    </w:p>
+    <w:p>
+      <w:pPr>
+        <w:bidi/>
+        <w:rPr>
+          <w:rtl/>
+        </w:rPr>
       </w:pPr>
       <w:r>
         <w:rPr>
           <w:rtl/>
         </w:rPr>
         <w:t>- מה היתרונות של שימוש בממשק ויזואלי לניהול זרימת נתונים לעומת כתיבה של קוד ייעודי</w:t>
+      </w:r>
+    </w:p>
+    <w:p>
+      <w:pPr>
+        <w:bidi/>
+        <w:rPr>
+          <w:lang w:val="en-US"/>
+        </w:rPr>
+      </w:pPr>
+      <w:r>
+        <w:rPr>
+          <w:rtl/>
+        </w:rPr>
+        <w:tab/>
+      </w:r>
+      <w:r>
+        <w:rPr>
+          <w:rFonts w:hint="cs"/>
+          <w:rtl/>
+        </w:rPr>
+        <w:t>היתרונות הם</w:t>
+      </w:r>
+      <w:r>
+        <w:rPr>
+          <w:rFonts w:hint="cs"/>
+          <w:rtl/>
+        </w:rPr>
+        <w:t>:</w:t>
+      </w:r>
+    </w:p>
+    <w:p>
+      <w:pPr>
+        <w:bidi/>
+        <w:ind w:left="720"/>
+        <w:rPr>
+          <w:rtl/>
+        </w:rPr>
+      </w:pPr>
+      <w:proofErr w:type="spellStart"/>
+      <w:r>
+        <w:rPr>
+          <w:rFonts w:hint="cs"/>
+          <w:rtl/>
+        </w:rPr>
+        <w:t>דיבוג</w:t>
+      </w:r>
+      <w:proofErr w:type="spellEnd"/>
+      <w:r>
+        <w:rPr>
+          <w:rFonts w:hint="cs"/>
+          <w:rtl/>
+        </w:rPr>
+        <w:t xml:space="preserve"> קל </w:t>
+      </w:r>
+      <w:r>
+        <w:rPr>
+          <w:rtl/>
+        </w:rPr>
+        <w:t>–</w:t>
+      </w:r>
+      <w:r>
+        <w:rPr>
+          <w:rFonts w:hint="cs"/>
+          <w:rtl/>
+        </w:rPr>
+        <w:t xml:space="preserve"> קל לראות איפה יש שגיאות ומה הן, וקל מאוד לבדוק את המערכת ולראות </w:t>
+      </w:r>
+      <w:proofErr w:type="spellStart"/>
+      <w:r>
+        <w:rPr>
+          <w:rFonts w:hint="cs"/>
+          <w:rtl/>
+        </w:rPr>
+        <w:t>שהכל</w:t>
+      </w:r>
+      <w:proofErr w:type="spellEnd"/>
+      <w:r>
+        <w:rPr>
+          <w:rFonts w:hint="cs"/>
+          <w:rtl/>
+        </w:rPr>
+        <w:t xml:space="preserve"> עובר בצורה חלקה ושכל חלק עושה את העבודה שלו כמו שצריך</w:t>
+      </w:r>
+      <w:r>
+        <w:rPr>
+          <w:rFonts w:hint="cs"/>
+          <w:rtl/>
+        </w:rPr>
+        <w:t>.</w:t>
+      </w:r>
+    </w:p>
+    <w:p>
+      <w:pPr>
+        <w:bidi/>
+        <w:ind w:left="720"/>
+        <w:rPr>
+          <w:rtl/>
+        </w:rPr>
+      </w:pPr>
+      <w:r>
+        <w:rPr>
+          <w:rFonts w:hint="cs"/>
+          <w:rtl/>
+        </w:rPr>
+        <w:t xml:space="preserve">שליטה רבה יותר במערכת </w:t>
+      </w:r>
+      <w:r>
+        <w:rPr>
+          <w:rtl/>
+        </w:rPr>
+        <w:t>–</w:t>
+      </w:r>
+      <w:r>
+        <w:rPr>
+          <w:rFonts w:hint="cs"/>
+          <w:rtl/>
+        </w:rPr>
+        <w:t xml:space="preserve"> הרבה יותר אינטואיטיב</w:t>
+      </w:r>
+      <w:r>
+        <w:rPr>
+          <w:rFonts w:hint="eastAsia"/>
+          <w:rtl/>
+        </w:rPr>
+        <w:t>י</w:t>
+      </w:r>
+      <w:r>
+        <w:rPr>
+          <w:rFonts w:hint="cs"/>
+          <w:rtl/>
+        </w:rPr>
+        <w:t xml:space="preserve"> </w:t>
+      </w:r>
+      <w:r>
+        <w:rPr>
+          <w:rFonts w:hint="cs"/>
+          <w:rtl/>
+        </w:rPr>
+        <w:t>לבנות את המערכת, לראות איזה חלקים חסרים, ולהתנסות בשינויים במערכת.</w:t>
+      </w:r>
+    </w:p>
+    <w:p>
+      <w:pPr>
+        <w:bidi/>
+        <w:ind w:left="720"/>
+      </w:pPr>
+      <w:r>
+        <w:rPr>
+          <w:rFonts w:hint="cs"/>
+          <w:rtl/>
+        </w:rPr>
+        <w:t xml:space="preserve">קלות רבה יותר להיכנס לתוך מערכת קיימת </w:t>
+      </w:r>
+      <w:r>
+        <w:rPr>
+          <w:rtl/>
+        </w:rPr>
+        <w:t>–</w:t>
+      </w:r>
+      <w:r>
+        <w:rPr>
+          <w:rFonts w:hint="cs"/>
+          <w:rtl/>
+        </w:rPr>
+        <w:t xml:space="preserve"> הרבה יותר קל ללמוד את המערכת בצורה ויזואלית ולהבין מה כל חלק עושה ומה היחסים בין כל החלקים</w:t>
+      </w:r>
+      <w:r>
+        <w:rPr>
+          <w:rFonts w:hint="cs"/>
+          <w:rtl/>
+        </w:rPr>
+        <w:t>.</w:t>
       </w:r>
     </w:p>
     <w:p>
@@ -2711,6 +3134,63 @@
     <w:p>
       <w:pPr>
         <w:bidi/>
+        <w:ind w:left="720"/>
+        <w:rPr>
+          <w:rFonts w:hint="cs"/>
+          <w:rtl/>
+          <w:lang w:val="en-US"/>
+        </w:rPr>
+      </w:pPr>
+      <w:r>
+        <w:rPr>
+          <w:rFonts w:hint="cs"/>
+          <w:rtl/>
+        </w:rPr>
+        <w:t xml:space="preserve">בשיטת </w:t>
+      </w:r>
+      <w:r>
+        <w:rPr>
+          <w:lang w:val="en-US"/>
+        </w:rPr>
+        <w:t>monolith</w:t>
+      </w:r>
+      <w:r>
+        <w:rPr>
+          <w:rFonts w:hint="cs"/>
+          <w:rtl/>
+          <w:lang w:val="en-US"/>
+        </w:rPr>
+        <w:t xml:space="preserve"> המערכת נכתבת כרכיב אחד גדול ובשיטת </w:t>
+      </w:r>
+      <w:r>
+        <w:rPr>
+          <w:lang w:val="en-US"/>
+        </w:rPr>
+        <w:t>microservices</w:t>
+      </w:r>
+      <w:r>
+        <w:rPr>
+          <w:rFonts w:hint="cs"/>
+          <w:rtl/>
+          <w:lang w:val="en-US"/>
+        </w:rPr>
+        <w:t xml:space="preserve"> המערכת נכתבת כמספר רכיבים קטנים אשר מתקשרים ביניה</w:t>
+      </w:r>
+      <w:r>
+        <w:rPr>
+          <w:rFonts w:hint="eastAsia"/>
+          <w:rtl/>
+          <w:lang w:val="en-US"/>
+        </w:rPr>
+        <w:t>ם</w:t>
+      </w:r>
+    </w:p>
+    <w:p>
+      <w:pPr>
+        <w:bidi/>
+        <w:rPr>
+          <w:rtl/>
+        </w:rPr>
       </w:pPr>
       <w:r>
         <w:rPr>
@@ -2722,6 +3202,216 @@
     <w:p>
       <w:pPr>
         <w:bidi/>
+        <w:rPr>
+          <w:rtl/>
+        </w:rPr>
+      </w:pPr>
+      <w:r>
+        <w:rPr>
+          <w:rtl/>
+        </w:rPr>
+        <w:tab/>
+      </w:r>
+      <w:r>
+        <w:rPr>
+          <w:rFonts w:hint="cs"/>
+          <w:rtl/>
+        </w:rPr>
+        <w:t>היתרונות בשיטה זו הם:</w:t>
+      </w:r>
+    </w:p>
+    <w:p>
+      <w:pPr>
+        <w:bidi/>
+      </w:pPr>
+      <w:r>
+        <w:rPr>
+          <w:rtl/>
+        </w:rPr>
+        <w:tab/>
+      </w:r>
+      <w:proofErr w:type="spellStart"/>
+      <w:r>
+        <w:rPr>
+          <w:rFonts w:hint="cs"/>
+          <w:rtl/>
+        </w:rPr>
+        <w:t>דיבוג</w:t>
+      </w:r>
+      <w:proofErr w:type="spellEnd"/>
+      <w:r>
+        <w:rPr>
+          <w:rFonts w:hint="cs"/>
+          <w:rtl/>
+        </w:rPr>
+        <w:t xml:space="preserve"> קל </w:t>
+      </w:r>
+      <w:r>
+        <w:rPr>
+          <w:rtl/>
+        </w:rPr>
+        <w:t>–</w:t>
+      </w:r>
+      <w:r>
+        <w:rPr>
+          <w:rFonts w:hint="cs"/>
+          <w:rtl/>
+        </w:rPr>
+        <w:t xml:space="preserve"> במידה ויש שגיאה קל מאוד להבין באיזה רכיב נגרמת השגיאה ולטפל בשגיאה משם</w:t>
+      </w:r>
+    </w:p>
+    <w:p>
+      <w:pPr>
+        <w:bidi/>
+        <w:rPr>
+          <w:rtl/>
+        </w:rPr>
+      </w:pPr>
+      <w:r>
+        <w:tab/>
+      </w:r>
+      <w:r>
+        <w:rPr>
+          <w:rFonts w:hint="cs"/>
+          <w:rtl/>
+        </w:rPr>
+        <w:t xml:space="preserve">גמישות טכנולוגית </w:t>
+      </w:r>
+      <w:r>
+        <w:rPr>
+          <w:rtl/>
+        </w:rPr>
+        <w:t>–</w:t>
+      </w:r>
+      <w:r>
+        <w:rPr>
+          <w:rFonts w:hint="cs"/>
+          <w:rtl/>
+        </w:rPr>
+        <w:t xml:space="preserve"> ניתן להשתמש במספר רב של טכנולוגיות וכך להשתמש בכלים המתאימים </w:t>
+      </w:r>
+    </w:p>
+    <w:p>
+      <w:pPr>
+        <w:bidi/>
+        <w:rPr>
+          <w:rtl/>
+        </w:rPr>
+      </w:pPr>
+      <w:r>
+        <w:rPr>
+          <w:rtl/>
+        </w:rPr>
+        <w:tab/>
+      </w:r>
+      <w:r>
+        <w:rPr>
+          <w:rFonts w:hint="cs"/>
+          <w:rtl/>
+        </w:rPr>
+        <w:t>ביותר בכל חלק במערכת</w:t>
+      </w:r>
+    </w:p>
+    <w:p>
+      <w:pPr>
+        <w:bidi/>
+        <w:ind w:left="720"/>
+        <w:rPr>
+          <w:rFonts w:hint="cs"/>
+          <w:rtl/>
+          <w:lang w:val="en-US"/>
+        </w:rPr>
+      </w:pPr>
+      <w:r>
+        <w:rPr>
+          <w:lang w:val="en-US"/>
+        </w:rPr>
+        <w:t>Scalability</w:t>
+      </w:r>
+      <w:r>
+        <w:rPr>
+          <w:rFonts w:hint="cs"/>
+          <w:rtl/>
+          <w:lang w:val="en-US"/>
+        </w:rPr>
+        <w:t xml:space="preserve"> </w:t>
+      </w:r>
+      <w:r>
+        <w:rPr>
+          <w:rtl/>
+          <w:lang w:val="en-US"/>
+        </w:rPr>
+        <w:t>–</w:t>
+      </w:r>
+      <w:r>
+        <w:rPr>
+          <w:rFonts w:hint="cs"/>
+          <w:rtl/>
+          <w:lang w:val="en-US"/>
+        </w:rPr>
+        <w:t xml:space="preserve"> שיטה זו מאפשרת </w:t>
+      </w:r>
+      <w:r>
+        <w:rPr>
+          <w:rFonts w:hint="cs"/>
+          <w:rtl/>
+          <w:lang w:val="en-US"/>
+        </w:rPr>
+        <w:t>להרחיב רק את החלקים שצריכים הרחבה במערכת ( למשל הרחבת שטח האחסון רק ל</w:t>
+      </w:r>
+      <w:r>
+        <w:rPr>
+          <w:lang w:val="en-US"/>
+        </w:rPr>
+        <w:t>DB</w:t>
+      </w:r>
+      <w:r>
+        <w:rPr>
+          <w:rFonts w:hint="cs"/>
+          <w:rtl/>
+          <w:lang w:val="en-US"/>
+        </w:rPr>
+        <w:t xml:space="preserve"> אחד </w:t>
+      </w:r>
+      <w:proofErr w:type="spellStart"/>
+      <w:r>
+        <w:rPr>
+          <w:rFonts w:hint="cs"/>
+          <w:rtl/>
+          <w:lang w:val="en-US"/>
+        </w:rPr>
+        <w:t>מסויים</w:t>
+      </w:r>
+      <w:proofErr w:type="spellEnd"/>
+      <w:r>
+        <w:rPr>
+          <w:rFonts w:hint="cs"/>
+          <w:rtl/>
+          <w:lang w:val="en-US"/>
+        </w:rPr>
+        <w:t xml:space="preserve"> במערכת )</w:t>
+      </w:r>
+    </w:p>
+    <w:p>
+      <w:pPr>
+        <w:bidi/>
+        <w:rPr>
+          <w:lang w:val="en-US"/>
+        </w:rPr>
+      </w:pPr>
+      <w:r>
+        <w:rPr>
+          <w:rtl/>
+        </w:rPr>
+        <w:tab/>
+      </w:r>
+    </w:p>
+    <w:p>
+      <w:pPr>
+        <w:bidi/>
+        <w:rPr>
+          <w:rtl/>
+        </w:rPr>
       </w:pPr>
       <w:r>
         <w:rPr>
@@ -2733,12 +3423,136 @@
     <w:p>
       <w:pPr>
         <w:bidi/>
+        <w:ind w:left="720"/>
+        <w:rPr>
+          <w:rFonts w:hint="cs"/>
+          <w:rtl/>
+          <w:lang w:val="en-US"/>
+        </w:rPr>
+      </w:pPr>
+      <w:r>
+        <w:rPr>
+          <w:rFonts w:hint="cs"/>
+          <w:rtl/>
+        </w:rPr>
+        <w:t>ארכיטקטורה כזו מוסיפה אתגר של תקשורת בין רכיבים, שכן צריך לממש דרך שבה הרכיבים יוכלו לתקשר זה עם זה.</w:t>
+      </w:r>
+      <w:r>
+        <w:rPr>
+          <w:rFonts w:hint="cs"/>
+          <w:rtl/>
+          <w:lang w:val="en-US"/>
+        </w:rPr>
+        <w:t xml:space="preserve"> בנוסף, ארכיטקטורה כזו מוסיפה קושי של בדיקת המערכת מכיוון שצריך להוסיף בדיקות שכל רכיב מוציא ומקבל בדיוק מה שהוא אמור ויש להתחשב במקרים שלא יכולים לקרות ב</w:t>
+      </w:r>
+      <w:r>
+        <w:rPr>
+          <w:lang w:val="en-US"/>
+        </w:rPr>
+        <w:t>monolith</w:t>
+      </w:r>
+      <w:r>
+        <w:rPr>
+          <w:rFonts w:hint="cs"/>
+          <w:rtl/>
+          <w:lang w:val="en-US"/>
+        </w:rPr>
+        <w:t xml:space="preserve"> כמו  נפילה של אחד הרכיבים</w:t>
+      </w:r>
+    </w:p>
+    <w:p>
+      <w:pPr>
+        <w:bidi/>
+        <w:rPr>
+          <w:rtl/>
+        </w:rPr>
       </w:pPr>
       <w:r>
         <w:rPr>
           <w:rtl/>
         </w:rPr>
         <w:t>- הבא דוגמאות לתקשורת בין מיקרו-סרוויסים</w:t>
+      </w:r>
+    </w:p>
+    <w:p>
+      <w:pPr>
+        <w:bidi/>
+        <w:rPr>
+          <w:rtl/>
+          <w:lang w:val="en-US"/>
+        </w:rPr>
+      </w:pPr>
+      <w:r>
+        <w:rPr>
+          <w:rtl/>
+        </w:rPr>
+        <w:tab/>
+      </w:r>
+      <w:r>
+        <w:rPr>
+          <w:rFonts w:hint="cs"/>
+          <w:rtl/>
+        </w:rPr>
+        <w:t xml:space="preserve">דוגמא לתקשורת בין מיקרו-סרוויסים היא בקשת </w:t>
+      </w:r>
+      <w:r>
+        <w:rPr>
+          <w:lang w:val="en-US"/>
+        </w:rPr>
+        <w:t>post</w:t>
+      </w:r>
+      <w:r>
+        <w:rPr>
+          <w:rFonts w:hint="cs"/>
+          <w:rtl/>
+          <w:lang w:val="en-US"/>
+        </w:rPr>
+        <w:t xml:space="preserve"> שנעשית מצד הלקוח כאשר הוא נרשם אל </w:t>
+      </w:r>
+    </w:p>
+    <w:p>
+      <w:pPr>
+        <w:bidi/>
+        <w:rPr>
+          <w:rFonts w:hint="cs"/>
+          <w:rtl/>
+          <w:lang w:val="en-US"/>
+        </w:rPr>
+      </w:pPr>
+      <w:r>
+        <w:rPr>
+          <w:rtl/>
+          <w:lang w:val="en-US"/>
+        </w:rPr>
+        <w:tab/>
+      </w:r>
+      <w:r>
+        <w:rPr>
+          <w:lang w:val="en-US"/>
+        </w:rPr>
+        <w:t>Service</w:t>
+      </w:r>
+      <w:r>
+        <w:rPr>
+          <w:rFonts w:hint="cs"/>
+          <w:rtl/>
+          <w:lang w:val="en-US"/>
+        </w:rPr>
+        <w:t xml:space="preserve"> שאחראי להכניס לקוחות חדשים ל</w:t>
+      </w:r>
+      <w:r>
+        <w:rPr>
+          <w:lang w:val="en-US"/>
+        </w:rPr>
+        <w:t>DB</w:t>
+      </w:r>
+      <w:r>
+        <w:rPr>
+          <w:rFonts w:hint="cs"/>
+          <w:rtl/>
+          <w:lang w:val="en-US"/>
+        </w:rPr>
+        <w:t xml:space="preserve"> ששומר את הלקוחות</w:t>
       </w:r>
     </w:p>
     <w:p>
@@ -2754,7 +3568,6 @@
           <w:b/>
           <w:bCs/>
         </w:rPr>
-        <w:lastRenderedPageBreak/>
         <w:t>6. API</w:t>
       </w:r>
     </w:p>
@@ -3050,6 +3863,7 @@
         <w:rPr>
           <w:rtl/>
         </w:rPr>
+        <w:lastRenderedPageBreak/>
         <w:t>- מהו מנגנון אישור קבלת הודעה ולמה הוא קריטי כדי לוודא שהמידע לא נאבד אם שרת אחד</w:t>
       </w:r>
     </w:p>
@@ -3084,11 +3898,9 @@
       <w:pPr>
         <w:bidi/>
       </w:pPr>
-      <w:proofErr w:type="gramStart"/>
       <w:r>
         <w:t>?BE</w:t>
       </w:r>
-      <w:proofErr w:type="gramEnd"/>
       <w:r>
         <w:rPr>
           <w:rtl/>
@@ -3138,11 +3950,9 @@
       <w:pPr>
         <w:bidi/>
       </w:pPr>
-      <w:proofErr w:type="gramStart"/>
       <w:r>
         <w:t>?API</w:t>
       </w:r>
-      <w:proofErr w:type="gramEnd"/>
       <w:r>
         <w:rPr>
           <w:rtl/>

</xml_diff>

<commit_message>
finished the swagger questions
</commit_message>
<xml_diff>
--- a/hfifa_questions_1.docx
+++ b/hfifa_questions_1.docx
@@ -56,8 +56,13 @@
       <w:pPr>
         <w:bidi/>
       </w:pPr>
-      <w:r>
-        <w:t>[ ] word</w:t>
+      <w:proofErr w:type="gramStart"/>
+      <w:r>
+        <w:t>[ ]</w:t>
+      </w:r>
+      <w:proofErr w:type="gramEnd"/>
+      <w:r>
+        <w:t xml:space="preserve"> word</w:t>
       </w:r>
       <w:r>
         <w:rPr>
@@ -125,9 +130,11 @@
       <w:pPr>
         <w:bidi/>
       </w:pPr>
+      <w:proofErr w:type="gramStart"/>
       <w:r>
         <w:t>?SQL</w:t>
       </w:r>
+      <w:proofErr w:type="gramEnd"/>
       <w:r>
         <w:rPr>
           <w:rtl/>
@@ -1104,9 +1111,11 @@
           <w:rtl/>
         </w:rPr>
       </w:pPr>
+      <w:proofErr w:type="gramStart"/>
       <w:r>
         <w:t>?Redis</w:t>
       </w:r>
+      <w:proofErr w:type="gramEnd"/>
       <w:r>
         <w:rPr>
           <w:rtl/>
@@ -1320,9 +1329,11 @@
           <w:lang w:val="en-US"/>
         </w:rPr>
       </w:pPr>
+      <w:proofErr w:type="gramStart"/>
       <w:r>
         <w:t>?Redis</w:t>
       </w:r>
+      <w:proofErr w:type="gramEnd"/>
       <w:r>
         <w:rPr>
           <w:rtl/>
@@ -1390,7 +1401,25 @@
           <w:rtl/>
           <w:lang w:val="en-US"/>
         </w:rPr>
-        <w:t xml:space="preserve"> או מילים ששומר אלמנטים(בדרך כלל אותיות) בעזרת קידוד</w:t>
+        <w:t xml:space="preserve"> או מילים ששומר </w:t>
+      </w:r>
+      <w:proofErr w:type="gramStart"/>
+      <w:r>
+        <w:rPr>
+          <w:rFonts w:hint="cs"/>
+          <w:rtl/>
+          <w:lang w:val="en-US"/>
+        </w:rPr>
+        <w:t>אלמנטים(</w:t>
+      </w:r>
+      <w:proofErr w:type="gramEnd"/>
+      <w:r>
+        <w:rPr>
+          <w:rFonts w:hint="cs"/>
+          <w:rtl/>
+          <w:lang w:val="en-US"/>
+        </w:rPr>
+        <w:t>בדרך כלל אותיות) בעזרת קידוד</w:t>
       </w:r>
     </w:p>
     <w:p>
@@ -1409,6 +1438,7 @@
         <w:lastRenderedPageBreak/>
         <w:tab/>
       </w:r>
+      <w:proofErr w:type="gramStart"/>
       <w:r>
         <w:rPr>
           <w:lang w:val="en-US"/>
@@ -1421,7 +1451,16 @@
           <w:rtl/>
           <w:lang w:val="en-US"/>
         </w:rPr>
-        <w:t xml:space="preserve"> - מבנה נתונים ששומר סט של אלמנטים ייחודיים</w:t>
+        <w:t xml:space="preserve"> -</w:t>
+      </w:r>
+      <w:proofErr w:type="gramEnd"/>
+      <w:r>
+        <w:rPr>
+          <w:rFonts w:hint="cs"/>
+          <w:rtl/>
+          <w:lang w:val="en-US"/>
+        </w:rPr>
+        <w:t xml:space="preserve"> מבנה נתונים ששומר סט של אלמנטים ייחודיים</w:t>
       </w:r>
     </w:p>
     <w:p>
@@ -1908,13 +1947,32 @@
         <w:bidi/>
       </w:pPr>
       <w:r>
-        <w:t>’topics, partitions, producers, consumers</w:t>
-      </w:r>
-      <w:r>
-        <w:rPr>
-          <w:rtl/>
-        </w:rPr>
-        <w:t xml:space="preserve"> : - הסבר את המושגים הבאים</w:t>
+        <w:t>’</w:t>
+      </w:r>
+      <w:proofErr w:type="gramStart"/>
+      <w:r>
+        <w:t>topics</w:t>
+      </w:r>
+      <w:proofErr w:type="gramEnd"/>
+      <w:r>
+        <w:t xml:space="preserve">, partitions, producers, </w:t>
+      </w:r>
+      <w:proofErr w:type="gramStart"/>
+      <w:r>
+        <w:t>consumers</w:t>
+      </w:r>
+      <w:r>
+        <w:rPr>
+          <w:rtl/>
+        </w:rPr>
+        <w:t xml:space="preserve"> :</w:t>
+      </w:r>
+      <w:proofErr w:type="gramEnd"/>
+      <w:r>
+        <w:rPr>
+          <w:rtl/>
+        </w:rPr>
+        <w:t xml:space="preserve"> - הסבר את המושגים הבאים</w:t>
       </w:r>
     </w:p>
     <w:p>
@@ -2009,6 +2067,7 @@
         </w:rPr>
         <w:tab/>
       </w:r>
+      <w:proofErr w:type="gramStart"/>
       <w:r>
         <w:rPr>
           <w:lang w:val="en-US"/>
@@ -2021,7 +2080,16 @@
           <w:rtl/>
           <w:lang w:val="en-US"/>
         </w:rPr>
-        <w:t xml:space="preserve"> - תוכנה או שירות אשר מפרסמים הודעות אל </w:t>
+        <w:t xml:space="preserve"> -</w:t>
+      </w:r>
+      <w:proofErr w:type="gramEnd"/>
+      <w:r>
+        <w:rPr>
+          <w:rFonts w:hint="cs"/>
+          <w:rtl/>
+          <w:lang w:val="en-US"/>
+        </w:rPr>
+        <w:t xml:space="preserve"> תוכנה או שירות אשר מפרסמים הודעות אל </w:t>
       </w:r>
       <w:r>
         <w:rPr>
@@ -2098,6 +2166,7 @@
         </w:rPr>
         <w:t xml:space="preserve"> תוכנה או שירות אשר קורא הודעות מ</w:t>
       </w:r>
+      <w:proofErr w:type="gramStart"/>
       <w:r>
         <w:rPr>
           <w:lang w:val="en-US"/>
@@ -2110,7 +2179,16 @@
           <w:rtl/>
           <w:lang w:val="en-US"/>
         </w:rPr>
-        <w:t xml:space="preserve"> אחד או יותר</w:t>
+        <w:t xml:space="preserve"> אחד</w:t>
+      </w:r>
+      <w:proofErr w:type="gramEnd"/>
+      <w:r>
+        <w:rPr>
+          <w:rFonts w:hint="cs"/>
+          <w:rtl/>
+          <w:lang w:val="en-US"/>
+        </w:rPr>
+        <w:t xml:space="preserve"> או יותר</w:t>
       </w:r>
     </w:p>
     <w:p>
@@ -2152,6 +2230,7 @@
         </w:rPr>
         <w:t xml:space="preserve"> חלוקות של </w:t>
       </w:r>
+      <w:proofErr w:type="gramStart"/>
       <w:r>
         <w:rPr>
           <w:lang w:val="en-US"/>
@@ -2164,7 +2243,16 @@
           <w:rtl/>
           <w:lang w:val="en-US"/>
         </w:rPr>
-        <w:t xml:space="preserve"> . המידע שנמצא ב</w:t>
+        <w:t xml:space="preserve"> .</w:t>
+      </w:r>
+      <w:proofErr w:type="gramEnd"/>
+      <w:r>
+        <w:rPr>
+          <w:rFonts w:hint="cs"/>
+          <w:rtl/>
+          <w:lang w:val="en-US"/>
+        </w:rPr>
+        <w:t xml:space="preserve"> המידע שנמצא ב</w:t>
       </w:r>
       <w:r>
         <w:rPr>
@@ -2216,9 +2304,11 @@
           <w:rtl/>
         </w:rPr>
       </w:pPr>
+      <w:proofErr w:type="gramStart"/>
       <w:r>
         <w:t>?RabbitMQ</w:t>
       </w:r>
+      <w:proofErr w:type="gramEnd"/>
       <w:r>
         <w:rPr>
           <w:rtl/>
@@ -3357,7 +3447,25 @@
           <w:rtl/>
           <w:lang w:val="en-US"/>
         </w:rPr>
-        <w:t>להרחיב רק את החלקים שצריכים הרחבה במערכת ( למשל הרחבת שטח האחסון רק ל</w:t>
+        <w:t xml:space="preserve">להרחיב רק את החלקים שצריכים הרחבה במערכת </w:t>
+      </w:r>
+      <w:proofErr w:type="gramStart"/>
+      <w:r>
+        <w:rPr>
+          <w:rFonts w:hint="cs"/>
+          <w:rtl/>
+          <w:lang w:val="en-US"/>
+        </w:rPr>
+        <w:t>( למשל</w:t>
+      </w:r>
+      <w:proofErr w:type="gramEnd"/>
+      <w:r>
+        <w:rPr>
+          <w:rFonts w:hint="cs"/>
+          <w:rtl/>
+          <w:lang w:val="en-US"/>
+        </w:rPr>
+        <w:t xml:space="preserve"> הרחבת שטח האחסון רק ל</w:t>
       </w:r>
       <w:r>
         <w:rPr>
@@ -3389,8 +3497,18 @@
           <w:rtl/>
           <w:lang w:val="en-US"/>
         </w:rPr>
-        <w:t xml:space="preserve"> במערכת )</w:t>
-      </w:r>
+        <w:t xml:space="preserve"> </w:t>
+      </w:r>
+      <w:proofErr w:type="gramStart"/>
+      <w:r>
+        <w:rPr>
+          <w:rFonts w:hint="cs"/>
+          <w:rtl/>
+          <w:lang w:val="en-US"/>
+        </w:rPr>
+        <w:t>במערכת )</w:t>
+      </w:r>
+      <w:proofErr w:type="gramEnd"/>
     </w:p>
     <w:p>
       <w:pPr>
@@ -3574,6 +3692,9 @@
     <w:p>
       <w:pPr>
         <w:bidi/>
+        <w:rPr>
+          <w:rtl/>
+        </w:rPr>
       </w:pPr>
       <w:r>
         <w:rPr>
@@ -3588,12 +3709,384 @@
         <w:rPr>
           <w:rtl/>
         </w:rPr>
-        <w:t xml:space="preserve"> - מהו</w:t>
-      </w:r>
-    </w:p>
-    <w:p>
-      <w:pPr>
-        <w:bidi/>
+        <w:t xml:space="preserve"> </w:t>
+      </w:r>
+      <w:r>
+        <w:rPr>
+          <w:rtl/>
+        </w:rPr>
+        <w:t>–</w:t>
+      </w:r>
+      <w:r>
+        <w:rPr>
+          <w:rtl/>
+        </w:rPr>
+        <w:t xml:space="preserve"> מהו</w:t>
+      </w:r>
+    </w:p>
+    <w:p>
+      <w:pPr>
+        <w:bidi/>
+        <w:rPr>
+          <w:rtl/>
+          <w:lang w:val="en-US"/>
+        </w:rPr>
+      </w:pPr>
+      <w:r>
+        <w:rPr>
+          <w:rtl/>
+        </w:rPr>
+        <w:tab/>
+      </w:r>
+      <w:r>
+        <w:rPr>
+          <w:lang w:val="en-US"/>
+        </w:rPr>
+        <w:t>Rest API</w:t>
+      </w:r>
+      <w:r>
+        <w:rPr>
+          <w:rFonts w:hint="cs"/>
+          <w:rtl/>
+          <w:lang w:val="en-US"/>
+        </w:rPr>
+        <w:t xml:space="preserve"> הוא ממשק אשר מאפשר לתקשר עם תוכנות ואשר מעוצב על פי ארכיטקטורת </w:t>
+      </w:r>
+      <w:r>
+        <w:rPr>
+          <w:lang w:val="en-US"/>
+        </w:rPr>
+        <w:t>REST</w:t>
+      </w:r>
+    </w:p>
+    <w:p>
+      <w:pPr>
+        <w:bidi/>
+        <w:rPr>
+          <w:rtl/>
+          <w:lang w:val="en-US"/>
+        </w:rPr>
+      </w:pPr>
+      <w:r>
+        <w:rPr>
+          <w:rtl/>
+          <w:lang w:val="en-US"/>
+        </w:rPr>
+        <w:tab/>
+      </w:r>
+      <w:r>
+        <w:rPr>
+          <w:rFonts w:hint="cs"/>
+          <w:rtl/>
+          <w:lang w:val="en-US"/>
+        </w:rPr>
+        <w:t>העקרונות שלו הם:</w:t>
+      </w:r>
+    </w:p>
+    <w:p>
+      <w:pPr>
+        <w:bidi/>
+        <w:ind w:left="720"/>
+        <w:rPr>
+          <w:rFonts w:hint="cs"/>
+          <w:rtl/>
+          <w:lang w:val="en-US"/>
+        </w:rPr>
+      </w:pPr>
+      <w:r>
+        <w:rPr>
+          <w:rFonts w:hint="cs"/>
+          <w:rtl/>
+          <w:lang w:val="en-US"/>
+        </w:rPr>
+        <w:t xml:space="preserve">ארכיטקטורת שרת-לקוח </w:t>
+      </w:r>
+      <w:r>
+        <w:rPr>
+          <w:rtl/>
+          <w:lang w:val="en-US"/>
+        </w:rPr>
+        <w:t>–</w:t>
+      </w:r>
+      <w:r>
+        <w:rPr>
+          <w:rFonts w:hint="cs"/>
+          <w:rtl/>
+          <w:lang w:val="en-US"/>
+        </w:rPr>
+        <w:t xml:space="preserve"> קיימת הפרדה בין הלקוח אשר מבקש משאבים לבין השרת אשר מספק משאבים, כל אחד מהם לא צריך להיות מודע </w:t>
+      </w:r>
+      <w:proofErr w:type="spellStart"/>
+      <w:r>
+        <w:rPr>
+          <w:rFonts w:hint="cs"/>
+          <w:rtl/>
+          <w:lang w:val="en-US"/>
+        </w:rPr>
+        <w:t>לאיך</w:t>
+      </w:r>
+      <w:proofErr w:type="spellEnd"/>
+      <w:r>
+        <w:rPr>
+          <w:rFonts w:hint="cs"/>
+          <w:rtl/>
+          <w:lang w:val="en-US"/>
+        </w:rPr>
+        <w:t xml:space="preserve"> השני בנוי, ואת שניהם אפשר לפתח בנפרד</w:t>
+      </w:r>
+    </w:p>
+    <w:p>
+      <w:pPr>
+        <w:bidi/>
+        <w:rPr>
+          <w:rtl/>
+          <w:lang w:val="en-US"/>
+        </w:rPr>
+      </w:pPr>
+      <w:r>
+        <w:rPr>
+          <w:rtl/>
+          <w:lang w:val="en-US"/>
+        </w:rPr>
+        <w:tab/>
+      </w:r>
+      <w:r>
+        <w:rPr>
+          <w:lang w:val="en-US"/>
+        </w:rPr>
+        <w:t>Stateless</w:t>
+      </w:r>
+      <w:r>
+        <w:rPr>
+          <w:rFonts w:hint="cs"/>
+          <w:rtl/>
+          <w:lang w:val="en-US"/>
+        </w:rPr>
+        <w:t xml:space="preserve"> </w:t>
+      </w:r>
+      <w:r>
+        <w:rPr>
+          <w:rtl/>
+          <w:lang w:val="en-US"/>
+        </w:rPr>
+        <w:t>–</w:t>
+      </w:r>
+      <w:r>
+        <w:rPr>
+          <w:rFonts w:hint="cs"/>
+          <w:rtl/>
+          <w:lang w:val="en-US"/>
+        </w:rPr>
+        <w:t xml:space="preserve"> ממשק ה</w:t>
+      </w:r>
+      <w:r>
+        <w:rPr>
+          <w:lang w:val="en-US"/>
+        </w:rPr>
+        <w:t>API</w:t>
+      </w:r>
+      <w:r>
+        <w:rPr>
+          <w:rFonts w:hint="cs"/>
+          <w:rtl/>
+          <w:lang w:val="en-US"/>
+        </w:rPr>
+        <w:t xml:space="preserve"> לא מודע להיסטוריית הבקשות וכל בקשה עומדת בפני עצמה</w:t>
+      </w:r>
+    </w:p>
+    <w:p>
+      <w:pPr>
+        <w:bidi/>
+        <w:rPr>
+          <w:rtl/>
+          <w:lang w:val="en-US"/>
+        </w:rPr>
+      </w:pPr>
+      <w:r>
+        <w:rPr>
+          <w:rtl/>
+          <w:lang w:val="en-US"/>
+        </w:rPr>
+        <w:tab/>
+      </w:r>
+      <w:proofErr w:type="spellStart"/>
+      <w:r>
+        <w:rPr>
+          <w:lang w:val="en-US"/>
+        </w:rPr>
+        <w:t>Cacheability</w:t>
+      </w:r>
+      <w:proofErr w:type="spellEnd"/>
+      <w:r>
+        <w:rPr>
+          <w:rFonts w:hint="cs"/>
+          <w:rtl/>
+          <w:lang w:val="en-US"/>
+        </w:rPr>
+        <w:t xml:space="preserve"> </w:t>
+      </w:r>
+      <w:r>
+        <w:rPr>
+          <w:rtl/>
+          <w:lang w:val="en-US"/>
+        </w:rPr>
+        <w:t>–</w:t>
+      </w:r>
+      <w:r>
+        <w:rPr>
+          <w:rFonts w:hint="cs"/>
+          <w:rtl/>
+          <w:lang w:val="en-US"/>
+        </w:rPr>
+        <w:t xml:space="preserve"> הלקוח צריך להיות מסוגל תשובות מהשרת כאשר זה נחוץ.</w:t>
+      </w:r>
+    </w:p>
+    <w:p>
+      <w:pPr>
+        <w:bidi/>
+        <w:rPr>
+          <w:rtl/>
+          <w:lang w:val="en-US"/>
+        </w:rPr>
+      </w:pPr>
+      <w:r>
+        <w:rPr>
+          <w:rtl/>
+          <w:lang w:val="en-US"/>
+        </w:rPr>
+        <w:tab/>
+      </w:r>
+      <w:r>
+        <w:rPr>
+          <w:lang w:val="en-US"/>
+        </w:rPr>
+        <w:t>Uniform Interface</w:t>
+      </w:r>
+      <w:r>
+        <w:rPr>
+          <w:rFonts w:hint="cs"/>
+          <w:rtl/>
+          <w:lang w:val="en-US"/>
+        </w:rPr>
+        <w:t xml:space="preserve"> </w:t>
+      </w:r>
+      <w:proofErr w:type="gramStart"/>
+      <w:r>
+        <w:rPr>
+          <w:rtl/>
+          <w:lang w:val="en-US"/>
+        </w:rPr>
+        <w:t>–</w:t>
+      </w:r>
+      <w:r>
+        <w:rPr>
+          <w:lang w:val="en-US"/>
+        </w:rPr>
+        <w:t xml:space="preserve"> </w:t>
+      </w:r>
+      <w:r>
+        <w:rPr>
+          <w:rFonts w:hint="cs"/>
+          <w:rtl/>
+          <w:lang w:val="en-US"/>
+        </w:rPr>
+        <w:t xml:space="preserve"> עקרון</w:t>
+      </w:r>
+      <w:proofErr w:type="gramEnd"/>
+      <w:r>
+        <w:rPr>
+          <w:rFonts w:hint="cs"/>
+          <w:rtl/>
+          <w:lang w:val="en-US"/>
+        </w:rPr>
+        <w:t xml:space="preserve"> אשר מבטיח </w:t>
+      </w:r>
+      <w:r>
+        <w:rPr>
+          <w:lang w:val="en-US"/>
+        </w:rPr>
+        <w:t>decoupling</w:t>
+      </w:r>
+      <w:r>
+        <w:rPr>
+          <w:rFonts w:hint="cs"/>
+          <w:rtl/>
+          <w:lang w:val="en-US"/>
+        </w:rPr>
+        <w:t xml:space="preserve"> בין השרת ללקוח ומבטיח שיהיה אפשר </w:t>
+      </w:r>
+    </w:p>
+    <w:p>
+      <w:pPr>
+        <w:bidi/>
+        <w:rPr>
+          <w:rFonts w:hint="cs"/>
+          <w:rtl/>
+          <w:lang w:val="en-US"/>
+        </w:rPr>
+      </w:pPr>
+      <w:r>
+        <w:rPr>
+          <w:rtl/>
+          <w:lang w:val="en-US"/>
+        </w:rPr>
+        <w:tab/>
+      </w:r>
+      <w:r>
+        <w:rPr>
+          <w:rFonts w:hint="cs"/>
+          <w:rtl/>
+          <w:lang w:val="en-US"/>
+        </w:rPr>
+        <w:t>לפתח כל אחד מהם בצורה עצמאית</w:t>
+      </w:r>
+    </w:p>
+    <w:p>
+      <w:pPr>
+        <w:bidi/>
+        <w:ind w:left="720"/>
+        <w:rPr>
+          <w:rFonts w:hint="cs"/>
+          <w:rtl/>
+          <w:lang w:val="en-US"/>
+        </w:rPr>
+      </w:pPr>
+      <w:r>
+        <w:rPr>
+          <w:lang w:val="en-US"/>
+        </w:rPr>
+        <w:t>Layered System</w:t>
+      </w:r>
+      <w:r>
+        <w:rPr>
+          <w:rFonts w:hint="cs"/>
+          <w:rtl/>
+          <w:lang w:val="en-US"/>
+        </w:rPr>
+        <w:t xml:space="preserve"> </w:t>
+      </w:r>
+      <w:r>
+        <w:rPr>
+          <w:rtl/>
+          <w:lang w:val="en-US"/>
+        </w:rPr>
+        <w:t>–</w:t>
+      </w:r>
+      <w:r>
+        <w:rPr>
+          <w:rFonts w:hint="cs"/>
+          <w:rtl/>
+          <w:lang w:val="en-US"/>
+        </w:rPr>
+        <w:t xml:space="preserve"> הארכיטקטורה יכולה להיות בנוי משכבות בצורת היררכיה כך שכל שכבה מספקת שירותים לשכבה מעליה וצורכת שירותים מהשכבה מתחתיה, ולקוחות לא יכולים לדעת אם הם מחוברים ישירות לשרת הקצה או לשירות ביניים</w:t>
+      </w:r>
+    </w:p>
+    <w:p>
+      <w:pPr>
+        <w:bidi/>
+        <w:rPr>
+          <w:rtl/>
+        </w:rPr>
       </w:pPr>
       <w:r>
         <w:rPr>
@@ -3614,6 +4107,189 @@
     <w:p>
       <w:pPr>
         <w:bidi/>
+        <w:ind w:firstLine="720"/>
+        <w:rPr>
+          <w:rtl/>
+          <w:lang w:val="en-US"/>
+        </w:rPr>
+      </w:pPr>
+      <w:r>
+        <w:rPr>
+          <w:lang w:val="en-US"/>
+        </w:rPr>
+        <w:t>Get</w:t>
+      </w:r>
+      <w:r>
+        <w:rPr>
+          <w:rFonts w:hint="cs"/>
+          <w:rtl/>
+          <w:lang w:val="en-US"/>
+        </w:rPr>
+        <w:t xml:space="preserve"> </w:t>
+      </w:r>
+      <w:r>
+        <w:rPr>
+          <w:rtl/>
+          <w:lang w:val="en-US"/>
+        </w:rPr>
+        <w:t>–</w:t>
+      </w:r>
+      <w:r>
+        <w:rPr>
+          <w:rFonts w:hint="cs"/>
+          <w:rtl/>
+          <w:lang w:val="en-US"/>
+        </w:rPr>
+        <w:t xml:space="preserve"> בקשה להחזיר מידע מהשרת</w:t>
+      </w:r>
+    </w:p>
+    <w:p>
+      <w:pPr>
+        <w:bidi/>
+        <w:ind w:firstLine="720"/>
+        <w:rPr>
+          <w:rtl/>
+          <w:lang w:val="en-US"/>
+        </w:rPr>
+      </w:pPr>
+      <w:r>
+        <w:rPr>
+          <w:lang w:val="en-US"/>
+        </w:rPr>
+        <w:t>Post</w:t>
+      </w:r>
+      <w:r>
+        <w:rPr>
+          <w:rFonts w:hint="cs"/>
+          <w:rtl/>
+          <w:lang w:val="en-US"/>
+        </w:rPr>
+        <w:t xml:space="preserve"> </w:t>
+      </w:r>
+      <w:r>
+        <w:rPr>
+          <w:rtl/>
+          <w:lang w:val="en-US"/>
+        </w:rPr>
+        <w:t>–</w:t>
+      </w:r>
+      <w:r>
+        <w:rPr>
+          <w:rFonts w:hint="cs"/>
+          <w:rtl/>
+          <w:lang w:val="en-US"/>
+        </w:rPr>
+        <w:t xml:space="preserve"> בקשה ליצור מידע חדש ולפרסם אותו לשרת</w:t>
+      </w:r>
+    </w:p>
+    <w:p>
+      <w:pPr>
+        <w:tabs>
+          <w:tab w:val="left" w:pos="5774"/>
+        </w:tabs>
+        <w:bidi/>
+        <w:ind w:firstLine="720"/>
+        <w:rPr>
+          <w:rtl/>
+          <w:lang w:val="en-US"/>
+        </w:rPr>
+      </w:pPr>
+      <w:r>
+        <w:rPr>
+          <w:lang w:val="en-US"/>
+        </w:rPr>
+        <w:t>Put</w:t>
+      </w:r>
+      <w:r>
+        <w:rPr>
+          <w:rFonts w:hint="cs"/>
+          <w:rtl/>
+          <w:lang w:val="en-US"/>
+        </w:rPr>
+        <w:t xml:space="preserve"> </w:t>
+      </w:r>
+      <w:r>
+        <w:rPr>
+          <w:rtl/>
+          <w:lang w:val="en-US"/>
+        </w:rPr>
+        <w:t>–</w:t>
+      </w:r>
+      <w:r>
+        <w:rPr>
+          <w:rFonts w:hint="cs"/>
+          <w:rtl/>
+          <w:lang w:val="en-US"/>
+        </w:rPr>
+        <w:t xml:space="preserve"> בקשה לשנות מידע קיים או להחליף אותו לגמרי</w:t>
+      </w:r>
+    </w:p>
+    <w:p>
+      <w:pPr>
+        <w:tabs>
+          <w:tab w:val="left" w:pos="5774"/>
+        </w:tabs>
+        <w:bidi/>
+        <w:ind w:firstLine="720"/>
+        <w:rPr>
+          <w:rtl/>
+          <w:lang w:val="en-US"/>
+        </w:rPr>
+      </w:pPr>
+      <w:proofErr w:type="gramStart"/>
+      <w:r>
+        <w:rPr>
+          <w:lang w:val="en-US"/>
+        </w:rPr>
+        <w:lastRenderedPageBreak/>
+        <w:t xml:space="preserve">Delete </w:t>
+      </w:r>
+      <w:r>
+        <w:rPr>
+          <w:rFonts w:hint="cs"/>
+          <w:rtl/>
+          <w:lang w:val="en-US"/>
+        </w:rPr>
+        <w:t xml:space="preserve"> -</w:t>
+      </w:r>
+      <w:proofErr w:type="gramEnd"/>
+      <w:r>
+        <w:rPr>
+          <w:rFonts w:hint="cs"/>
+          <w:rtl/>
+          <w:lang w:val="en-US"/>
+        </w:rPr>
+        <w:t xml:space="preserve"> בקשה למחוק מידע מהשרת</w:t>
+      </w:r>
+    </w:p>
+    <w:p>
+      <w:pPr>
+        <w:tabs>
+          <w:tab w:val="left" w:pos="5774"/>
+        </w:tabs>
+        <w:bidi/>
+        <w:ind w:firstLine="720"/>
+        <w:rPr>
+          <w:rFonts w:hint="cs"/>
+          <w:rtl/>
+          <w:lang w:val="en-US"/>
+        </w:rPr>
+      </w:pPr>
+    </w:p>
+    <w:p>
+      <w:pPr>
+        <w:bidi/>
+        <w:ind w:firstLine="720"/>
+        <w:rPr>
+          <w:rFonts w:hint="cs"/>
+          <w:rtl/>
+          <w:lang w:val="en-US"/>
+        </w:rPr>
+      </w:pPr>
+    </w:p>
+    <w:p>
+      <w:pPr>
+        <w:bidi/>
       </w:pPr>
       <w:r>
         <w:rPr>
@@ -3634,6 +4310,9 @@
     <w:p>
       <w:pPr>
         <w:bidi/>
+        <w:rPr>
+          <w:rtl/>
+        </w:rPr>
       </w:pPr>
       <w:r>
         <w:rPr>
@@ -3645,6 +4324,54 @@
     <w:p>
       <w:pPr>
         <w:bidi/>
+        <w:ind w:left="720"/>
+      </w:pPr>
+      <w:r>
+        <w:rPr>
+          <w:rFonts w:hint="cs"/>
+          <w:rtl/>
+        </w:rPr>
+        <w:t>הם קודים שמצורפים לתשובות מהשרת והם נותנים מידע בנוגע לסטטוס הבקשה שנשלחה לשרת (למשל קוד 404 אומר שהמשאב לא נמצא).</w:t>
+      </w:r>
+      <w:r>
+        <w:rPr>
+          <w:rFonts w:hint="cs"/>
+          <w:rtl/>
+          <w:lang w:val="en-US"/>
+        </w:rPr>
+        <w:t xml:space="preserve"> דוגמה לספריה שאפשר להשתמש בה ב</w:t>
+      </w:r>
+      <w:r>
+        <w:rPr>
+          <w:lang w:val="en-US"/>
+        </w:rPr>
+        <w:t>JS</w:t>
+      </w:r>
+      <w:r>
+        <w:rPr>
+          <w:rFonts w:hint="cs"/>
+          <w:rtl/>
+          <w:lang w:val="en-US"/>
+        </w:rPr>
+        <w:t xml:space="preserve"> היא </w:t>
+      </w:r>
+      <w:r>
+        <w:t>http-status-codes</w:t>
+      </w:r>
+    </w:p>
+    <w:p>
+      <w:pPr>
+        <w:bidi/>
+        <w:ind w:left="720"/>
+        <w:rPr>
+          <w:rFonts w:hint="cs"/>
+          <w:rtl/>
+        </w:rPr>
+      </w:pPr>
+    </w:p>
+    <w:p>
+      <w:pPr>
+        <w:bidi/>
       </w:pPr>
       <w:r>
         <w:rPr>
@@ -3652,6 +4379,31 @@
         </w:rPr>
         <w:t>- מה ההבדל בין בקשות סינכרוניות לאסינכרוניות</w:t>
       </w:r>
+    </w:p>
+    <w:p>
+      <w:pPr>
+        <w:bidi/>
+        <w:ind w:left="720"/>
+        <w:rPr>
+          <w:rFonts w:hint="cs"/>
+          <w:lang w:val="en-US"/>
+        </w:rPr>
+      </w:pPr>
+      <w:r>
+        <w:rPr>
+          <w:rFonts w:hint="cs"/>
+          <w:rtl/>
+        </w:rPr>
+        <w:t>בקשות סינכרוניות הן בקשות שחוסמות בקשות אחרות עד שהשרת יסיים לטפל בהן, ובדרך כלל מצפות לקבל מידע מהשרת באופן מידי, ולעומת זאת בקשות אסינכרוניות לא חוסמות שום דבר ובדרך כלל יצפו לקבל הכרה מהשרת (קוד 202 )</w:t>
+      </w:r>
+    </w:p>
+    <w:p>
+      <w:pPr>
+        <w:bidi/>
+        <w:rPr>
+          <w:lang w:val="en-US"/>
+        </w:rPr>
+      </w:pPr>
     </w:p>
     <w:p>
       <w:pPr>
@@ -3686,6 +4438,79 @@
     <w:p>
       <w:pPr>
         <w:bidi/>
+        <w:rPr>
+          <w:rFonts w:hint="cs"/>
+          <w:rtl/>
+          <w:lang w:val="en-US"/>
+        </w:rPr>
+      </w:pPr>
+      <w:r>
+        <w:tab/>
+      </w:r>
+      <w:r>
+        <w:rPr>
+          <w:rFonts w:hint="cs"/>
+          <w:rtl/>
+        </w:rPr>
+        <w:t>המט</w:t>
+      </w:r>
+      <w:r>
+        <w:rPr>
+          <w:rFonts w:hint="cs"/>
+          <w:rtl/>
+        </w:rPr>
+        <w:t>ר</w:t>
+      </w:r>
+      <w:r>
+        <w:rPr>
+          <w:rFonts w:hint="cs"/>
+          <w:rtl/>
+        </w:rPr>
+        <w:t xml:space="preserve">ה של </w:t>
+      </w:r>
+      <w:r>
+        <w:rPr>
+          <w:lang w:val="en-US"/>
+        </w:rPr>
+        <w:t>swagger</w:t>
+      </w:r>
+      <w:r>
+        <w:rPr>
+          <w:rFonts w:hint="cs"/>
+          <w:rtl/>
+          <w:lang w:val="en-US"/>
+        </w:rPr>
+        <w:t xml:space="preserve"> היא ל</w:t>
+      </w:r>
+      <w:r>
+        <w:rPr>
+          <w:rFonts w:hint="cs"/>
+          <w:rtl/>
+          <w:lang w:val="en-US"/>
+        </w:rPr>
+        <w:t>אפשר למפתח לייצר דוקומנטציה של ה</w:t>
+      </w:r>
+      <w:r>
+        <w:rPr>
+          <w:lang w:val="en-US"/>
+        </w:rPr>
+        <w:t>API</w:t>
+      </w:r>
+      <w:r>
+        <w:rPr>
+          <w:rFonts w:hint="cs"/>
+          <w:rtl/>
+          <w:lang w:val="en-US"/>
+        </w:rPr>
+        <w:t xml:space="preserve"> שלו</w:t>
+      </w:r>
+    </w:p>
+    <w:p>
+      <w:pPr>
+        <w:bidi/>
+        <w:rPr>
+          <w:rtl/>
+        </w:rPr>
       </w:pPr>
       <w:r>
         <w:rPr>
@@ -3718,12 +4543,207 @@
         <w:rPr>
           <w:rtl/>
         </w:rPr>
-        <w:t xml:space="preserve"> - כיצד</w:t>
-      </w:r>
-    </w:p>
-    <w:p>
-      <w:pPr>
-        <w:bidi/>
+        <w:t xml:space="preserve"> </w:t>
+      </w:r>
+      <w:r>
+        <w:rPr>
+          <w:rtl/>
+        </w:rPr>
+        <w:t>–</w:t>
+      </w:r>
+      <w:r>
+        <w:rPr>
+          <w:rtl/>
+        </w:rPr>
+        <w:t xml:space="preserve"> כיצד</w:t>
+      </w:r>
+    </w:p>
+    <w:p>
+      <w:pPr>
+        <w:bidi/>
+        <w:rPr>
+          <w:rtl/>
+          <w:lang w:val="en-US"/>
+        </w:rPr>
+      </w:pPr>
+      <w:r>
+        <w:rPr>
+          <w:lang w:val="en-US"/>
+        </w:rPr>
+        <w:tab/>
+        <w:t>Swagger</w:t>
+      </w:r>
+      <w:r>
+        <w:rPr>
+          <w:rFonts w:hint="cs"/>
+          <w:rtl/>
+          <w:lang w:val="en-US"/>
+        </w:rPr>
+        <w:t xml:space="preserve"> מקל על עבודת ה</w:t>
+      </w:r>
+      <w:r>
+        <w:rPr>
+          <w:lang w:val="en-US"/>
+        </w:rPr>
+        <w:t>FE</w:t>
+      </w:r>
+      <w:r>
+        <w:rPr>
+          <w:rFonts w:hint="cs"/>
+          <w:rtl/>
+          <w:lang w:val="en-US"/>
+        </w:rPr>
+        <w:t xml:space="preserve"> וצרכני </w:t>
+      </w:r>
+      <w:r>
+        <w:rPr>
+          <w:lang w:val="en-US"/>
+        </w:rPr>
+        <w:t>API</w:t>
+      </w:r>
+      <w:r>
+        <w:rPr>
+          <w:rFonts w:hint="cs"/>
+          <w:rtl/>
+          <w:lang w:val="en-US"/>
+        </w:rPr>
+        <w:t xml:space="preserve"> אחרים בכך שהוא מספק להם דרך לנסות בקשות שונות </w:t>
+      </w:r>
+    </w:p>
+    <w:p>
+      <w:pPr>
+        <w:bidi/>
+        <w:ind w:left="720"/>
+        <w:rPr>
+          <w:rFonts w:hint="cs"/>
+          <w:lang w:val="en-US"/>
+        </w:rPr>
+      </w:pPr>
+      <w:r>
+        <w:rPr>
+          <w:rFonts w:hint="cs"/>
+          <w:rtl/>
+          <w:lang w:val="en-US"/>
+        </w:rPr>
+        <w:t>ל</w:t>
+      </w:r>
+      <w:r>
+        <w:rPr>
+          <w:lang w:val="en-US"/>
+        </w:rPr>
+        <w:t>API</w:t>
+      </w:r>
+      <w:r>
+        <w:rPr>
+          <w:rFonts w:hint="cs"/>
+          <w:rtl/>
+          <w:lang w:val="en-US"/>
+        </w:rPr>
+        <w:t xml:space="preserve"> ולראות את מבנה התשובות וכך הם יכולים פשוט להעתיק את מבנה הבקשות שהם צריכים לרכיבים שהם מפתחים</w:t>
+      </w:r>
+      <w:r>
+        <w:rPr>
+          <w:lang w:val="en-US"/>
+        </w:rPr>
+        <w:t>.</w:t>
+      </w:r>
+      <w:r>
+        <w:rPr>
+          <w:rFonts w:hint="cs"/>
+          <w:rtl/>
+          <w:lang w:val="en-US"/>
+        </w:rPr>
+        <w:t xml:space="preserve"> בנוסף, בעזרת </w:t>
+      </w:r>
+      <w:r>
+        <w:rPr>
+          <w:lang w:val="en-US"/>
+        </w:rPr>
+        <w:t xml:space="preserve">swagger </w:t>
+      </w:r>
+      <w:proofErr w:type="spellStart"/>
+      <w:r>
+        <w:rPr>
+          <w:lang w:val="en-US"/>
+        </w:rPr>
+        <w:t>codgen</w:t>
+      </w:r>
+      <w:proofErr w:type="spellEnd"/>
+      <w:r>
+        <w:rPr>
+          <w:rFonts w:hint="cs"/>
+          <w:rtl/>
+          <w:lang w:val="en-US"/>
+        </w:rPr>
+        <w:t xml:space="preserve"> ניתן </w:t>
+      </w:r>
+      <w:proofErr w:type="spellStart"/>
+      <w:r>
+        <w:rPr>
+          <w:rFonts w:hint="cs"/>
+          <w:rtl/>
+          <w:lang w:val="en-US"/>
+        </w:rPr>
+        <w:t>לג'נרט</w:t>
+      </w:r>
+      <w:proofErr w:type="spellEnd"/>
+      <w:r>
+        <w:rPr>
+          <w:rFonts w:hint="cs"/>
+          <w:rtl/>
+          <w:lang w:val="en-US"/>
+        </w:rPr>
+        <w:t xml:space="preserve"> </w:t>
+      </w:r>
+      <w:r>
+        <w:rPr>
+          <w:lang w:val="en-US"/>
+        </w:rPr>
+        <w:t xml:space="preserve">client </w:t>
+      </w:r>
+      <w:proofErr w:type="spellStart"/>
+      <w:r>
+        <w:rPr>
+          <w:lang w:val="en-US"/>
+        </w:rPr>
+        <w:t>sdk</w:t>
+      </w:r>
+      <w:proofErr w:type="spellEnd"/>
+      <w:r>
+        <w:rPr>
+          <w:rFonts w:hint="cs"/>
+          <w:rtl/>
+          <w:lang w:val="en-US"/>
+        </w:rPr>
+        <w:t xml:space="preserve"> ל</w:t>
+      </w:r>
+      <w:r>
+        <w:rPr>
+          <w:lang w:val="en-US"/>
+        </w:rPr>
+        <w:t>API</w:t>
+      </w:r>
+      <w:r>
+        <w:rPr>
+          <w:rFonts w:hint="cs"/>
+          <w:rtl/>
+          <w:lang w:val="en-US"/>
+        </w:rPr>
+        <w:t xml:space="preserve"> בצורה אוטומטית.</w:t>
+      </w:r>
+      <w:r>
+        <w:rPr>
+          <w:lang w:val="en-US"/>
+        </w:rPr>
+        <w:t xml:space="preserve"> </w:t>
+      </w:r>
+    </w:p>
+    <w:p>
+      <w:pPr>
+        <w:bidi/>
+        <w:rPr>
+          <w:rtl/>
+        </w:rPr>
       </w:pPr>
       <w:r>
         <w:rPr>
@@ -3738,8 +4758,66 @@
         <w:rPr>
           <w:rtl/>
         </w:rPr>
-        <w:t xml:space="preserve"> - האם</w:t>
-      </w:r>
+        <w:t xml:space="preserve"> </w:t>
+      </w:r>
+      <w:r>
+        <w:rPr>
+          <w:rtl/>
+        </w:rPr>
+        <w:t>–</w:t>
+      </w:r>
+      <w:r>
+        <w:rPr>
+          <w:rtl/>
+        </w:rPr>
+        <w:t xml:space="preserve"> האם</w:t>
+      </w:r>
+    </w:p>
+    <w:p>
+      <w:pPr>
+        <w:bidi/>
+        <w:rPr>
+          <w:rFonts w:hint="cs"/>
+          <w:rtl/>
+          <w:lang w:val="en-US"/>
+        </w:rPr>
+      </w:pPr>
+      <w:r>
+        <w:rPr>
+          <w:rtl/>
+        </w:rPr>
+        <w:tab/>
+      </w:r>
+      <w:r>
+        <w:rPr>
+          <w:rFonts w:hint="cs"/>
+          <w:rtl/>
+          <w:lang w:val="en-US"/>
+        </w:rPr>
+        <w:t>שימוש נוסף ל</w:t>
+      </w:r>
+      <w:r>
+        <w:rPr>
+          <w:lang w:val="en-US"/>
+        </w:rPr>
+        <w:t>swagger</w:t>
+      </w:r>
+      <w:r>
+        <w:rPr>
+          <w:rFonts w:hint="cs"/>
+          <w:rtl/>
+          <w:lang w:val="en-US"/>
+        </w:rPr>
+        <w:t xml:space="preserve"> הוא בדיקה וולידציה של ה</w:t>
+      </w:r>
+      <w:proofErr w:type="spellStart"/>
+      <w:r>
+        <w:rPr>
+          <w:lang w:val="en-US"/>
+        </w:rPr>
+        <w:t>api</w:t>
+      </w:r>
+      <w:proofErr w:type="spellEnd"/>
     </w:p>
     <w:p>
       <w:pPr>
@@ -3863,7 +4941,6 @@
         <w:rPr>
           <w:rtl/>
         </w:rPr>
-        <w:lastRenderedPageBreak/>
         <w:t>- מהו מנגנון אישור קבלת הודעה ולמה הוא קריטי כדי לוודא שהמידע לא נאבד אם שרת אחד</w:t>
       </w:r>
     </w:p>
@@ -3898,9 +4975,11 @@
       <w:pPr>
         <w:bidi/>
       </w:pPr>
+      <w:proofErr w:type="gramStart"/>
       <w:r>
         <w:t>?BE</w:t>
       </w:r>
+      <w:proofErr w:type="gramEnd"/>
       <w:r>
         <w:rPr>
           <w:rtl/>
@@ -3950,9 +5029,11 @@
       <w:pPr>
         <w:bidi/>
       </w:pPr>
+      <w:proofErr w:type="gramStart"/>
       <w:r>
         <w:t>?API</w:t>
       </w:r>
+      <w:proofErr w:type="gramEnd"/>
       <w:r>
         <w:rPr>
           <w:rtl/>
@@ -4503,7 +5584,6 @@
   <w:style w:type="character" w:default="1" w:styleId="a0">
     <w:name w:val="Default Paragraph Font"/>
     <w:uiPriority w:val="1"/>
-    <w:semiHidden/>
     <w:unhideWhenUsed/>
   </w:style>
   <w:style w:type="table" w:default="1" w:styleId="a1">
@@ -4569,6 +5649,36 @@
       <w:color w:val="666666"/>
       <w:sz w:val="30"/>
       <w:szCs w:val="30"/>
+    </w:rPr>
+  </w:style>
+  <w:style w:type="paragraph" w:styleId="HTML">
+    <w:name w:val="HTML Preformatted"/>
+    <w:basedOn w:val="a"/>
+    <w:link w:val="HTML0"/>
+    <w:uiPriority w:val="99"/>
+    <w:semiHidden/>
+    <w:unhideWhenUsed/>
+    <w:rsid w:val="00364044"/>
+    <w:pPr>
+      <w:spacing w:line="240" w:lineRule="auto"/>
+    </w:pPr>
+    <w:rPr>
+      <w:rFonts w:ascii="Consolas" w:hAnsi="Consolas"/>
+      <w:sz w:val="20"/>
+      <w:szCs w:val="20"/>
+    </w:rPr>
+  </w:style>
+  <w:style w:type="character" w:customStyle="1" w:styleId="HTML0">
+    <w:name w:val="HTML מעוצב מראש תו"/>
+    <w:basedOn w:val="a0"/>
+    <w:link w:val="HTML"/>
+    <w:uiPriority w:val="99"/>
+    <w:semiHidden/>
+    <w:rsid w:val="00364044"/>
+    <w:rPr>
+      <w:rFonts w:ascii="Consolas" w:hAnsi="Consolas"/>
+      <w:sz w:val="20"/>
+      <w:szCs w:val="20"/>
     </w:rPr>
   </w:style>
 </w:styles>

</xml_diff>

<commit_message>
finished the grafana questions
</commit_message>
<xml_diff>
--- a/hfifa_questions_1.docx
+++ b/hfifa_questions_1.docx
@@ -56,13 +56,8 @@
       <w:pPr>
         <w:bidi/>
       </w:pPr>
-      <w:proofErr w:type="gramStart"/>
-      <w:r>
-        <w:t>[ ]</w:t>
-      </w:r>
-      <w:proofErr w:type="gramEnd"/>
-      <w:r>
-        <w:t xml:space="preserve"> word</w:t>
+      <w:r>
+        <w:t>[ ] word</w:t>
       </w:r>
       <w:r>
         <w:rPr>
@@ -79,21 +74,7 @@
         <w:rPr>
           <w:rtl/>
         </w:rPr>
-        <w:t xml:space="preserve">וכל למידה חדשה תוסיפו </w:t>
-      </w:r>
-      <w:proofErr w:type="spellStart"/>
-      <w:r>
-        <w:rPr>
-          <w:rtl/>
-        </w:rPr>
-        <w:t>כברנאץ</w:t>
-      </w:r>
-      <w:proofErr w:type="spellEnd"/>
-      <w:r>
-        <w:rPr>
-          <w:rtl/>
-        </w:rPr>
-        <w:t xml:space="preserve">. </w:t>
+        <w:t xml:space="preserve">וכל למידה חדשה תוסיפו כברנאץ. </w:t>
       </w:r>
       <w:r>
         <w:t>git</w:t>
@@ -130,11 +111,9 @@
       <w:pPr>
         <w:bidi/>
       </w:pPr>
-      <w:proofErr w:type="gramStart"/>
       <w:r>
         <w:t>?SQL</w:t>
       </w:r>
-      <w:proofErr w:type="gramEnd"/>
       <w:r>
         <w:rPr>
           <w:rtl/>
@@ -169,21 +148,7 @@
         <w:rPr>
           <w:rtl/>
         </w:rPr>
-        <w:t xml:space="preserve"> המידע נשמר במבנה </w:t>
-      </w:r>
-      <w:proofErr w:type="spellStart"/>
-      <w:r>
-        <w:rPr>
-          <w:rtl/>
-        </w:rPr>
-        <w:t>רלציוני</w:t>
-      </w:r>
-      <w:proofErr w:type="spellEnd"/>
-      <w:r>
-        <w:rPr>
-          <w:rtl/>
-        </w:rPr>
-        <w:t xml:space="preserve"> בטבל</w:t>
+        <w:t xml:space="preserve"> המידע נשמר במבנה רלציוני בטבל</w:t>
       </w:r>
       <w:r>
         <w:rPr>
@@ -235,16 +200,8 @@
         <w:rPr>
           <w:rtl/>
         </w:rPr>
-        <w:t xml:space="preserve"> מראש), </w:t>
-      </w:r>
-      <w:proofErr w:type="spellStart"/>
-      <w:r>
-        <w:rPr>
-          <w:rtl/>
-        </w:rPr>
-        <w:t>וב</w:t>
-      </w:r>
-      <w:proofErr w:type="spellEnd"/>
+        <w:t xml:space="preserve"> מראש), וב</w:t>
+      </w:r>
       <w:r>
         <w:t>NOSQL</w:t>
       </w:r>
@@ -289,7 +246,6 @@
         </w:rPr>
         <w:t xml:space="preserve">, </w:t>
       </w:r>
-      <w:proofErr w:type="spellStart"/>
       <w:r>
         <w:rPr>
           <w:color w:val="273239"/>
@@ -298,7 +254,6 @@
         </w:rPr>
         <w:t>וכו</w:t>
       </w:r>
-      <w:proofErr w:type="spellEnd"/>
       <w:r>
         <w:rPr>
           <w:color w:val="273239"/>
@@ -370,44 +325,14 @@
         </w:rPr>
         <w:t xml:space="preserve">נעדיף להשתמש ב </w:t>
       </w:r>
-      <w:proofErr w:type="spellStart"/>
       <w:r>
         <w:t>mongoDB</w:t>
       </w:r>
-      <w:proofErr w:type="spellEnd"/>
-      <w:r>
-        <w:rPr>
-          <w:rtl/>
-        </w:rPr>
-        <w:t xml:space="preserve"> כאשר למידע </w:t>
-      </w:r>
-      <w:proofErr w:type="spellStart"/>
-      <w:r>
-        <w:rPr>
-          <w:rtl/>
-        </w:rPr>
-        <w:t>שאחנו</w:t>
-      </w:r>
-      <w:proofErr w:type="spellEnd"/>
-      <w:r>
-        <w:rPr>
-          <w:rtl/>
-        </w:rPr>
-        <w:t xml:space="preserve"> שומרים אין סכמה מוגדרת מראש, וכאשר לא נרצה לשמור מידע </w:t>
-      </w:r>
-      <w:proofErr w:type="spellStart"/>
-      <w:r>
-        <w:rPr>
-          <w:rtl/>
-        </w:rPr>
-        <w:t>רלציוני</w:t>
-      </w:r>
-      <w:proofErr w:type="spellEnd"/>
-      <w:r>
-        <w:rPr>
-          <w:rtl/>
-        </w:rPr>
-        <w:t xml:space="preserve">, בניגוד ל </w:t>
+      <w:r>
+        <w:rPr>
+          <w:rtl/>
+        </w:rPr>
+        <w:t xml:space="preserve"> כאשר למידע שאחנו שומרים אין סכמה מוגדרת מראש, וכאשר לא נרצה לשמור מידע רלציוני, בניגוד ל </w:t>
       </w:r>
       <w:r>
         <w:t>SQL</w:t>
@@ -455,14 +380,7 @@
         <w:rPr>
           <w:rtl/>
         </w:rPr>
-        <w:t xml:space="preserve"> </w:t>
-      </w:r>
-      <w:proofErr w:type="spellStart"/>
-      <w:r>
-        <w:rPr>
-          <w:rtl/>
-        </w:rPr>
-        <w:t>רלציוני</w:t>
+        <w:t xml:space="preserve"> רלציוני</w:t>
       </w:r>
       <w:r>
         <w:rPr>
@@ -471,26 +389,11 @@
         </w:rPr>
         <w:t>ת</w:t>
       </w:r>
-      <w:proofErr w:type="spellEnd"/>
-      <w:r>
-        <w:rPr>
-          <w:rtl/>
-        </w:rPr>
-        <w:t xml:space="preserve"> ( טבלאות שונות מקושרות אחת </w:t>
-      </w:r>
-      <w:proofErr w:type="spellStart"/>
-      <w:r>
-        <w:rPr>
-          <w:rtl/>
-        </w:rPr>
-        <w:t>לשניה</w:t>
-      </w:r>
-      <w:proofErr w:type="spellEnd"/>
-      <w:r>
-        <w:rPr>
-          <w:rtl/>
-        </w:rPr>
-        <w:t xml:space="preserve"> בעזרת </w:t>
+      <w:r>
+        <w:rPr>
+          <w:rtl/>
+        </w:rPr>
+        <w:t xml:space="preserve"> ( טבלאות שונות מקושרות אחת לשניה בעזרת </w:t>
       </w:r>
       <w:r>
         <w:t>foreign keys</w:t>
@@ -788,55 +691,7 @@
           <w:rFonts w:hint="cs"/>
           <w:rtl/>
         </w:rPr>
-        <w:t xml:space="preserve"> </w:t>
-      </w:r>
-      <w:proofErr w:type="spellStart"/>
-      <w:r>
-        <w:rPr>
-          <w:rFonts w:hint="cs"/>
-          <w:rtl/>
-        </w:rPr>
-        <w:t>בניוגד</w:t>
-      </w:r>
-      <w:proofErr w:type="spellEnd"/>
-      <w:r>
-        <w:rPr>
-          <w:rFonts w:hint="cs"/>
-          <w:rtl/>
-        </w:rPr>
-        <w:t xml:space="preserve"> </w:t>
-      </w:r>
-      <w:proofErr w:type="spellStart"/>
-      <w:r>
-        <w:rPr>
-          <w:rFonts w:hint="cs"/>
-          <w:rtl/>
-        </w:rPr>
-        <w:t>לדאטאבייסים</w:t>
-      </w:r>
-      <w:proofErr w:type="spellEnd"/>
-      <w:r>
-        <w:rPr>
-          <w:rFonts w:hint="cs"/>
-          <w:rtl/>
-        </w:rPr>
-        <w:t xml:space="preserve"> </w:t>
-      </w:r>
-      <w:proofErr w:type="spellStart"/>
-      <w:r>
-        <w:rPr>
-          <w:rFonts w:hint="cs"/>
-          <w:rtl/>
-        </w:rPr>
-        <w:t>רלציונים</w:t>
-      </w:r>
-      <w:proofErr w:type="spellEnd"/>
-      <w:r>
-        <w:rPr>
-          <w:rFonts w:hint="cs"/>
-          <w:rtl/>
-        </w:rPr>
-        <w:t xml:space="preserve"> </w:t>
+        <w:t xml:space="preserve"> בניוגד לדאטאבייסים רלציונים </w:t>
       </w:r>
       <w:r>
         <w:rPr>
@@ -894,13 +749,8 @@
         <w:t>מגבלת גודל ל</w:t>
       </w:r>
       <w:r>
-        <w:t xml:space="preserve"> </w:t>
-      </w:r>
-      <w:proofErr w:type="spellStart"/>
-      <w:r>
-        <w:t>Documen</w:t>
-      </w:r>
-      <w:proofErr w:type="spellEnd"/>
+        <w:t xml:space="preserve"> Documen</w:t>
+      </w:r>
       <w:r>
         <w:rPr>
           <w:rFonts w:hint="cs"/>
@@ -989,23 +839,13 @@
           <w:lang w:val="en-US"/>
         </w:rPr>
       </w:pPr>
-      <w:proofErr w:type="spellStart"/>
-      <w:r>
-        <w:rPr>
-          <w:rFonts w:hint="cs"/>
-          <w:rtl/>
-          <w:lang w:val="en-US"/>
-        </w:rPr>
-        <w:t>ברדיס</w:t>
-      </w:r>
-      <w:proofErr w:type="spellEnd"/>
-      <w:r>
-        <w:rPr>
-          <w:rFonts w:hint="cs"/>
-          <w:rtl/>
-          <w:lang w:val="en-US"/>
-        </w:rPr>
-        <w:t xml:space="preserve"> המידע נשמר על זיכרו</w:t>
+      <w:r>
+        <w:rPr>
+          <w:rFonts w:hint="cs"/>
+          <w:rtl/>
+          <w:lang w:val="en-US"/>
+        </w:rPr>
+        <w:t>ברדיס המידע נשמר על זיכרו</w:t>
       </w:r>
       <w:r>
         <w:rPr>
@@ -1035,25 +875,7 @@
           <w:rtl/>
           <w:lang w:val="en-US"/>
         </w:rPr>
-        <w:t xml:space="preserve"> אשר מהיר בהרבה מדיסק אחסון רגיל. בנוסף, </w:t>
-      </w:r>
-      <w:proofErr w:type="spellStart"/>
-      <w:r>
-        <w:rPr>
-          <w:rFonts w:hint="cs"/>
-          <w:rtl/>
-          <w:lang w:val="en-US"/>
-        </w:rPr>
-        <w:t>רדיס</w:t>
-      </w:r>
-      <w:proofErr w:type="spellEnd"/>
-      <w:r>
-        <w:rPr>
-          <w:rFonts w:hint="cs"/>
-          <w:rtl/>
-          <w:lang w:val="en-US"/>
-        </w:rPr>
-        <w:t xml:space="preserve"> פועל על </w:t>
+        <w:t xml:space="preserve"> אשר מהיר בהרבה מדיסק אחסון רגיל. בנוסף, רדיס פועל על </w:t>
       </w:r>
       <w:r>
         <w:rPr>
@@ -1111,11 +933,9 @@
           <w:rtl/>
         </w:rPr>
       </w:pPr>
-      <w:proofErr w:type="gramStart"/>
       <w:r>
         <w:t>?Redis</w:t>
       </w:r>
-      <w:proofErr w:type="gramEnd"/>
       <w:r>
         <w:rPr>
           <w:rtl/>
@@ -1142,23 +962,7 @@
           <w:rFonts w:hint="cs"/>
           <w:rtl/>
         </w:rPr>
-        <w:t xml:space="preserve">הסיבות הנפוצות ביותר לשימוש </w:t>
-      </w:r>
-      <w:proofErr w:type="spellStart"/>
-      <w:r>
-        <w:rPr>
-          <w:rFonts w:hint="cs"/>
-          <w:rtl/>
-        </w:rPr>
-        <w:t>ברדיס</w:t>
-      </w:r>
-      <w:proofErr w:type="spellEnd"/>
-      <w:r>
-        <w:rPr>
-          <w:rFonts w:hint="cs"/>
-          <w:rtl/>
-        </w:rPr>
-        <w:t xml:space="preserve"> הן</w:t>
+        <w:t>הסיבות הנפוצות ביותר לשימוש ברדיס הן</w:t>
       </w:r>
       <w:r>
         <w:rPr>
@@ -1211,25 +1015,7 @@
           <w:rtl/>
           <w:lang w:val="en-US"/>
         </w:rPr>
-        <w:t xml:space="preserve"> שמירת מידע שמשתמשים בו בתדירות גבוהה לזמן מוגבל כדי לאפשר </w:t>
-      </w:r>
-      <w:proofErr w:type="spellStart"/>
-      <w:r>
-        <w:rPr>
-          <w:rFonts w:hint="cs"/>
-          <w:rtl/>
-          <w:lang w:val="en-US"/>
-        </w:rPr>
-        <w:t>איחזור</w:t>
-      </w:r>
-      <w:proofErr w:type="spellEnd"/>
-      <w:r>
-        <w:rPr>
-          <w:rFonts w:hint="cs"/>
-          <w:rtl/>
-          <w:lang w:val="en-US"/>
-        </w:rPr>
-        <w:t xml:space="preserve"> של המידע מהר יותר</w:t>
+        <w:t xml:space="preserve"> שמירת מידע שמשתמשים בו בתדירות גבוהה לזמן מוגבל כדי לאפשר איחזור של המידע מהר יותר</w:t>
       </w:r>
     </w:p>
     <w:p>
@@ -1269,43 +1055,7 @@
           <w:rtl/>
           <w:lang w:val="en-US"/>
         </w:rPr>
-        <w:t xml:space="preserve"> מאפשר למפרסמים לפרסם הודעות לנושאים </w:t>
-      </w:r>
-      <w:proofErr w:type="spellStart"/>
-      <w:r>
-        <w:rPr>
-          <w:rFonts w:hint="cs"/>
-          <w:rtl/>
-          <w:lang w:val="en-US"/>
-        </w:rPr>
-        <w:t>מסויימים</w:t>
-      </w:r>
-      <w:proofErr w:type="spellEnd"/>
-      <w:r>
-        <w:rPr>
-          <w:rFonts w:hint="cs"/>
-          <w:rtl/>
-          <w:lang w:val="en-US"/>
-        </w:rPr>
-        <w:t xml:space="preserve"> ולרשומים להירשם לנושא </w:t>
-      </w:r>
-      <w:proofErr w:type="spellStart"/>
-      <w:r>
-        <w:rPr>
-          <w:rFonts w:hint="cs"/>
-          <w:rtl/>
-          <w:lang w:val="en-US"/>
-        </w:rPr>
-        <w:t>מסויים</w:t>
-      </w:r>
-      <w:proofErr w:type="spellEnd"/>
-      <w:r>
-        <w:rPr>
-          <w:rFonts w:hint="cs"/>
-          <w:rtl/>
-          <w:lang w:val="en-US"/>
-        </w:rPr>
-        <w:t xml:space="preserve"> ולקבל כל הודעה בנושא הזה מבלי שהרשום והמפרסם יכירו אחד את השני (</w:t>
+        <w:t xml:space="preserve"> מאפשר למפרסמים לפרסם הודעות לנושאים מסויימים ולרשומים להירשם לנושא מסויים ולקבל כל הודעה בנושא הזה מבלי שהרשום והמפרסם יכירו אחד את השני (</w:t>
       </w:r>
       <w:r>
         <w:rPr>
@@ -1329,11 +1079,9 @@
           <w:lang w:val="en-US"/>
         </w:rPr>
       </w:pPr>
-      <w:proofErr w:type="gramStart"/>
       <w:r>
         <w:t>?Redis</w:t>
       </w:r>
-      <w:proofErr w:type="gramEnd"/>
       <w:r>
         <w:rPr>
           <w:rtl/>
@@ -1383,43 +1131,7 @@
           <w:rtl/>
           <w:lang w:val="en-US"/>
         </w:rPr>
-        <w:t xml:space="preserve"> מערך של </w:t>
-      </w:r>
-      <w:proofErr w:type="spellStart"/>
-      <w:r>
-        <w:rPr>
-          <w:rFonts w:hint="cs"/>
-          <w:rtl/>
-          <w:lang w:val="en-US"/>
-        </w:rPr>
-        <w:t>ביתים</w:t>
-      </w:r>
-      <w:proofErr w:type="spellEnd"/>
-      <w:r>
-        <w:rPr>
-          <w:rFonts w:hint="cs"/>
-          <w:rtl/>
-          <w:lang w:val="en-US"/>
-        </w:rPr>
-        <w:t xml:space="preserve"> או מילים ששומר </w:t>
-      </w:r>
-      <w:proofErr w:type="gramStart"/>
-      <w:r>
-        <w:rPr>
-          <w:rFonts w:hint="cs"/>
-          <w:rtl/>
-          <w:lang w:val="en-US"/>
-        </w:rPr>
-        <w:t>אלמנטים(</w:t>
-      </w:r>
-      <w:proofErr w:type="gramEnd"/>
-      <w:r>
-        <w:rPr>
-          <w:rFonts w:hint="cs"/>
-          <w:rtl/>
-          <w:lang w:val="en-US"/>
-        </w:rPr>
-        <w:t>בדרך כלל אותיות) בעזרת קידוד</w:t>
+        <w:t xml:space="preserve"> מערך של ביתים או מילים ששומר אלמנטים(בדרך כלל אותיות) בעזרת קידוד</w:t>
       </w:r>
     </w:p>
     <w:p>
@@ -1438,7 +1150,6 @@
         <w:lastRenderedPageBreak/>
         <w:tab/>
       </w:r>
-      <w:proofErr w:type="gramStart"/>
       <w:r>
         <w:rPr>
           <w:lang w:val="en-US"/>
@@ -1451,16 +1162,7 @@
           <w:rtl/>
           <w:lang w:val="en-US"/>
         </w:rPr>
-        <w:t xml:space="preserve"> -</w:t>
-      </w:r>
-      <w:proofErr w:type="gramEnd"/>
-      <w:r>
-        <w:rPr>
-          <w:rFonts w:hint="cs"/>
-          <w:rtl/>
-          <w:lang w:val="en-US"/>
-        </w:rPr>
-        <w:t xml:space="preserve"> מבנה נתונים ששומר סט של אלמנטים ייחודיים</w:t>
+        <w:t xml:space="preserve"> - מבנה נתונים ששומר סט של אלמנטים ייחודיים</w:t>
       </w:r>
     </w:p>
     <w:p>
@@ -1521,18 +1223,8 @@
           <w:rtl/>
           <w:lang w:val="en-US"/>
         </w:rPr>
-        <w:t xml:space="preserve"> המסודרים לפי דירוג </w:t>
-      </w:r>
-      <w:proofErr w:type="spellStart"/>
-      <w:r>
-        <w:rPr>
-          <w:rFonts w:hint="cs"/>
-          <w:rtl/>
-          <w:lang w:val="en-US"/>
-        </w:rPr>
-        <w:t>מסויים</w:t>
-      </w:r>
-      <w:proofErr w:type="spellEnd"/>
+        <w:t xml:space="preserve"> המסודרים לפי דירוג מסויים</w:t>
+      </w:r>
     </w:p>
     <w:p>
       <w:pPr>
@@ -1851,65 +1543,20 @@
           <w:lang w:val="en-US"/>
         </w:rPr>
       </w:pPr>
-      <w:proofErr w:type="spellStart"/>
-      <w:r>
-        <w:rPr>
-          <w:rFonts w:hint="cs"/>
-          <w:rtl/>
-        </w:rPr>
-        <w:t>מנגון</w:t>
-      </w:r>
-      <w:proofErr w:type="spellEnd"/>
-      <w:r>
-        <w:rPr>
-          <w:rFonts w:hint="cs"/>
-          <w:rtl/>
-        </w:rPr>
-        <w:t xml:space="preserve"> פינוי הזיכרון </w:t>
-      </w:r>
-      <w:r>
-        <w:rPr>
-          <w:rFonts w:hint="cs"/>
-          <w:rtl/>
-          <w:lang w:val="en-US"/>
-        </w:rPr>
-        <w:t xml:space="preserve">מונע מהשרת לקרוס עקב עומס בזיכרון, שומר על ביצועיים </w:t>
-      </w:r>
-      <w:proofErr w:type="spellStart"/>
-      <w:r>
-        <w:rPr>
-          <w:rFonts w:hint="cs"/>
-          <w:rtl/>
-          <w:lang w:val="en-US"/>
-        </w:rPr>
-        <w:t>אפטימלים</w:t>
-      </w:r>
-      <w:proofErr w:type="spellEnd"/>
-      <w:r>
-        <w:rPr>
-          <w:rFonts w:hint="cs"/>
-          <w:rtl/>
-          <w:lang w:val="en-US"/>
-        </w:rPr>
-        <w:t xml:space="preserve">, ומונע ממידע לא מעודכן להישאר בשרת. למנגנון יש חשיבות רבה ובלעדיו השרת עלול לקרוס או </w:t>
-      </w:r>
-      <w:proofErr w:type="spellStart"/>
-      <w:r>
-        <w:rPr>
-          <w:rFonts w:hint="cs"/>
-          <w:rtl/>
-          <w:lang w:val="en-US"/>
-        </w:rPr>
-        <w:t>שביצוכעיו</w:t>
-      </w:r>
-      <w:proofErr w:type="spellEnd"/>
-      <w:r>
-        <w:rPr>
-          <w:rFonts w:hint="cs"/>
-          <w:rtl/>
-          <w:lang w:val="en-US"/>
-        </w:rPr>
-        <w:t xml:space="preserve"> יהיו איטיים.</w:t>
+      <w:r>
+        <w:rPr>
+          <w:rFonts w:hint="cs"/>
+          <w:rtl/>
+        </w:rPr>
+        <w:t xml:space="preserve">מנגון פינוי הזיכרון </w:t>
+      </w:r>
+      <w:r>
+        <w:rPr>
+          <w:rFonts w:hint="cs"/>
+          <w:rtl/>
+          <w:lang w:val="en-US"/>
+        </w:rPr>
+        <w:t>מונע מהשרת לקרוס עקב עומס בזיכרון, שומר על ביצועיים אפטימלים, ומונע ממידע לא מעודכן להישאר בשרת. למנגנון יש חשיבות רבה ובלעדיו השרת עלול לקרוס או שביצוכעיו יהיו איטיים.</w:t>
       </w:r>
     </w:p>
     <w:p>
@@ -1947,32 +1594,183 @@
         <w:bidi/>
       </w:pPr>
       <w:r>
-        <w:t>’</w:t>
-      </w:r>
-      <w:proofErr w:type="gramStart"/>
-      <w:r>
-        <w:t>topics</w:t>
-      </w:r>
-      <w:proofErr w:type="gramEnd"/>
-      <w:r>
-        <w:t xml:space="preserve">, partitions, producers, </w:t>
-      </w:r>
-      <w:proofErr w:type="gramStart"/>
-      <w:r>
+        <w:t>’topics, partitions, producers, consumers</w:t>
+      </w:r>
+      <w:r>
+        <w:rPr>
+          <w:rtl/>
+        </w:rPr>
+        <w:t xml:space="preserve"> : - הסבר את המושגים הבאים</w:t>
+      </w:r>
+    </w:p>
+    <w:p>
+      <w:pPr>
+        <w:bidi/>
+        <w:ind w:left="720"/>
+        <w:rPr>
+          <w:rFonts w:hint="cs"/>
+          <w:rtl/>
+          <w:lang w:val="en-US"/>
+        </w:rPr>
+      </w:pPr>
+      <w:r>
+        <w:t>Topic</w:t>
+      </w:r>
+      <w:r>
+        <w:rPr>
+          <w:rFonts w:hint="cs"/>
+          <w:rtl/>
+        </w:rPr>
+        <w:t xml:space="preserve"> </w:t>
+      </w:r>
+      <w:r>
+        <w:rPr>
+          <w:rtl/>
+        </w:rPr>
+        <w:t>–</w:t>
+      </w:r>
+      <w:r>
+        <w:rPr>
+          <w:rFonts w:hint="cs"/>
+          <w:rtl/>
+        </w:rPr>
+        <w:t xml:space="preserve"> נושא מסויים שאליו </w:t>
+      </w:r>
+      <w:r>
+        <w:rPr>
+          <w:lang w:val="en-US"/>
+        </w:rPr>
         <w:t>consumers</w:t>
       </w:r>
       <w:r>
         <w:rPr>
-          <w:rtl/>
-        </w:rPr>
-        <w:t xml:space="preserve"> :</w:t>
-      </w:r>
-      <w:proofErr w:type="gramEnd"/>
-      <w:r>
-        <w:rPr>
-          <w:rtl/>
-        </w:rPr>
-        <w:t xml:space="preserve"> - הסבר את המושגים הבאים</w:t>
+          <w:rFonts w:hint="cs"/>
+          <w:rtl/>
+          <w:lang w:val="en-US"/>
+        </w:rPr>
+        <w:t xml:space="preserve"> נרשמים וממנו הם קוראים הודעות ואליו </w:t>
+      </w:r>
+      <w:r>
+        <w:rPr>
+          <w:lang w:val="en-US"/>
+        </w:rPr>
+        <w:t>producers</w:t>
+      </w:r>
+      <w:r>
+        <w:rPr>
+          <w:rFonts w:hint="cs"/>
+          <w:rtl/>
+          <w:lang w:val="en-US"/>
+        </w:rPr>
+        <w:t xml:space="preserve"> מפרסמים הודעות</w:t>
+      </w:r>
+    </w:p>
+    <w:p>
+      <w:pPr>
+        <w:bidi/>
+        <w:rPr>
+          <w:rtl/>
+          <w:lang w:val="en-US"/>
+        </w:rPr>
+      </w:pPr>
+      <w:r>
+        <w:rPr>
+          <w:rtl/>
+        </w:rPr>
+        <w:tab/>
+      </w:r>
+      <w:r>
+        <w:rPr>
+          <w:lang w:val="en-US"/>
+        </w:rPr>
+        <w:t xml:space="preserve">Producer </w:t>
+      </w:r>
+      <w:r>
+        <w:rPr>
+          <w:rFonts w:hint="cs"/>
+          <w:rtl/>
+          <w:lang w:val="en-US"/>
+        </w:rPr>
+        <w:t xml:space="preserve"> - תוכנה או שירות אשר מפרסמים הודעות אל </w:t>
+      </w:r>
+      <w:r>
+        <w:rPr>
+          <w:lang w:val="en-US"/>
+        </w:rPr>
+        <w:t>topic</w:t>
+      </w:r>
+      <w:r>
+        <w:rPr>
+          <w:rFonts w:hint="cs"/>
+          <w:rtl/>
+          <w:lang w:val="en-US"/>
+        </w:rPr>
+        <w:t xml:space="preserve"> מסויים</w:t>
+      </w:r>
+    </w:p>
+    <w:p>
+      <w:pPr>
+        <w:bidi/>
+        <w:rPr>
+          <w:rtl/>
+          <w:lang w:val="en-US"/>
+        </w:rPr>
+      </w:pPr>
+      <w:r>
+        <w:rPr>
+          <w:rtl/>
+          <w:lang w:val="en-US"/>
+        </w:rPr>
+        <w:tab/>
+      </w:r>
+      <w:r>
+        <w:rPr>
+          <w:lang w:val="en-US"/>
+        </w:rPr>
+        <w:t>Consu</w:t>
+      </w:r>
+      <w:r>
+        <w:rPr>
+          <w:lang w:val="en-US"/>
+        </w:rPr>
+        <w:t>mer</w:t>
+      </w:r>
+      <w:r>
+        <w:rPr>
+          <w:rFonts w:hint="cs"/>
+          <w:rtl/>
+          <w:lang w:val="en-US"/>
+        </w:rPr>
+        <w:t xml:space="preserve"> </w:t>
+      </w:r>
+      <w:r>
+        <w:rPr>
+          <w:rtl/>
+          <w:lang w:val="en-US"/>
+        </w:rPr>
+        <w:t>–</w:t>
+      </w:r>
+      <w:r>
+        <w:rPr>
+          <w:rFonts w:hint="cs"/>
+          <w:rtl/>
+          <w:lang w:val="en-US"/>
+        </w:rPr>
+        <w:t xml:space="preserve"> תוכנה או שירות אשר קורא הודעות מ</w:t>
+      </w:r>
+      <w:r>
+        <w:rPr>
+          <w:lang w:val="en-US"/>
+        </w:rPr>
+        <w:t xml:space="preserve">topic </w:t>
+      </w:r>
+      <w:r>
+        <w:rPr>
+          <w:rFonts w:hint="cs"/>
+          <w:rtl/>
+          <w:lang w:val="en-US"/>
+        </w:rPr>
+        <w:t xml:space="preserve"> אחד או יותר</w:t>
       </w:r>
     </w:p>
     <w:p>
@@ -1986,18 +1784,23 @@
         </w:rPr>
       </w:pPr>
       <w:r>
-        <w:t>Topic</w:t>
-      </w:r>
-      <w:r>
-        <w:rPr>
-          <w:rFonts w:hint="cs"/>
-          <w:rtl/>
+        <w:rPr>
+          <w:lang w:val="en-US"/>
+        </w:rPr>
+        <w:t>Partitions</w:t>
+      </w:r>
+      <w:r>
+        <w:rPr>
+          <w:rFonts w:hint="cs"/>
+          <w:rtl/>
+          <w:lang w:val="en-US"/>
         </w:rPr>
         <w:t xml:space="preserve"> </w:t>
       </w:r>
       <w:r>
         <w:rPr>
           <w:rtl/>
+          <w:lang w:val="en-US"/>
         </w:rPr>
         <w:t>–</w:t>
       </w:r>
@@ -2005,91 +1808,9 @@
         <w:rPr>
           <w:rFonts w:hint="cs"/>
           <w:rtl/>
-        </w:rPr>
-        <w:t xml:space="preserve"> נושא </w:t>
-      </w:r>
-      <w:proofErr w:type="spellStart"/>
-      <w:r>
-        <w:rPr>
-          <w:rFonts w:hint="cs"/>
-          <w:rtl/>
-        </w:rPr>
-        <w:t>מסויים</w:t>
-      </w:r>
-      <w:proofErr w:type="spellEnd"/>
-      <w:r>
-        <w:rPr>
-          <w:rFonts w:hint="cs"/>
-          <w:rtl/>
-        </w:rPr>
-        <w:t xml:space="preserve"> שאליו </w:t>
-      </w:r>
-      <w:r>
-        <w:rPr>
-          <w:lang w:val="en-US"/>
-        </w:rPr>
-        <w:t>consumers</w:t>
-      </w:r>
-      <w:r>
-        <w:rPr>
-          <w:rFonts w:hint="cs"/>
-          <w:rtl/>
-          <w:lang w:val="en-US"/>
-        </w:rPr>
-        <w:t xml:space="preserve"> נרשמים וממנו הם קוראים הודעות ואליו </w:t>
-      </w:r>
-      <w:r>
-        <w:rPr>
-          <w:lang w:val="en-US"/>
-        </w:rPr>
-        <w:t>producers</w:t>
-      </w:r>
-      <w:r>
-        <w:rPr>
-          <w:rFonts w:hint="cs"/>
-          <w:rtl/>
-          <w:lang w:val="en-US"/>
-        </w:rPr>
-        <w:t xml:space="preserve"> מפרסמים הודעות</w:t>
-      </w:r>
-    </w:p>
-    <w:p>
-      <w:pPr>
-        <w:bidi/>
-        <w:rPr>
-          <w:rtl/>
-          <w:lang w:val="en-US"/>
-        </w:rPr>
-      </w:pPr>
-      <w:r>
-        <w:rPr>
-          <w:rtl/>
-        </w:rPr>
-        <w:tab/>
-      </w:r>
-      <w:proofErr w:type="gramStart"/>
-      <w:r>
-        <w:rPr>
-          <w:lang w:val="en-US"/>
-        </w:rPr>
-        <w:t xml:space="preserve">Producer </w:t>
-      </w:r>
-      <w:r>
-        <w:rPr>
-          <w:rFonts w:hint="cs"/>
-          <w:rtl/>
-          <w:lang w:val="en-US"/>
-        </w:rPr>
-        <w:t xml:space="preserve"> -</w:t>
-      </w:r>
-      <w:proofErr w:type="gramEnd"/>
-      <w:r>
-        <w:rPr>
-          <w:rFonts w:hint="cs"/>
-          <w:rtl/>
-          <w:lang w:val="en-US"/>
-        </w:rPr>
-        <w:t xml:space="preserve"> תוכנה או שירות אשר מפרסמים הודעות אל </w:t>
+          <w:lang w:val="en-US"/>
+        </w:rPr>
+        <w:t xml:space="preserve"> חלוקות של </w:t>
       </w:r>
       <w:r>
         <w:rPr>
@@ -2103,92 +1824,247 @@
           <w:rtl/>
           <w:lang w:val="en-US"/>
         </w:rPr>
+        <w:t xml:space="preserve"> . המידע שנמצא ב</w:t>
+      </w:r>
+      <w:r>
+        <w:rPr>
+          <w:lang w:val="en-US"/>
+        </w:rPr>
+        <w:t>topic</w:t>
+      </w:r>
+      <w:r>
+        <w:rPr>
+          <w:rFonts w:hint="cs"/>
+          <w:rtl/>
+          <w:lang w:val="en-US"/>
+        </w:rPr>
+        <w:t xml:space="preserve"> מתחלק בין ה </w:t>
+      </w:r>
+      <w:r>
+        <w:rPr>
+          <w:lang w:val="en-US"/>
+        </w:rPr>
+        <w:t>partition</w:t>
+      </w:r>
+      <w:r>
+        <w:rPr>
+          <w:rFonts w:hint="cs"/>
+          <w:rtl/>
+          <w:lang w:val="en-US"/>
+        </w:rPr>
+        <w:t>-ים וכך אפשר לקרוא את המידע מ</w:t>
+      </w:r>
+      <w:r>
+        <w:rPr>
+          <w:lang w:val="en-US"/>
+        </w:rPr>
+        <w:t>topic</w:t>
+      </w:r>
+      <w:r>
+        <w:rPr>
+          <w:rFonts w:hint="cs"/>
+          <w:rtl/>
+          <w:lang w:val="en-US"/>
+        </w:rPr>
+        <w:t xml:space="preserve"> מהר יותר</w:t>
+      </w:r>
+    </w:p>
+    <w:p>
+      <w:pPr>
+        <w:bidi/>
+        <w:rPr>
+          <w:rtl/>
+        </w:rPr>
+      </w:pPr>
+      <w:r>
+        <w:t>?RabbitMQ</w:t>
+      </w:r>
+      <w:r>
+        <w:rPr>
+          <w:rtl/>
+        </w:rPr>
+        <w:t xml:space="preserve"> ל </w:t>
+      </w:r>
+      <w:r>
+        <w:t>Kafka</w:t>
+      </w:r>
+      <w:r>
+        <w:rPr>
+          <w:rtl/>
+        </w:rPr>
+        <w:t xml:space="preserve"> - מה ההבדל בין</w:t>
+      </w:r>
+    </w:p>
+    <w:p>
+      <w:pPr>
+        <w:bidi/>
+        <w:ind w:left="720"/>
+        <w:rPr>
+          <w:rFonts w:hint="cs"/>
+          <w:rtl/>
+          <w:lang w:val="en-US"/>
+        </w:rPr>
+      </w:pPr>
+      <w:r>
+        <w:rPr>
+          <w:lang w:val="en-US"/>
+        </w:rPr>
+        <w:t>RabbitMQ</w:t>
+      </w:r>
+      <w:r>
+        <w:rPr>
+          <w:rFonts w:hint="cs"/>
+          <w:rtl/>
+          <w:lang w:val="en-US"/>
+        </w:rPr>
+        <w:t xml:space="preserve"> משמש לניתוב מורכב של הודעות </w:t>
+      </w:r>
+      <w:r>
+        <w:rPr>
+          <w:rFonts w:hint="cs"/>
+          <w:rtl/>
+          <w:lang w:val="en-US"/>
+        </w:rPr>
+        <w:t>והעברת משימות לשירותים שונים במערכת וכאשר הודעה נקראת מתור היא נמחקת מאותו התור, בעוד ש</w:t>
+      </w:r>
+      <w:r>
+        <w:rPr>
+          <w:lang w:val="en-US"/>
+        </w:rPr>
+        <w:t>Kafka</w:t>
+      </w:r>
+      <w:r>
+        <w:rPr>
+          <w:rFonts w:hint="cs"/>
+          <w:rtl/>
+          <w:lang w:val="en-US"/>
+        </w:rPr>
+        <w:t xml:space="preserve"> משמש כ</w:t>
+      </w:r>
+      <w:r>
+        <w:rPr>
+          <w:lang w:val="en-US"/>
+        </w:rPr>
+        <w:t>log</w:t>
+      </w:r>
+      <w:r>
+        <w:rPr>
+          <w:rFonts w:hint="cs"/>
+          <w:rtl/>
+          <w:lang w:val="en-US"/>
+        </w:rPr>
+        <w:t xml:space="preserve"> מבוזר וכאשר הודעה נכתבת ל</w:t>
+      </w:r>
+      <w:r>
+        <w:rPr>
+          <w:lang w:val="en-US"/>
+        </w:rPr>
+        <w:t>kafka</w:t>
+      </w:r>
+      <w:r>
+        <w:rPr>
+          <w:rFonts w:hint="cs"/>
+          <w:rtl/>
+          <w:lang w:val="en-US"/>
+        </w:rPr>
+        <w:t xml:space="preserve"> היא נשארת שם לכמות זמן מוגדרת גם אם קראו אותה (מה שמאפשר שמספר צרכנים יקראו את אותה הודעה)</w:t>
+      </w:r>
+    </w:p>
+    <w:p>
+      <w:pPr>
+        <w:bidi/>
+        <w:rPr>
+          <w:rtl/>
+        </w:rPr>
+      </w:pPr>
+      <w:r>
+        <w:rPr>
+          <w:rtl/>
+        </w:rPr>
+        <w:t>- איך מנגנון שמירת ההודעות עובד? מתי הודעה נמחקת?</w:t>
+      </w:r>
+    </w:p>
+    <w:p>
+      <w:pPr>
+        <w:bidi/>
+        <w:ind w:left="720"/>
+        <w:rPr>
+          <w:rFonts w:hint="cs"/>
+          <w:rtl/>
+          <w:lang w:val="en-US"/>
+        </w:rPr>
+      </w:pPr>
+      <w:r>
+        <w:rPr>
+          <w:rFonts w:hint="cs"/>
+          <w:rtl/>
+        </w:rPr>
+        <w:t>הודעות נשמרות כמות מוגדרת של זמן ונמחקות לאחר מכן,</w:t>
+      </w:r>
+      <w:r>
+        <w:rPr>
+          <w:lang w:val="en-US"/>
+        </w:rPr>
         <w:t xml:space="preserve"> </w:t>
       </w:r>
-      <w:proofErr w:type="spellStart"/>
-      <w:r>
-        <w:rPr>
-          <w:rFonts w:hint="cs"/>
-          <w:rtl/>
-          <w:lang w:val="en-US"/>
-        </w:rPr>
-        <w:t>מסויים</w:t>
-      </w:r>
-      <w:proofErr w:type="spellEnd"/>
-    </w:p>
-    <w:p>
-      <w:pPr>
-        <w:bidi/>
-        <w:rPr>
-          <w:rtl/>
-          <w:lang w:val="en-US"/>
-        </w:rPr>
-      </w:pPr>
-      <w:r>
-        <w:rPr>
-          <w:rtl/>
-          <w:lang w:val="en-US"/>
-        </w:rPr>
-        <w:tab/>
-      </w:r>
-      <w:r>
-        <w:rPr>
-          <w:lang w:val="en-US"/>
-        </w:rPr>
-        <w:t>Consu</w:t>
-      </w:r>
-      <w:r>
-        <w:rPr>
-          <w:lang w:val="en-US"/>
-        </w:rPr>
-        <w:t>mer</w:t>
-      </w:r>
-      <w:r>
-        <w:rPr>
-          <w:rFonts w:hint="cs"/>
-          <w:rtl/>
-          <w:lang w:val="en-US"/>
+      <w:r>
+        <w:rPr>
+          <w:rFonts w:hint="cs"/>
+          <w:rtl/>
+          <w:lang w:val="en-US"/>
+        </w:rPr>
+        <w:t xml:space="preserve"> ניתן להגדיר גם שההודעות יישאר</w:t>
+      </w:r>
+      <w:r>
+        <w:rPr>
+          <w:rFonts w:hint="eastAsia"/>
+          <w:rtl/>
+          <w:lang w:val="en-US"/>
+        </w:rPr>
+        <w:t>ו</w:t>
+      </w:r>
+      <w:r>
+        <w:rPr>
+          <w:rFonts w:hint="cs"/>
+          <w:rtl/>
+          <w:lang w:val="en-US"/>
+        </w:rPr>
+        <w:t xml:space="preserve"> לנצח</w:t>
+      </w:r>
+    </w:p>
+    <w:p>
+      <w:pPr>
+        <w:bidi/>
+        <w:rPr>
+          <w:rtl/>
+        </w:rPr>
+      </w:pPr>
+      <w:r>
+        <w:rPr>
+          <w:rtl/>
+        </w:rPr>
+        <w:t xml:space="preserve">מבטיחה שמידע לא יאבד גם אם אחד השרתים קורס? </w:t>
+      </w:r>
+      <w:r>
+        <w:t>Kafka</w:t>
+      </w:r>
+      <w:r>
+        <w:rPr>
+          <w:rtl/>
         </w:rPr>
         <w:t xml:space="preserve"> </w:t>
       </w:r>
       <w:r>
         <w:rPr>
           <w:rtl/>
-          <w:lang w:val="en-US"/>
         </w:rPr>
         <w:t>–</w:t>
       </w:r>
       <w:r>
         <w:rPr>
-          <w:rFonts w:hint="cs"/>
-          <w:rtl/>
-          <w:lang w:val="en-US"/>
-        </w:rPr>
-        <w:t xml:space="preserve"> תוכנה או שירות אשר קורא הודעות מ</w:t>
-      </w:r>
-      <w:proofErr w:type="gramStart"/>
-      <w:r>
-        <w:rPr>
-          <w:lang w:val="en-US"/>
-        </w:rPr>
-        <w:t xml:space="preserve">topic </w:t>
-      </w:r>
-      <w:r>
-        <w:rPr>
-          <w:rFonts w:hint="cs"/>
-          <w:rtl/>
-          <w:lang w:val="en-US"/>
-        </w:rPr>
-        <w:t xml:space="preserve"> אחד</w:t>
-      </w:r>
-      <w:proofErr w:type="gramEnd"/>
-      <w:r>
-        <w:rPr>
-          <w:rFonts w:hint="cs"/>
-          <w:rtl/>
-          <w:lang w:val="en-US"/>
-        </w:rPr>
-        <w:t xml:space="preserve"> או יותר</w:t>
+          <w:rtl/>
+        </w:rPr>
+        <w:t xml:space="preserve"> כיצד</w:t>
       </w:r>
     </w:p>
     <w:p>
@@ -2203,34 +2079,12 @@
       </w:pPr>
       <w:r>
         <w:rPr>
-          <w:lang w:val="en-US"/>
-        </w:rPr>
-        <w:t>Partitions</w:t>
-      </w:r>
-      <w:r>
-        <w:rPr>
-          <w:rFonts w:hint="cs"/>
-          <w:rtl/>
-          <w:lang w:val="en-US"/>
-        </w:rPr>
-        <w:t xml:space="preserve"> </w:t>
-      </w:r>
-      <w:r>
-        <w:rPr>
-          <w:rtl/>
-          <w:lang w:val="en-US"/>
-        </w:rPr>
-        <w:t>–</w:t>
-      </w:r>
-      <w:r>
-        <w:rPr>
-          <w:rFonts w:hint="cs"/>
-          <w:rtl/>
-          <w:lang w:val="en-US"/>
-        </w:rPr>
-        <w:t xml:space="preserve"> חלוקות של </w:t>
-      </w:r>
-      <w:proofErr w:type="gramStart"/>
+          <w:rFonts w:hint="cs"/>
+          <w:rtl/>
+          <w:lang w:val="en-US"/>
+        </w:rPr>
+        <w:t>כשמידע נכנס ל</w:t>
+      </w:r>
       <w:r>
         <w:rPr>
           <w:lang w:val="en-US"/>
@@ -2243,30 +2097,7 @@
           <w:rtl/>
           <w:lang w:val="en-US"/>
         </w:rPr>
-        <w:t xml:space="preserve"> .</w:t>
-      </w:r>
-      <w:proofErr w:type="gramEnd"/>
-      <w:r>
-        <w:rPr>
-          <w:rFonts w:hint="cs"/>
-          <w:rtl/>
-          <w:lang w:val="en-US"/>
-        </w:rPr>
-        <w:t xml:space="preserve"> המידע שנמצא ב</w:t>
-      </w:r>
-      <w:r>
-        <w:rPr>
-          <w:lang w:val="en-US"/>
-        </w:rPr>
-        <w:t>topic</w:t>
-      </w:r>
-      <w:r>
-        <w:rPr>
-          <w:rFonts w:hint="cs"/>
-          <w:rtl/>
-          <w:lang w:val="en-US"/>
-        </w:rPr>
-        <w:t xml:space="preserve"> מתחלק בין ה </w:t>
+        <w:t xml:space="preserve"> הוא מחולק ל</w:t>
       </w:r>
       <w:r>
         <w:rPr>
@@ -2280,256 +2111,7 @@
           <w:rtl/>
           <w:lang w:val="en-US"/>
         </w:rPr>
-        <w:t>-ים וכך אפשר לקרוא את המידע מ</w:t>
-      </w:r>
-      <w:r>
-        <w:rPr>
-          <w:lang w:val="en-US"/>
-        </w:rPr>
-        <w:t>topic</w:t>
-      </w:r>
-      <w:r>
-        <w:rPr>
-          <w:rFonts w:hint="cs"/>
-          <w:rtl/>
-          <w:lang w:val="en-US"/>
-        </w:rPr>
-        <w:t xml:space="preserve"> מהר יותר</w:t>
-      </w:r>
-    </w:p>
-    <w:p>
-      <w:pPr>
-        <w:bidi/>
-        <w:rPr>
-          <w:rtl/>
-        </w:rPr>
-      </w:pPr>
-      <w:proofErr w:type="gramStart"/>
-      <w:r>
-        <w:t>?RabbitMQ</w:t>
-      </w:r>
-      <w:proofErr w:type="gramEnd"/>
-      <w:r>
-        <w:rPr>
-          <w:rtl/>
-        </w:rPr>
-        <w:t xml:space="preserve"> ל </w:t>
-      </w:r>
-      <w:r>
-        <w:t>Kafka</w:t>
-      </w:r>
-      <w:r>
-        <w:rPr>
-          <w:rtl/>
-        </w:rPr>
-        <w:t xml:space="preserve"> - מה ההבדל בין</w:t>
-      </w:r>
-    </w:p>
-    <w:p>
-      <w:pPr>
-        <w:bidi/>
-        <w:ind w:left="720"/>
-        <w:rPr>
-          <w:rFonts w:hint="cs"/>
-          <w:rtl/>
-          <w:lang w:val="en-US"/>
-        </w:rPr>
-      </w:pPr>
-      <w:r>
-        <w:rPr>
-          <w:lang w:val="en-US"/>
-        </w:rPr>
-        <w:t>RabbitMQ</w:t>
-      </w:r>
-      <w:r>
-        <w:rPr>
-          <w:rFonts w:hint="cs"/>
-          <w:rtl/>
-          <w:lang w:val="en-US"/>
-        </w:rPr>
-        <w:t xml:space="preserve"> משמש לניתוב מורכב של הודעות </w:t>
-      </w:r>
-      <w:r>
-        <w:rPr>
-          <w:rFonts w:hint="cs"/>
-          <w:rtl/>
-          <w:lang w:val="en-US"/>
-        </w:rPr>
-        <w:t>והעברת משימות לשירותים שונים במערכת וכאשר הודעה נקראת מתור היא נמחקת מאותו התור, בעוד ש</w:t>
-      </w:r>
-      <w:r>
-        <w:rPr>
-          <w:lang w:val="en-US"/>
-        </w:rPr>
-        <w:t>Kafka</w:t>
-      </w:r>
-      <w:r>
-        <w:rPr>
-          <w:rFonts w:hint="cs"/>
-          <w:rtl/>
-          <w:lang w:val="en-US"/>
-        </w:rPr>
-        <w:t xml:space="preserve"> משמש כ</w:t>
-      </w:r>
-      <w:r>
-        <w:rPr>
-          <w:lang w:val="en-US"/>
-        </w:rPr>
-        <w:t>log</w:t>
-      </w:r>
-      <w:r>
-        <w:rPr>
-          <w:rFonts w:hint="cs"/>
-          <w:rtl/>
-          <w:lang w:val="en-US"/>
-        </w:rPr>
-        <w:t xml:space="preserve"> מבוזר וכאשר הודעה נכתבת ל</w:t>
-      </w:r>
-      <w:proofErr w:type="spellStart"/>
-      <w:r>
-        <w:rPr>
-          <w:lang w:val="en-US"/>
-        </w:rPr>
-        <w:t>kafka</w:t>
-      </w:r>
-      <w:proofErr w:type="spellEnd"/>
-      <w:r>
-        <w:rPr>
-          <w:rFonts w:hint="cs"/>
-          <w:rtl/>
-          <w:lang w:val="en-US"/>
-        </w:rPr>
-        <w:t xml:space="preserve"> היא נשארת שם לכמות זמן מוגדרת גם אם קראו אותה (מה שמאפשר שמספר צרכנים יקראו את אותה הודעה)</w:t>
-      </w:r>
-    </w:p>
-    <w:p>
-      <w:pPr>
-        <w:bidi/>
-        <w:rPr>
-          <w:rtl/>
-        </w:rPr>
-      </w:pPr>
-      <w:r>
-        <w:rPr>
-          <w:rtl/>
-        </w:rPr>
-        <w:t>- איך מנגנון שמירת ההודעות עובד? מתי הודעה נמחקת?</w:t>
-      </w:r>
-    </w:p>
-    <w:p>
-      <w:pPr>
-        <w:bidi/>
-        <w:ind w:left="720"/>
-        <w:rPr>
-          <w:rFonts w:hint="cs"/>
-          <w:rtl/>
-          <w:lang w:val="en-US"/>
-        </w:rPr>
-      </w:pPr>
-      <w:r>
-        <w:rPr>
-          <w:rFonts w:hint="cs"/>
-          <w:rtl/>
-        </w:rPr>
-        <w:t>הודעות נשמרות כמות מוגדרת של זמן ונמחקות לאחר מכן,</w:t>
-      </w:r>
-      <w:r>
-        <w:rPr>
-          <w:lang w:val="en-US"/>
-        </w:rPr>
-        <w:t xml:space="preserve"> </w:t>
-      </w:r>
-      <w:r>
-        <w:rPr>
-          <w:rFonts w:hint="cs"/>
-          <w:rtl/>
-          <w:lang w:val="en-US"/>
-        </w:rPr>
-        <w:t xml:space="preserve"> ניתן להגדיר גם שההודעות יישאר</w:t>
-      </w:r>
-      <w:r>
-        <w:rPr>
-          <w:rFonts w:hint="eastAsia"/>
-          <w:rtl/>
-          <w:lang w:val="en-US"/>
-        </w:rPr>
-        <w:t>ו</w:t>
-      </w:r>
-      <w:r>
-        <w:rPr>
-          <w:rFonts w:hint="cs"/>
-          <w:rtl/>
-          <w:lang w:val="en-US"/>
-        </w:rPr>
-        <w:t xml:space="preserve"> לנצח</w:t>
-      </w:r>
-    </w:p>
-    <w:p>
-      <w:pPr>
-        <w:bidi/>
-        <w:rPr>
-          <w:rtl/>
-        </w:rPr>
-      </w:pPr>
-      <w:r>
-        <w:rPr>
-          <w:rtl/>
-        </w:rPr>
-        <w:t xml:space="preserve">מבטיחה שמידע לא יאבד גם אם אחד השרתים קורס? </w:t>
-      </w:r>
-      <w:r>
-        <w:t>Kafka</w:t>
-      </w:r>
-      <w:r>
-        <w:rPr>
-          <w:rtl/>
-        </w:rPr>
-        <w:t xml:space="preserve"> </w:t>
-      </w:r>
-      <w:r>
-        <w:rPr>
-          <w:rtl/>
-        </w:rPr>
-        <w:t>–</w:t>
-      </w:r>
-      <w:r>
-        <w:rPr>
-          <w:rtl/>
-        </w:rPr>
-        <w:t xml:space="preserve"> כיצד</w:t>
-      </w:r>
-    </w:p>
-    <w:p>
-      <w:pPr>
-        <w:bidi/>
-        <w:ind w:left="720"/>
-        <w:rPr>
-          <w:rFonts w:hint="cs"/>
-          <w:rtl/>
-          <w:lang w:val="en-US"/>
-        </w:rPr>
-      </w:pPr>
-      <w:r>
-        <w:rPr>
-          <w:rFonts w:hint="cs"/>
-          <w:rtl/>
-          <w:lang w:val="en-US"/>
-        </w:rPr>
-        <w:t>כשמידע נכנס ל</w:t>
-      </w:r>
-      <w:r>
-        <w:rPr>
-          <w:lang w:val="en-US"/>
-        </w:rPr>
-        <w:t>topic</w:t>
-      </w:r>
-      <w:r>
-        <w:rPr>
-          <w:rFonts w:hint="cs"/>
-          <w:rtl/>
-          <w:lang w:val="en-US"/>
-        </w:rPr>
-        <w:t xml:space="preserve"> הוא מחולק ל</w:t>
+        <w:t>-ים אשר כל אחד מהם הוא קובץ לוגים אשר שמור על הדיסק וכך גם אם השרת קורס ההודעות נמצאות על הדיסק. בנוסף, ניתן להגדיר שכאשר מידע נכתב ל</w:t>
       </w:r>
       <w:r>
         <w:rPr>
@@ -2543,39 +2125,7 @@
           <w:rtl/>
           <w:lang w:val="en-US"/>
         </w:rPr>
-        <w:t>-ים אשר כל אחד מהם הוא קובץ לוגים אשר שמור על הדיסק וכך גם אם השרת קורס ההודעות נמצאות על הדיסק. בנוסף, ניתן להגדיר שכאשר מידע נכתב ל</w:t>
-      </w:r>
-      <w:r>
-        <w:rPr>
-          <w:lang w:val="en-US"/>
-        </w:rPr>
-        <w:t>partition</w:t>
-      </w:r>
-      <w:r>
-        <w:rPr>
-          <w:rFonts w:hint="cs"/>
-          <w:rtl/>
-          <w:lang w:val="en-US"/>
-        </w:rPr>
-        <w:t xml:space="preserve"> </w:t>
-      </w:r>
-      <w:proofErr w:type="spellStart"/>
-      <w:r>
-        <w:rPr>
-          <w:rFonts w:hint="cs"/>
-          <w:rtl/>
-          <w:lang w:val="en-US"/>
-        </w:rPr>
-        <w:t>מסויים</w:t>
-      </w:r>
-      <w:proofErr w:type="spellEnd"/>
-      <w:r>
-        <w:rPr>
-          <w:rFonts w:hint="cs"/>
-          <w:rtl/>
-          <w:lang w:val="en-US"/>
-        </w:rPr>
-        <w:t xml:space="preserve"> הוא ייכתב גם ל</w:t>
+        <w:t xml:space="preserve"> מסויים הוא ייכתב גם ל</w:t>
       </w:r>
       <w:r>
         <w:rPr>
@@ -2682,13 +2232,8 @@
         </w:rPr>
       </w:pPr>
       <w:r>
-        <w:t xml:space="preserve">connections, processors, </w:t>
-      </w:r>
-      <w:proofErr w:type="spellStart"/>
-      <w:r>
-        <w:t>FlowFiles</w:t>
-      </w:r>
-      <w:proofErr w:type="spellEnd"/>
+        <w:t>connections, processors, FlowFiles</w:t>
+      </w:r>
       <w:r>
         <w:rPr>
           <w:rtl/>
@@ -2763,14 +2308,12 @@
         </w:rPr>
         <w:t xml:space="preserve">-ים מקבלים </w:t>
       </w:r>
-      <w:proofErr w:type="spellStart"/>
       <w:r>
         <w:rPr>
           <w:lang w:val="en-US"/>
         </w:rPr>
         <w:t>FlowFile</w:t>
       </w:r>
-      <w:proofErr w:type="spellEnd"/>
       <w:r>
         <w:rPr>
           <w:rFonts w:hint="cs"/>
@@ -2793,14 +2336,12 @@
         </w:rPr>
         <w:t xml:space="preserve"> שקודם להם ומעבירים </w:t>
       </w:r>
-      <w:proofErr w:type="spellStart"/>
       <w:r>
         <w:rPr>
           <w:lang w:val="en-US"/>
         </w:rPr>
         <w:t>FlowFile</w:t>
       </w:r>
-      <w:proofErr w:type="spellEnd"/>
       <w:r>
         <w:rPr>
           <w:rFonts w:hint="cs"/>
@@ -2833,14 +2374,12 @@
           <w:lang w:val="en-US"/>
         </w:rPr>
       </w:pPr>
-      <w:proofErr w:type="spellStart"/>
       <w:r>
         <w:rPr>
           <w:lang w:val="en-US"/>
         </w:rPr>
         <w:t>FlowFile</w:t>
       </w:r>
-      <w:proofErr w:type="spellEnd"/>
       <w:r>
         <w:rPr>
           <w:rFonts w:hint="cs"/>
@@ -2924,14 +2463,12 @@
         </w:rPr>
         <w:t xml:space="preserve">ים שונים אשר מעבירים </w:t>
       </w:r>
-      <w:proofErr w:type="spellStart"/>
       <w:r>
         <w:rPr>
           <w:lang w:val="en-US"/>
         </w:rPr>
         <w:t>FlowFile</w:t>
       </w:r>
-      <w:proofErr w:type="spellEnd"/>
       <w:r>
         <w:rPr>
           <w:rFonts w:hint="cs"/>
@@ -3046,21 +2583,12 @@
           <w:rtl/>
         </w:rPr>
       </w:pPr>
-      <w:proofErr w:type="spellStart"/>
-      <w:r>
-        <w:rPr>
-          <w:rFonts w:hint="cs"/>
-          <w:rtl/>
-        </w:rPr>
-        <w:t>דיבוג</w:t>
-      </w:r>
-      <w:proofErr w:type="spellEnd"/>
-      <w:r>
-        <w:rPr>
-          <w:rFonts w:hint="cs"/>
-          <w:rtl/>
-        </w:rPr>
-        <w:t xml:space="preserve"> קל </w:t>
+      <w:r>
+        <w:rPr>
+          <w:rFonts w:hint="cs"/>
+          <w:rtl/>
+        </w:rPr>
+        <w:t xml:space="preserve">דיבוג קל </w:t>
       </w:r>
       <w:r>
         <w:rPr>
@@ -3073,23 +2601,7 @@
           <w:rFonts w:hint="cs"/>
           <w:rtl/>
         </w:rPr>
-        <w:t xml:space="preserve"> קל לראות איפה יש שגיאות ומה הן, וקל מאוד לבדוק את המערכת ולראות </w:t>
-      </w:r>
-      <w:proofErr w:type="spellStart"/>
-      <w:r>
-        <w:rPr>
-          <w:rFonts w:hint="cs"/>
-          <w:rtl/>
-        </w:rPr>
-        <w:t>שהכל</w:t>
-      </w:r>
-      <w:proofErr w:type="spellEnd"/>
-      <w:r>
-        <w:rPr>
-          <w:rFonts w:hint="cs"/>
-          <w:rtl/>
-        </w:rPr>
-        <w:t xml:space="preserve"> עובר בצורה חלקה ושכל חלק עושה את העבודה שלו כמו שצריך</w:t>
+        <w:t xml:space="preserve"> קל לראות איפה יש שגיאות ומה הן, וקל מאוד לבדוק את המערכת ולראות שהכל עובר בצורה חלקה ושכל חלק עושה את העבודה שלו כמו שצריך</w:t>
       </w:r>
       <w:r>
         <w:rPr>
@@ -3320,21 +2832,12 @@
         </w:rPr>
         <w:tab/>
       </w:r>
-      <w:proofErr w:type="spellStart"/>
-      <w:r>
-        <w:rPr>
-          <w:rFonts w:hint="cs"/>
-          <w:rtl/>
-        </w:rPr>
-        <w:t>דיבוג</w:t>
-      </w:r>
-      <w:proofErr w:type="spellEnd"/>
-      <w:r>
-        <w:rPr>
-          <w:rFonts w:hint="cs"/>
-          <w:rtl/>
-        </w:rPr>
-        <w:t xml:space="preserve"> קל </w:t>
+      <w:r>
+        <w:rPr>
+          <w:rFonts w:hint="cs"/>
+          <w:rtl/>
+        </w:rPr>
+        <w:t xml:space="preserve">דיבוג קל </w:t>
       </w:r>
       <w:r>
         <w:rPr>
@@ -3447,25 +2950,7 @@
           <w:rtl/>
           <w:lang w:val="en-US"/>
         </w:rPr>
-        <w:t xml:space="preserve">להרחיב רק את החלקים שצריכים הרחבה במערכת </w:t>
-      </w:r>
-      <w:proofErr w:type="gramStart"/>
-      <w:r>
-        <w:rPr>
-          <w:rFonts w:hint="cs"/>
-          <w:rtl/>
-          <w:lang w:val="en-US"/>
-        </w:rPr>
-        <w:t>( למשל</w:t>
-      </w:r>
-      <w:proofErr w:type="gramEnd"/>
-      <w:r>
-        <w:rPr>
-          <w:rFonts w:hint="cs"/>
-          <w:rtl/>
-          <w:lang w:val="en-US"/>
-        </w:rPr>
-        <w:t xml:space="preserve"> הרחבת שטח האחסון רק ל</w:t>
+        <w:t>להרחיב רק את החלקים שצריכים הרחבה במערכת ( למשל הרחבת שטח האחסון רק ל</w:t>
       </w:r>
       <w:r>
         <w:rPr>
@@ -3479,36 +2964,8 @@
           <w:rtl/>
           <w:lang w:val="en-US"/>
         </w:rPr>
-        <w:t xml:space="preserve"> אחד </w:t>
-      </w:r>
-      <w:proofErr w:type="spellStart"/>
-      <w:r>
-        <w:rPr>
-          <w:rFonts w:hint="cs"/>
-          <w:rtl/>
-          <w:lang w:val="en-US"/>
-        </w:rPr>
-        <w:t>מסויים</w:t>
-      </w:r>
-      <w:proofErr w:type="spellEnd"/>
-      <w:r>
-        <w:rPr>
-          <w:rFonts w:hint="cs"/>
-          <w:rtl/>
-          <w:lang w:val="en-US"/>
-        </w:rPr>
-        <w:t xml:space="preserve"> </w:t>
-      </w:r>
-      <w:proofErr w:type="gramStart"/>
-      <w:r>
-        <w:rPr>
-          <w:rFonts w:hint="cs"/>
-          <w:rtl/>
-          <w:lang w:val="en-US"/>
-        </w:rPr>
-        <w:t>במערכת )</w:t>
-      </w:r>
-      <w:proofErr w:type="gramEnd"/>
+        <w:t xml:space="preserve"> אחד מסויים במערכת )</w:t>
+      </w:r>
     </w:p>
     <w:p>
       <w:pPr>
@@ -3814,25 +3271,7 @@
           <w:rtl/>
           <w:lang w:val="en-US"/>
         </w:rPr>
-        <w:t xml:space="preserve"> קיימת הפרדה בין הלקוח אשר מבקש משאבים לבין השרת אשר מספק משאבים, כל אחד מהם לא צריך להיות מודע </w:t>
-      </w:r>
-      <w:proofErr w:type="spellStart"/>
-      <w:r>
-        <w:rPr>
-          <w:rFonts w:hint="cs"/>
-          <w:rtl/>
-          <w:lang w:val="en-US"/>
-        </w:rPr>
-        <w:t>לאיך</w:t>
-      </w:r>
-      <w:proofErr w:type="spellEnd"/>
-      <w:r>
-        <w:rPr>
-          <w:rFonts w:hint="cs"/>
-          <w:rtl/>
-          <w:lang w:val="en-US"/>
-        </w:rPr>
-        <w:t xml:space="preserve"> השני בנוי, ואת שניהם אפשר לפתח בנפרד</w:t>
+        <w:t xml:space="preserve"> קיימת הפרדה בין הלקוח אשר מבקש משאבים לבין השרת אשר מספק משאבים, כל אחד מהם לא צריך להיות מודע לאיך השני בנוי, ואת שניהם אפשר לפתח בנפרד</w:t>
       </w:r>
     </w:p>
     <w:p>
@@ -3909,14 +3348,12 @@
         </w:rPr>
         <w:tab/>
       </w:r>
-      <w:proofErr w:type="spellStart"/>
       <w:r>
         <w:rPr>
           <w:lang w:val="en-US"/>
         </w:rPr>
         <w:t>Cacheability</w:t>
       </w:r>
-      <w:proofErr w:type="spellEnd"/>
       <w:r>
         <w:rPr>
           <w:rFonts w:hint="cs"/>
@@ -3970,7 +3407,6 @@
         </w:rPr>
         <w:t xml:space="preserve"> </w:t>
       </w:r>
-      <w:proofErr w:type="gramStart"/>
       <w:r>
         <w:rPr>
           <w:rtl/>
@@ -3990,16 +3426,7 @@
           <w:rtl/>
           <w:lang w:val="en-US"/>
         </w:rPr>
-        <w:t xml:space="preserve"> עקרון</w:t>
-      </w:r>
-      <w:proofErr w:type="gramEnd"/>
-      <w:r>
-        <w:rPr>
-          <w:rFonts w:hint="cs"/>
-          <w:rtl/>
-          <w:lang w:val="en-US"/>
-        </w:rPr>
-        <w:t xml:space="preserve"> אשר מבטיח </w:t>
+        <w:t xml:space="preserve"> עקרון אשר מבטיח </w:t>
       </w:r>
       <w:r>
         <w:rPr>
@@ -4236,7 +3663,6 @@
           <w:lang w:val="en-US"/>
         </w:rPr>
       </w:pPr>
-      <w:proofErr w:type="gramStart"/>
       <w:r>
         <w:rPr>
           <w:lang w:val="en-US"/>
@@ -4250,16 +3676,7 @@
           <w:rtl/>
           <w:lang w:val="en-US"/>
         </w:rPr>
-        <w:t xml:space="preserve"> -</w:t>
-      </w:r>
-      <w:proofErr w:type="gramEnd"/>
-      <w:r>
-        <w:rPr>
-          <w:rFonts w:hint="cs"/>
-          <w:rtl/>
-          <w:lang w:val="en-US"/>
-        </w:rPr>
-        <w:t xml:space="preserve"> בקשה למחוק מידע מהשרת</w:t>
+        <w:t xml:space="preserve"> - בקשה למחוק מידע מהשרת</w:t>
       </w:r>
     </w:p>
     <w:p>
@@ -4659,165 +4076,129 @@
         <w:rPr>
           <w:lang w:val="en-US"/>
         </w:rPr>
-        <w:t xml:space="preserve">swagger </w:t>
-      </w:r>
-      <w:proofErr w:type="spellStart"/>
-      <w:r>
-        <w:rPr>
-          <w:lang w:val="en-US"/>
-        </w:rPr>
-        <w:t>codgen</w:t>
-      </w:r>
-      <w:proofErr w:type="spellEnd"/>
-      <w:r>
-        <w:rPr>
-          <w:rFonts w:hint="cs"/>
-          <w:rtl/>
-          <w:lang w:val="en-US"/>
-        </w:rPr>
-        <w:t xml:space="preserve"> ניתן </w:t>
-      </w:r>
-      <w:proofErr w:type="spellStart"/>
-      <w:r>
-        <w:rPr>
-          <w:rFonts w:hint="cs"/>
-          <w:rtl/>
-          <w:lang w:val="en-US"/>
-        </w:rPr>
-        <w:t>לג'נרט</w:t>
-      </w:r>
-      <w:proofErr w:type="spellEnd"/>
-      <w:r>
-        <w:rPr>
-          <w:rFonts w:hint="cs"/>
-          <w:rtl/>
+        <w:t>swagger codgen</w:t>
+      </w:r>
+      <w:r>
+        <w:rPr>
+          <w:rFonts w:hint="cs"/>
+          <w:rtl/>
+          <w:lang w:val="en-US"/>
+        </w:rPr>
+        <w:t xml:space="preserve"> ניתן לג'נרט </w:t>
+      </w:r>
+      <w:r>
+        <w:rPr>
+          <w:lang w:val="en-US"/>
+        </w:rPr>
+        <w:t>client sdk</w:t>
+      </w:r>
+      <w:r>
+        <w:rPr>
+          <w:rFonts w:hint="cs"/>
+          <w:rtl/>
+          <w:lang w:val="en-US"/>
+        </w:rPr>
+        <w:t xml:space="preserve"> ל</w:t>
+      </w:r>
+      <w:r>
+        <w:rPr>
+          <w:lang w:val="en-US"/>
+        </w:rPr>
+        <w:t>API</w:t>
+      </w:r>
+      <w:r>
+        <w:rPr>
+          <w:rFonts w:hint="cs"/>
+          <w:rtl/>
+          <w:lang w:val="en-US"/>
+        </w:rPr>
+        <w:t xml:space="preserve"> בצורה אוטומטית.</w:t>
+      </w:r>
+      <w:r>
+        <w:rPr>
           <w:lang w:val="en-US"/>
         </w:rPr>
         <w:t xml:space="preserve"> </w:t>
       </w:r>
-      <w:r>
-        <w:rPr>
-          <w:lang w:val="en-US"/>
-        </w:rPr>
-        <w:t xml:space="preserve">client </w:t>
-      </w:r>
-      <w:proofErr w:type="spellStart"/>
-      <w:r>
-        <w:rPr>
-          <w:lang w:val="en-US"/>
-        </w:rPr>
-        <w:t>sdk</w:t>
-      </w:r>
-      <w:proofErr w:type="spellEnd"/>
-      <w:r>
-        <w:rPr>
-          <w:rFonts w:hint="cs"/>
-          <w:rtl/>
-          <w:lang w:val="en-US"/>
-        </w:rPr>
-        <w:t xml:space="preserve"> ל</w:t>
-      </w:r>
-      <w:r>
-        <w:rPr>
-          <w:lang w:val="en-US"/>
-        </w:rPr>
-        <w:t>API</w:t>
-      </w:r>
-      <w:r>
-        <w:rPr>
-          <w:rFonts w:hint="cs"/>
-          <w:rtl/>
-          <w:lang w:val="en-US"/>
-        </w:rPr>
-        <w:t xml:space="preserve"> בצורה אוטומטית.</w:t>
-      </w:r>
-      <w:r>
-        <w:rPr>
-          <w:lang w:val="en-US"/>
+    </w:p>
+    <w:p>
+      <w:pPr>
+        <w:bidi/>
+        <w:rPr>
+          <w:rtl/>
+        </w:rPr>
+      </w:pPr>
+      <w:r>
+        <w:rPr>
+          <w:rtl/>
+        </w:rPr>
+        <w:t xml:space="preserve">נועד רק לתיעוד? אם לא תאר מה עוד שימוש אפשרי בו </w:t>
+      </w:r>
+      <w:r>
+        <w:t>swagger</w:t>
+      </w:r>
+      <w:r>
+        <w:rPr>
+          <w:rtl/>
         </w:rPr>
         <w:t xml:space="preserve"> </w:t>
       </w:r>
-    </w:p>
-    <w:p>
-      <w:pPr>
-        <w:bidi/>
-        <w:rPr>
-          <w:rtl/>
-        </w:rPr>
-      </w:pPr>
-      <w:r>
-        <w:rPr>
-          <w:rtl/>
-        </w:rPr>
-        <w:t xml:space="preserve">נועד רק לתיעוד? אם לא תאר מה עוד שימוש אפשרי בו </w:t>
-      </w:r>
-      <w:r>
+      <w:r>
+        <w:rPr>
+          <w:rtl/>
+        </w:rPr>
+        <w:t>–</w:t>
+      </w:r>
+      <w:r>
+        <w:rPr>
+          <w:rtl/>
+        </w:rPr>
+        <w:t xml:space="preserve"> האם</w:t>
+      </w:r>
+    </w:p>
+    <w:p>
+      <w:pPr>
+        <w:bidi/>
+        <w:rPr>
+          <w:rFonts w:hint="cs"/>
+          <w:rtl/>
+          <w:lang w:val="en-US"/>
+        </w:rPr>
+      </w:pPr>
+      <w:r>
+        <w:rPr>
+          <w:rtl/>
+        </w:rPr>
+        <w:tab/>
+      </w:r>
+      <w:r>
+        <w:rPr>
+          <w:rFonts w:hint="cs"/>
+          <w:rtl/>
+          <w:lang w:val="en-US"/>
+        </w:rPr>
+        <w:t>שימוש נוסף ל</w:t>
+      </w:r>
+      <w:r>
+        <w:rPr>
+          <w:lang w:val="en-US"/>
+        </w:rPr>
         <w:t>swagger</w:t>
       </w:r>
       <w:r>
         <w:rPr>
-          <w:rtl/>
-        </w:rPr>
-        <w:t xml:space="preserve"> </w:t>
-      </w:r>
-      <w:r>
-        <w:rPr>
-          <w:rtl/>
-        </w:rPr>
-        <w:t>–</w:t>
-      </w:r>
-      <w:r>
-        <w:rPr>
-          <w:rtl/>
-        </w:rPr>
-        <w:t xml:space="preserve"> האם</w:t>
-      </w:r>
-    </w:p>
-    <w:p>
-      <w:pPr>
-        <w:bidi/>
-        <w:rPr>
-          <w:rFonts w:hint="cs"/>
-          <w:rtl/>
-          <w:lang w:val="en-US"/>
-        </w:rPr>
-      </w:pPr>
-      <w:r>
-        <w:rPr>
-          <w:rtl/>
-        </w:rPr>
-        <w:tab/>
-      </w:r>
-      <w:r>
-        <w:rPr>
-          <w:rFonts w:hint="cs"/>
-          <w:rtl/>
-          <w:lang w:val="en-US"/>
-        </w:rPr>
-        <w:t>שימוש נוסף ל</w:t>
-      </w:r>
-      <w:r>
-        <w:rPr>
-          <w:lang w:val="en-US"/>
-        </w:rPr>
-        <w:t>swagger</w:t>
-      </w:r>
-      <w:r>
-        <w:rPr>
           <w:rFonts w:hint="cs"/>
           <w:rtl/>
           <w:lang w:val="en-US"/>
         </w:rPr>
         <w:t xml:space="preserve"> הוא בדיקה וולידציה של ה</w:t>
       </w:r>
-      <w:proofErr w:type="spellStart"/>
       <w:r>
         <w:rPr>
           <w:lang w:val="en-US"/>
         </w:rPr>
         <w:t>api</w:t>
       </w:r>
-      <w:proofErr w:type="spellEnd"/>
     </w:p>
     <w:p>
       <w:pPr>
@@ -4858,6 +4239,26 @@
     <w:p>
       <w:pPr>
         <w:bidi/>
+        <w:ind w:left="720"/>
+        <w:rPr>
+          <w:rFonts w:hint="cs"/>
+          <w:rtl/>
+        </w:rPr>
+      </w:pPr>
+      <w:r>
+        <w:rPr>
+          <w:rFonts w:hint="cs"/>
+          <w:rtl/>
+        </w:rPr>
+        <w:t>תפקידה של גרפנה הוא להציג נתונים ולאפשר למשתמש לעשות שאילתות על המידע, לקבל התראות, מטריקות, ולוגים על המידע. בעוד שמקור הנתונים עצמו מכיל את כל הנתונים, גרפנה לא מחזיקה בנתונים אלא רק מנגישה אותם למשתמש.</w:t>
+      </w:r>
+    </w:p>
+    <w:p>
+      <w:pPr>
+        <w:bidi/>
+        <w:rPr>
+          <w:rtl/>
+        </w:rPr>
       </w:pPr>
       <w:r>
         <w:rPr>
@@ -4878,12 +4279,176 @@
     <w:p>
       <w:pPr>
         <w:bidi/>
+        <w:ind w:left="720"/>
+        <w:rPr>
+          <w:rtl/>
+          <w:lang w:val="en-US"/>
+        </w:rPr>
+      </w:pPr>
+      <w:r>
+        <w:rPr>
+          <w:lang w:val="en-US"/>
+        </w:rPr>
+        <w:t>Dashboard</w:t>
+      </w:r>
+      <w:r>
+        <w:rPr>
+          <w:rFonts w:hint="cs"/>
+          <w:rtl/>
+          <w:lang w:val="en-US"/>
+        </w:rPr>
+        <w:t xml:space="preserve"> </w:t>
+      </w:r>
+      <w:r>
+        <w:rPr>
+          <w:rtl/>
+          <w:lang w:val="en-US"/>
+        </w:rPr>
+        <w:t>–</w:t>
+      </w:r>
+      <w:r>
+        <w:rPr>
+          <w:rFonts w:hint="cs"/>
+          <w:rtl/>
+          <w:lang w:val="en-US"/>
+        </w:rPr>
+        <w:t xml:space="preserve"> ממשק אינטרקטיבי שניתן להתאים באופן אישי ומאפשר לראות, לנתר, ולנתח מידע ממספר מקורות</w:t>
+      </w:r>
+    </w:p>
+    <w:p>
+      <w:pPr>
+        <w:bidi/>
+        <w:ind w:left="720"/>
+        <w:rPr>
+          <w:rtl/>
+          <w:lang w:val="en-US"/>
+        </w:rPr>
+      </w:pPr>
+      <w:r>
+        <w:rPr>
+          <w:lang w:val="en-US"/>
+        </w:rPr>
+        <w:t>Panel</w:t>
+      </w:r>
+      <w:r>
+        <w:rPr>
+          <w:rFonts w:hint="cs"/>
+          <w:rtl/>
+          <w:lang w:val="en-US"/>
+        </w:rPr>
+        <w:t xml:space="preserve"> -</w:t>
+      </w:r>
+      <w:r>
+        <w:rPr>
+          <w:lang w:val="en-US"/>
+        </w:rPr>
+        <w:t xml:space="preserve"> </w:t>
+      </w:r>
+      <w:r>
+        <w:rPr>
+          <w:rFonts w:hint="cs"/>
+          <w:rtl/>
+          <w:lang w:val="en-US"/>
+        </w:rPr>
+        <w:t xml:space="preserve"> ה</w:t>
+      </w:r>
+      <w:r>
+        <w:rPr>
+          <w:lang w:val="en-US"/>
+        </w:rPr>
+        <w:t>building block</w:t>
+      </w:r>
+      <w:r>
+        <w:rPr>
+          <w:rFonts w:hint="cs"/>
+          <w:rtl/>
+          <w:lang w:val="en-US"/>
+        </w:rPr>
+        <w:t xml:space="preserve"> הבסיסי שמרכיב </w:t>
+      </w:r>
+      <w:r>
+        <w:rPr>
+          <w:lang w:val="en-US"/>
+        </w:rPr>
+        <w:t>dashboard</w:t>
+      </w:r>
+      <w:r>
+        <w:rPr>
+          <w:rFonts w:hint="cs"/>
+          <w:rtl/>
+          <w:lang w:val="en-US"/>
+        </w:rPr>
+        <w:t xml:space="preserve">. כל </w:t>
+      </w:r>
+      <w:r>
+        <w:rPr>
+          <w:lang w:val="en-US"/>
+        </w:rPr>
+        <w:t>panel</w:t>
+      </w:r>
+      <w:r>
+        <w:rPr>
+          <w:rFonts w:hint="cs"/>
+          <w:rtl/>
+          <w:lang w:val="en-US"/>
+        </w:rPr>
+        <w:t xml:space="preserve"> מכיל שאילתה על מקור מידע</w:t>
+      </w:r>
+    </w:p>
+    <w:p>
+      <w:pPr>
+        <w:bidi/>
+        <w:ind w:left="720"/>
+        <w:rPr>
+          <w:rFonts w:hint="cs"/>
+          <w:rtl/>
+          <w:lang w:val="en-US"/>
+        </w:rPr>
+      </w:pPr>
+      <w:r>
+        <w:rPr>
+          <w:rFonts w:hint="cs"/>
+          <w:rtl/>
+          <w:lang w:val="en-US"/>
+        </w:rPr>
+        <w:t>וסוג ויזואליזציה</w:t>
+      </w:r>
+    </w:p>
+    <w:p>
+      <w:pPr>
+        <w:bidi/>
       </w:pPr>
       <w:r>
         <w:rPr>
           <w:rtl/>
         </w:rPr>
         <w:t>- מול אילו מקורות מידע נפוצים גרפנה יודעת לעבוד</w:t>
+      </w:r>
+    </w:p>
+    <w:p>
+      <w:pPr>
+        <w:bidi/>
+        <w:rPr>
+          <w:rtl/>
+        </w:rPr>
+      </w:pPr>
+      <w:r>
+        <w:tab/>
+        <w:t>mySQL , PostgreSQL,Elasticsearch,openTSDB,prometheus</w:t>
+      </w:r>
+    </w:p>
+    <w:p>
+      <w:pPr>
+        <w:bidi/>
+        <w:rPr>
+          <w:lang w:val="en-US"/>
+        </w:rPr>
+      </w:pPr>
+      <w:r>
+        <w:rPr>
+          <w:rtl/>
+        </w:rPr>
+        <w:tab/>
       </w:r>
     </w:p>
     <w:p>
@@ -4975,11 +4540,9 @@
       <w:pPr>
         <w:bidi/>
       </w:pPr>
-      <w:proofErr w:type="gramStart"/>
       <w:r>
         <w:t>?BE</w:t>
       </w:r>
-      <w:proofErr w:type="gramEnd"/>
       <w:r>
         <w:rPr>
           <w:rtl/>
@@ -5029,11 +4592,9 @@
       <w:pPr>
         <w:bidi/>
       </w:pPr>
-      <w:proofErr w:type="gramStart"/>
       <w:r>
         <w:t>?API</w:t>
       </w:r>
-      <w:proofErr w:type="gramEnd"/>
       <w:r>
         <w:rPr>
           <w:rtl/>

</xml_diff>

<commit_message>
finished the rabbitmq questions
</commit_message>
<xml_diff>
--- a/hfifa_questions_1.docx
+++ b/hfifa_questions_1.docx
@@ -56,8 +56,13 @@
       <w:pPr>
         <w:bidi/>
       </w:pPr>
-      <w:r>
-        <w:t>[ ] word</w:t>
+      <w:proofErr w:type="gramStart"/>
+      <w:r>
+        <w:t>[ ]</w:t>
+      </w:r>
+      <w:proofErr w:type="gramEnd"/>
+      <w:r>
+        <w:t xml:space="preserve"> word</w:t>
       </w:r>
       <w:r>
         <w:rPr>
@@ -74,7 +79,21 @@
         <w:rPr>
           <w:rtl/>
         </w:rPr>
-        <w:t xml:space="preserve">וכל למידה חדשה תוסיפו כברנאץ. </w:t>
+        <w:t xml:space="preserve">וכל למידה חדשה תוסיפו </w:t>
+      </w:r>
+      <w:proofErr w:type="spellStart"/>
+      <w:r>
+        <w:rPr>
+          <w:rtl/>
+        </w:rPr>
+        <w:t>כברנאץ</w:t>
+      </w:r>
+      <w:proofErr w:type="spellEnd"/>
+      <w:r>
+        <w:rPr>
+          <w:rtl/>
+        </w:rPr>
+        <w:t xml:space="preserve">. </w:t>
       </w:r>
       <w:r>
         <w:t>git</w:t>
@@ -111,9 +130,11 @@
       <w:pPr>
         <w:bidi/>
       </w:pPr>
+      <w:proofErr w:type="gramStart"/>
       <w:r>
         <w:t>?SQL</w:t>
       </w:r>
+      <w:proofErr w:type="gramEnd"/>
       <w:r>
         <w:rPr>
           <w:rtl/>
@@ -148,7 +169,21 @@
         <w:rPr>
           <w:rtl/>
         </w:rPr>
-        <w:t xml:space="preserve"> המידע נשמר במבנה רלציוני בטבל</w:t>
+        <w:t xml:space="preserve"> המידע נשמר במבנה </w:t>
+      </w:r>
+      <w:proofErr w:type="spellStart"/>
+      <w:r>
+        <w:rPr>
+          <w:rtl/>
+        </w:rPr>
+        <w:t>רלציוני</w:t>
+      </w:r>
+      <w:proofErr w:type="spellEnd"/>
+      <w:r>
+        <w:rPr>
+          <w:rtl/>
+        </w:rPr>
+        <w:t xml:space="preserve"> בטבל</w:t>
       </w:r>
       <w:r>
         <w:rPr>
@@ -200,8 +235,16 @@
         <w:rPr>
           <w:rtl/>
         </w:rPr>
-        <w:t xml:space="preserve"> מראש), וב</w:t>
-      </w:r>
+        <w:t xml:space="preserve"> מראש), </w:t>
+      </w:r>
+      <w:proofErr w:type="spellStart"/>
+      <w:r>
+        <w:rPr>
+          <w:rtl/>
+        </w:rPr>
+        <w:t>וב</w:t>
+      </w:r>
+      <w:proofErr w:type="spellEnd"/>
       <w:r>
         <w:t>NOSQL</w:t>
       </w:r>
@@ -246,6 +289,7 @@
         </w:rPr>
         <w:t xml:space="preserve">, </w:t>
       </w:r>
+      <w:proofErr w:type="spellStart"/>
       <w:r>
         <w:rPr>
           <w:color w:val="273239"/>
@@ -254,6 +298,7 @@
         </w:rPr>
         <w:t>וכו</w:t>
       </w:r>
+      <w:proofErr w:type="spellEnd"/>
       <w:r>
         <w:rPr>
           <w:color w:val="273239"/>
@@ -325,14 +370,44 @@
         </w:rPr>
         <w:t xml:space="preserve">נעדיף להשתמש ב </w:t>
       </w:r>
+      <w:proofErr w:type="spellStart"/>
       <w:r>
         <w:t>mongoDB</w:t>
       </w:r>
-      <w:r>
-        <w:rPr>
-          <w:rtl/>
-        </w:rPr>
-        <w:t xml:space="preserve"> כאשר למידע שאחנו שומרים אין סכמה מוגדרת מראש, וכאשר לא נרצה לשמור מידע רלציוני, בניגוד ל </w:t>
+      <w:proofErr w:type="spellEnd"/>
+      <w:r>
+        <w:rPr>
+          <w:rtl/>
+        </w:rPr>
+        <w:t xml:space="preserve"> כאשר למידע </w:t>
+      </w:r>
+      <w:proofErr w:type="spellStart"/>
+      <w:r>
+        <w:rPr>
+          <w:rtl/>
+        </w:rPr>
+        <w:t>שאחנו</w:t>
+      </w:r>
+      <w:proofErr w:type="spellEnd"/>
+      <w:r>
+        <w:rPr>
+          <w:rtl/>
+        </w:rPr>
+        <w:t xml:space="preserve"> שומרים אין סכמה מוגדרת מראש, וכאשר לא נרצה לשמור מידע </w:t>
+      </w:r>
+      <w:proofErr w:type="spellStart"/>
+      <w:r>
+        <w:rPr>
+          <w:rtl/>
+        </w:rPr>
+        <w:t>רלציוני</w:t>
+      </w:r>
+      <w:proofErr w:type="spellEnd"/>
+      <w:r>
+        <w:rPr>
+          <w:rtl/>
+        </w:rPr>
+        <w:t xml:space="preserve">, בניגוד ל </w:t>
       </w:r>
       <w:r>
         <w:t>SQL</w:t>
@@ -380,7 +455,14 @@
         <w:rPr>
           <w:rtl/>
         </w:rPr>
-        <w:t xml:space="preserve"> רלציוני</w:t>
+        <w:t xml:space="preserve"> </w:t>
+      </w:r>
+      <w:proofErr w:type="spellStart"/>
+      <w:r>
+        <w:rPr>
+          <w:rtl/>
+        </w:rPr>
+        <w:t>רלציוני</w:t>
       </w:r>
       <w:r>
         <w:rPr>
@@ -389,11 +471,26 @@
         </w:rPr>
         <w:t>ת</w:t>
       </w:r>
-      <w:r>
-        <w:rPr>
-          <w:rtl/>
-        </w:rPr>
-        <w:t xml:space="preserve"> ( טבלאות שונות מקושרות אחת לשניה בעזרת </w:t>
+      <w:proofErr w:type="spellEnd"/>
+      <w:r>
+        <w:rPr>
+          <w:rtl/>
+        </w:rPr>
+        <w:t xml:space="preserve"> ( טבלאות שונות מקושרות אחת </w:t>
+      </w:r>
+      <w:proofErr w:type="spellStart"/>
+      <w:r>
+        <w:rPr>
+          <w:rtl/>
+        </w:rPr>
+        <w:t>לשניה</w:t>
+      </w:r>
+      <w:proofErr w:type="spellEnd"/>
+      <w:r>
+        <w:rPr>
+          <w:rtl/>
+        </w:rPr>
+        <w:t xml:space="preserve"> בעזרת </w:t>
       </w:r>
       <w:r>
         <w:t>foreign keys</w:t>
@@ -691,7 +788,55 @@
           <w:rFonts w:hint="cs"/>
           <w:rtl/>
         </w:rPr>
-        <w:t xml:space="preserve"> בניוגד לדאטאבייסים רלציונים </w:t>
+        <w:t xml:space="preserve"> </w:t>
+      </w:r>
+      <w:proofErr w:type="spellStart"/>
+      <w:r>
+        <w:rPr>
+          <w:rFonts w:hint="cs"/>
+          <w:rtl/>
+        </w:rPr>
+        <w:t>בניוגד</w:t>
+      </w:r>
+      <w:proofErr w:type="spellEnd"/>
+      <w:r>
+        <w:rPr>
+          <w:rFonts w:hint="cs"/>
+          <w:rtl/>
+        </w:rPr>
+        <w:t xml:space="preserve"> </w:t>
+      </w:r>
+      <w:proofErr w:type="spellStart"/>
+      <w:r>
+        <w:rPr>
+          <w:rFonts w:hint="cs"/>
+          <w:rtl/>
+        </w:rPr>
+        <w:t>לדאטאבייסים</w:t>
+      </w:r>
+      <w:proofErr w:type="spellEnd"/>
+      <w:r>
+        <w:rPr>
+          <w:rFonts w:hint="cs"/>
+          <w:rtl/>
+        </w:rPr>
+        <w:t xml:space="preserve"> </w:t>
+      </w:r>
+      <w:proofErr w:type="spellStart"/>
+      <w:r>
+        <w:rPr>
+          <w:rFonts w:hint="cs"/>
+          <w:rtl/>
+        </w:rPr>
+        <w:t>רלציונים</w:t>
+      </w:r>
+      <w:proofErr w:type="spellEnd"/>
+      <w:r>
+        <w:rPr>
+          <w:rFonts w:hint="cs"/>
+          <w:rtl/>
+        </w:rPr>
+        <w:t xml:space="preserve"> </w:t>
       </w:r>
       <w:r>
         <w:rPr>
@@ -749,8 +894,13 @@
         <w:t>מגבלת גודל ל</w:t>
       </w:r>
       <w:r>
-        <w:t xml:space="preserve"> Documen</w:t>
-      </w:r>
+        <w:t xml:space="preserve"> </w:t>
+      </w:r>
+      <w:proofErr w:type="spellStart"/>
+      <w:r>
+        <w:t>Documen</w:t>
+      </w:r>
+      <w:proofErr w:type="spellEnd"/>
       <w:r>
         <w:rPr>
           <w:rFonts w:hint="cs"/>
@@ -839,13 +989,23 @@
           <w:lang w:val="en-US"/>
         </w:rPr>
       </w:pPr>
-      <w:r>
-        <w:rPr>
-          <w:rFonts w:hint="cs"/>
-          <w:rtl/>
-          <w:lang w:val="en-US"/>
-        </w:rPr>
-        <w:t>ברדיס המידע נשמר על זיכרו</w:t>
+      <w:proofErr w:type="spellStart"/>
+      <w:r>
+        <w:rPr>
+          <w:rFonts w:hint="cs"/>
+          <w:rtl/>
+          <w:lang w:val="en-US"/>
+        </w:rPr>
+        <w:t>ברדיס</w:t>
+      </w:r>
+      <w:proofErr w:type="spellEnd"/>
+      <w:r>
+        <w:rPr>
+          <w:rFonts w:hint="cs"/>
+          <w:rtl/>
+          <w:lang w:val="en-US"/>
+        </w:rPr>
+        <w:t xml:space="preserve"> המידע נשמר על זיכרו</w:t>
       </w:r>
       <w:r>
         <w:rPr>
@@ -875,7 +1035,25 @@
           <w:rtl/>
           <w:lang w:val="en-US"/>
         </w:rPr>
-        <w:t xml:space="preserve"> אשר מהיר בהרבה מדיסק אחסון רגיל. בנוסף, רדיס פועל על </w:t>
+        <w:t xml:space="preserve"> אשר מהיר בהרבה מדיסק אחסון רגיל. בנוסף, </w:t>
+      </w:r>
+      <w:proofErr w:type="spellStart"/>
+      <w:r>
+        <w:rPr>
+          <w:rFonts w:hint="cs"/>
+          <w:rtl/>
+          <w:lang w:val="en-US"/>
+        </w:rPr>
+        <w:t>רדיס</w:t>
+      </w:r>
+      <w:proofErr w:type="spellEnd"/>
+      <w:r>
+        <w:rPr>
+          <w:rFonts w:hint="cs"/>
+          <w:rtl/>
+          <w:lang w:val="en-US"/>
+        </w:rPr>
+        <w:t xml:space="preserve"> פועל על </w:t>
       </w:r>
       <w:r>
         <w:rPr>
@@ -933,9 +1111,11 @@
           <w:rtl/>
         </w:rPr>
       </w:pPr>
+      <w:proofErr w:type="gramStart"/>
       <w:r>
         <w:t>?Redis</w:t>
       </w:r>
+      <w:proofErr w:type="gramEnd"/>
       <w:r>
         <w:rPr>
           <w:rtl/>
@@ -962,7 +1142,23 @@
           <w:rFonts w:hint="cs"/>
           <w:rtl/>
         </w:rPr>
-        <w:t>הסיבות הנפוצות ביותר לשימוש ברדיס הן</w:t>
+        <w:t xml:space="preserve">הסיבות הנפוצות ביותר לשימוש </w:t>
+      </w:r>
+      <w:proofErr w:type="spellStart"/>
+      <w:r>
+        <w:rPr>
+          <w:rFonts w:hint="cs"/>
+          <w:rtl/>
+        </w:rPr>
+        <w:t>ברדיס</w:t>
+      </w:r>
+      <w:proofErr w:type="spellEnd"/>
+      <w:r>
+        <w:rPr>
+          <w:rFonts w:hint="cs"/>
+          <w:rtl/>
+        </w:rPr>
+        <w:t xml:space="preserve"> הן</w:t>
       </w:r>
       <w:r>
         <w:rPr>
@@ -1015,7 +1211,25 @@
           <w:rtl/>
           <w:lang w:val="en-US"/>
         </w:rPr>
-        <w:t xml:space="preserve"> שמירת מידע שמשתמשים בו בתדירות גבוהה לזמן מוגבל כדי לאפשר איחזור של המידע מהר יותר</w:t>
+        <w:t xml:space="preserve"> שמירת מידע שמשתמשים בו בתדירות גבוהה לזמן מוגבל כדי לאפשר </w:t>
+      </w:r>
+      <w:proofErr w:type="spellStart"/>
+      <w:r>
+        <w:rPr>
+          <w:rFonts w:hint="cs"/>
+          <w:rtl/>
+          <w:lang w:val="en-US"/>
+        </w:rPr>
+        <w:t>איחזור</w:t>
+      </w:r>
+      <w:proofErr w:type="spellEnd"/>
+      <w:r>
+        <w:rPr>
+          <w:rFonts w:hint="cs"/>
+          <w:rtl/>
+          <w:lang w:val="en-US"/>
+        </w:rPr>
+        <w:t xml:space="preserve"> של המידע מהר יותר</w:t>
       </w:r>
     </w:p>
     <w:p>
@@ -1055,7 +1269,43 @@
           <w:rtl/>
           <w:lang w:val="en-US"/>
         </w:rPr>
-        <w:t xml:space="preserve"> מאפשר למפרסמים לפרסם הודעות לנושאים מסויימים ולרשומים להירשם לנושא מסויים ולקבל כל הודעה בנושא הזה מבלי שהרשום והמפרסם יכירו אחד את השני (</w:t>
+        <w:t xml:space="preserve"> מאפשר למפרסמים לפרסם הודעות לנושאים </w:t>
+      </w:r>
+      <w:proofErr w:type="spellStart"/>
+      <w:r>
+        <w:rPr>
+          <w:rFonts w:hint="cs"/>
+          <w:rtl/>
+          <w:lang w:val="en-US"/>
+        </w:rPr>
+        <w:t>מסויימים</w:t>
+      </w:r>
+      <w:proofErr w:type="spellEnd"/>
+      <w:r>
+        <w:rPr>
+          <w:rFonts w:hint="cs"/>
+          <w:rtl/>
+          <w:lang w:val="en-US"/>
+        </w:rPr>
+        <w:t xml:space="preserve"> ולרשומים להירשם לנושא </w:t>
+      </w:r>
+      <w:proofErr w:type="spellStart"/>
+      <w:r>
+        <w:rPr>
+          <w:rFonts w:hint="cs"/>
+          <w:rtl/>
+          <w:lang w:val="en-US"/>
+        </w:rPr>
+        <w:t>מסויים</w:t>
+      </w:r>
+      <w:proofErr w:type="spellEnd"/>
+      <w:r>
+        <w:rPr>
+          <w:rFonts w:hint="cs"/>
+          <w:rtl/>
+          <w:lang w:val="en-US"/>
+        </w:rPr>
+        <w:t xml:space="preserve"> ולקבל כל הודעה בנושא הזה מבלי שהרשום והמפרסם יכירו אחד את השני (</w:t>
       </w:r>
       <w:r>
         <w:rPr>
@@ -1079,9 +1329,11 @@
           <w:lang w:val="en-US"/>
         </w:rPr>
       </w:pPr>
+      <w:proofErr w:type="gramStart"/>
       <w:r>
         <w:t>?Redis</w:t>
       </w:r>
+      <w:proofErr w:type="gramEnd"/>
       <w:r>
         <w:rPr>
           <w:rtl/>
@@ -1131,7 +1383,43 @@
           <w:rtl/>
           <w:lang w:val="en-US"/>
         </w:rPr>
-        <w:t xml:space="preserve"> מערך של ביתים או מילים ששומר אלמנטים(בדרך כלל אותיות) בעזרת קידוד</w:t>
+        <w:t xml:space="preserve"> מערך של </w:t>
+      </w:r>
+      <w:proofErr w:type="spellStart"/>
+      <w:r>
+        <w:rPr>
+          <w:rFonts w:hint="cs"/>
+          <w:rtl/>
+          <w:lang w:val="en-US"/>
+        </w:rPr>
+        <w:t>ביתים</w:t>
+      </w:r>
+      <w:proofErr w:type="spellEnd"/>
+      <w:r>
+        <w:rPr>
+          <w:rFonts w:hint="cs"/>
+          <w:rtl/>
+          <w:lang w:val="en-US"/>
+        </w:rPr>
+        <w:t xml:space="preserve"> או מילים ששומר </w:t>
+      </w:r>
+      <w:proofErr w:type="gramStart"/>
+      <w:r>
+        <w:rPr>
+          <w:rFonts w:hint="cs"/>
+          <w:rtl/>
+          <w:lang w:val="en-US"/>
+        </w:rPr>
+        <w:t>אלמנטים(</w:t>
+      </w:r>
+      <w:proofErr w:type="gramEnd"/>
+      <w:r>
+        <w:rPr>
+          <w:rFonts w:hint="cs"/>
+          <w:rtl/>
+          <w:lang w:val="en-US"/>
+        </w:rPr>
+        <w:t>בדרך כלל אותיות) בעזרת קידוד</w:t>
       </w:r>
     </w:p>
     <w:p>
@@ -1150,6 +1438,7 @@
         <w:lastRenderedPageBreak/>
         <w:tab/>
       </w:r>
+      <w:proofErr w:type="gramStart"/>
       <w:r>
         <w:rPr>
           <w:lang w:val="en-US"/>
@@ -1162,7 +1451,16 @@
           <w:rtl/>
           <w:lang w:val="en-US"/>
         </w:rPr>
-        <w:t xml:space="preserve"> - מבנה נתונים ששומר סט של אלמנטים ייחודיים</w:t>
+        <w:t xml:space="preserve"> -</w:t>
+      </w:r>
+      <w:proofErr w:type="gramEnd"/>
+      <w:r>
+        <w:rPr>
+          <w:rFonts w:hint="cs"/>
+          <w:rtl/>
+          <w:lang w:val="en-US"/>
+        </w:rPr>
+        <w:t xml:space="preserve"> מבנה נתונים ששומר סט של אלמנטים ייחודיים</w:t>
       </w:r>
     </w:p>
     <w:p>
@@ -1223,8 +1521,18 @@
           <w:rtl/>
           <w:lang w:val="en-US"/>
         </w:rPr>
-        <w:t xml:space="preserve"> המסודרים לפי דירוג מסויים</w:t>
-      </w:r>
+        <w:t xml:space="preserve"> המסודרים לפי דירוג </w:t>
+      </w:r>
+      <w:proofErr w:type="spellStart"/>
+      <w:r>
+        <w:rPr>
+          <w:rFonts w:hint="cs"/>
+          <w:rtl/>
+          <w:lang w:val="en-US"/>
+        </w:rPr>
+        <w:t>מסויים</w:t>
+      </w:r>
+      <w:proofErr w:type="spellEnd"/>
     </w:p>
     <w:p>
       <w:pPr>
@@ -1543,20 +1851,65 @@
           <w:lang w:val="en-US"/>
         </w:rPr>
       </w:pPr>
-      <w:r>
-        <w:rPr>
-          <w:rFonts w:hint="cs"/>
-          <w:rtl/>
-        </w:rPr>
-        <w:t xml:space="preserve">מנגון פינוי הזיכרון </w:t>
-      </w:r>
-      <w:r>
-        <w:rPr>
-          <w:rFonts w:hint="cs"/>
-          <w:rtl/>
-          <w:lang w:val="en-US"/>
-        </w:rPr>
-        <w:t>מונע מהשרת לקרוס עקב עומס בזיכרון, שומר על ביצועיים אפטימלים, ומונע ממידע לא מעודכן להישאר בשרת. למנגנון יש חשיבות רבה ובלעדיו השרת עלול לקרוס או שביצוכעיו יהיו איטיים.</w:t>
+      <w:proofErr w:type="spellStart"/>
+      <w:r>
+        <w:rPr>
+          <w:rFonts w:hint="cs"/>
+          <w:rtl/>
+        </w:rPr>
+        <w:t>מנגון</w:t>
+      </w:r>
+      <w:proofErr w:type="spellEnd"/>
+      <w:r>
+        <w:rPr>
+          <w:rFonts w:hint="cs"/>
+          <w:rtl/>
+        </w:rPr>
+        <w:t xml:space="preserve"> פינוי הזיכרון </w:t>
+      </w:r>
+      <w:r>
+        <w:rPr>
+          <w:rFonts w:hint="cs"/>
+          <w:rtl/>
+          <w:lang w:val="en-US"/>
+        </w:rPr>
+        <w:t xml:space="preserve">מונע מהשרת לקרוס עקב עומס בזיכרון, שומר על ביצועיים </w:t>
+      </w:r>
+      <w:proofErr w:type="spellStart"/>
+      <w:r>
+        <w:rPr>
+          <w:rFonts w:hint="cs"/>
+          <w:rtl/>
+          <w:lang w:val="en-US"/>
+        </w:rPr>
+        <w:t>אפטימלים</w:t>
+      </w:r>
+      <w:proofErr w:type="spellEnd"/>
+      <w:r>
+        <w:rPr>
+          <w:rFonts w:hint="cs"/>
+          <w:rtl/>
+          <w:lang w:val="en-US"/>
+        </w:rPr>
+        <w:t xml:space="preserve">, ומונע ממידע לא מעודכן להישאר בשרת. למנגנון יש חשיבות רבה ובלעדיו השרת עלול לקרוס או </w:t>
+      </w:r>
+      <w:proofErr w:type="spellStart"/>
+      <w:r>
+        <w:rPr>
+          <w:rFonts w:hint="cs"/>
+          <w:rtl/>
+          <w:lang w:val="en-US"/>
+        </w:rPr>
+        <w:t>שביצוכעיו</w:t>
+      </w:r>
+      <w:proofErr w:type="spellEnd"/>
+      <w:r>
+        <w:rPr>
+          <w:rFonts w:hint="cs"/>
+          <w:rtl/>
+          <w:lang w:val="en-US"/>
+        </w:rPr>
+        <w:t xml:space="preserve"> יהיו איטיים.</w:t>
       </w:r>
     </w:p>
     <w:p>
@@ -1594,13 +1947,32 @@
         <w:bidi/>
       </w:pPr>
       <w:r>
-        <w:t>’topics, partitions, producers, consumers</w:t>
-      </w:r>
-      <w:r>
-        <w:rPr>
-          <w:rtl/>
-        </w:rPr>
-        <w:t xml:space="preserve"> : - הסבר את המושגים הבאים</w:t>
+        <w:t>’</w:t>
+      </w:r>
+      <w:proofErr w:type="gramStart"/>
+      <w:r>
+        <w:t>topics</w:t>
+      </w:r>
+      <w:proofErr w:type="gramEnd"/>
+      <w:r>
+        <w:t xml:space="preserve">, partitions, producers, </w:t>
+      </w:r>
+      <w:proofErr w:type="gramStart"/>
+      <w:r>
+        <w:t>consumers</w:t>
+      </w:r>
+      <w:r>
+        <w:rPr>
+          <w:rtl/>
+        </w:rPr>
+        <w:t xml:space="preserve"> :</w:t>
+      </w:r>
+      <w:proofErr w:type="gramEnd"/>
+      <w:r>
+        <w:rPr>
+          <w:rtl/>
+        </w:rPr>
+        <w:t xml:space="preserve"> - הסבר את המושגים הבאים</w:t>
       </w:r>
     </w:p>
     <w:p>
@@ -1634,7 +2006,23 @@
           <w:rFonts w:hint="cs"/>
           <w:rtl/>
         </w:rPr>
-        <w:t xml:space="preserve"> נושא מסויים שאליו </w:t>
+        <w:t xml:space="preserve"> נושא </w:t>
+      </w:r>
+      <w:proofErr w:type="spellStart"/>
+      <w:r>
+        <w:rPr>
+          <w:rFonts w:hint="cs"/>
+          <w:rtl/>
+        </w:rPr>
+        <w:t>מסויים</w:t>
+      </w:r>
+      <w:proofErr w:type="spellEnd"/>
+      <w:r>
+        <w:rPr>
+          <w:rFonts w:hint="cs"/>
+          <w:rtl/>
+        </w:rPr>
+        <w:t xml:space="preserve"> שאליו </w:t>
       </w:r>
       <w:r>
         <w:rPr>
@@ -1679,6 +2067,7 @@
         </w:rPr>
         <w:tab/>
       </w:r>
+      <w:proofErr w:type="gramStart"/>
       <w:r>
         <w:rPr>
           <w:lang w:val="en-US"/>
@@ -1691,7 +2080,16 @@
           <w:rtl/>
           <w:lang w:val="en-US"/>
         </w:rPr>
-        <w:t xml:space="preserve"> - תוכנה או שירות אשר מפרסמים הודעות אל </w:t>
+        <w:t xml:space="preserve"> -</w:t>
+      </w:r>
+      <w:proofErr w:type="gramEnd"/>
+      <w:r>
+        <w:rPr>
+          <w:rFonts w:hint="cs"/>
+          <w:rtl/>
+          <w:lang w:val="en-US"/>
+        </w:rPr>
+        <w:t xml:space="preserve"> תוכנה או שירות אשר מפרסמים הודעות אל </w:t>
       </w:r>
       <w:r>
         <w:rPr>
@@ -1705,8 +2103,18 @@
           <w:rtl/>
           <w:lang w:val="en-US"/>
         </w:rPr>
-        <w:t xml:space="preserve"> מסויים</w:t>
-      </w:r>
+        <w:t xml:space="preserve"> </w:t>
+      </w:r>
+      <w:proofErr w:type="spellStart"/>
+      <w:r>
+        <w:rPr>
+          <w:rFonts w:hint="cs"/>
+          <w:rtl/>
+          <w:lang w:val="en-US"/>
+        </w:rPr>
+        <w:t>מסויים</w:t>
+      </w:r>
+      <w:proofErr w:type="spellEnd"/>
     </w:p>
     <w:p>
       <w:pPr>
@@ -1758,6 +2166,7 @@
         </w:rPr>
         <w:t xml:space="preserve"> תוכנה או שירות אשר קורא הודעות מ</w:t>
       </w:r>
+      <w:proofErr w:type="gramStart"/>
       <w:r>
         <w:rPr>
           <w:lang w:val="en-US"/>
@@ -1770,7 +2179,16 @@
           <w:rtl/>
           <w:lang w:val="en-US"/>
         </w:rPr>
-        <w:t xml:space="preserve"> אחד או יותר</w:t>
+        <w:t xml:space="preserve"> אחד</w:t>
+      </w:r>
+      <w:proofErr w:type="gramEnd"/>
+      <w:r>
+        <w:rPr>
+          <w:rFonts w:hint="cs"/>
+          <w:rtl/>
+          <w:lang w:val="en-US"/>
+        </w:rPr>
+        <w:t xml:space="preserve"> או יותר</w:t>
       </w:r>
     </w:p>
     <w:p>
@@ -1812,6 +2230,7 @@
         </w:rPr>
         <w:t xml:space="preserve"> חלוקות של </w:t>
       </w:r>
+      <w:proofErr w:type="gramStart"/>
       <w:r>
         <w:rPr>
           <w:lang w:val="en-US"/>
@@ -1824,7 +2243,16 @@
           <w:rtl/>
           <w:lang w:val="en-US"/>
         </w:rPr>
-        <w:t xml:space="preserve"> . המידע שנמצא ב</w:t>
+        <w:t xml:space="preserve"> .</w:t>
+      </w:r>
+      <w:proofErr w:type="gramEnd"/>
+      <w:r>
+        <w:rPr>
+          <w:rFonts w:hint="cs"/>
+          <w:rtl/>
+          <w:lang w:val="en-US"/>
+        </w:rPr>
+        <w:t xml:space="preserve"> המידע שנמצא ב</w:t>
       </w:r>
       <w:r>
         <w:rPr>
@@ -1876,9 +2304,11 @@
           <w:rtl/>
         </w:rPr>
       </w:pPr>
+      <w:proofErr w:type="gramStart"/>
       <w:r>
         <w:t>?RabbitMQ</w:t>
       </w:r>
+      <w:proofErr w:type="gramEnd"/>
       <w:r>
         <w:rPr>
           <w:rtl/>
@@ -1955,12 +2385,14 @@
         </w:rPr>
         <w:t xml:space="preserve"> מבוזר וכאשר הודעה נכתבת ל</w:t>
       </w:r>
+      <w:proofErr w:type="spellStart"/>
       <w:r>
         <w:rPr>
           <w:lang w:val="en-US"/>
         </w:rPr>
         <w:t>kafka</w:t>
       </w:r>
+      <w:proofErr w:type="spellEnd"/>
       <w:r>
         <w:rPr>
           <w:rFonts w:hint="cs"/>
@@ -2125,7 +2557,25 @@
           <w:rtl/>
           <w:lang w:val="en-US"/>
         </w:rPr>
-        <w:t xml:space="preserve"> מסויים הוא ייכתב גם ל</w:t>
+        <w:t xml:space="preserve"> </w:t>
+      </w:r>
+      <w:proofErr w:type="spellStart"/>
+      <w:r>
+        <w:rPr>
+          <w:rFonts w:hint="cs"/>
+          <w:rtl/>
+          <w:lang w:val="en-US"/>
+        </w:rPr>
+        <w:t>מסויים</w:t>
+      </w:r>
+      <w:proofErr w:type="spellEnd"/>
+      <w:r>
+        <w:rPr>
+          <w:rFonts w:hint="cs"/>
+          <w:rtl/>
+          <w:lang w:val="en-US"/>
+        </w:rPr>
+        <w:t xml:space="preserve"> הוא ייכתב גם ל</w:t>
       </w:r>
       <w:r>
         <w:rPr>
@@ -2232,8 +2682,13 @@
         </w:rPr>
       </w:pPr>
       <w:r>
-        <w:t>connections, processors, FlowFiles</w:t>
-      </w:r>
+        <w:t xml:space="preserve">connections, processors, </w:t>
+      </w:r>
+      <w:proofErr w:type="spellStart"/>
+      <w:r>
+        <w:t>FlowFiles</w:t>
+      </w:r>
+      <w:proofErr w:type="spellEnd"/>
       <w:r>
         <w:rPr>
           <w:rtl/>
@@ -2308,12 +2763,14 @@
         </w:rPr>
         <w:t xml:space="preserve">-ים מקבלים </w:t>
       </w:r>
+      <w:proofErr w:type="spellStart"/>
       <w:r>
         <w:rPr>
           <w:lang w:val="en-US"/>
         </w:rPr>
         <w:t>FlowFile</w:t>
       </w:r>
+      <w:proofErr w:type="spellEnd"/>
       <w:r>
         <w:rPr>
           <w:rFonts w:hint="cs"/>
@@ -2336,12 +2793,14 @@
         </w:rPr>
         <w:t xml:space="preserve"> שקודם להם ומעבירים </w:t>
       </w:r>
+      <w:proofErr w:type="spellStart"/>
       <w:r>
         <w:rPr>
           <w:lang w:val="en-US"/>
         </w:rPr>
         <w:t>FlowFile</w:t>
       </w:r>
+      <w:proofErr w:type="spellEnd"/>
       <w:r>
         <w:rPr>
           <w:rFonts w:hint="cs"/>
@@ -2374,12 +2833,14 @@
           <w:lang w:val="en-US"/>
         </w:rPr>
       </w:pPr>
+      <w:proofErr w:type="spellStart"/>
       <w:r>
         <w:rPr>
           <w:lang w:val="en-US"/>
         </w:rPr>
         <w:t>FlowFile</w:t>
       </w:r>
+      <w:proofErr w:type="spellEnd"/>
       <w:r>
         <w:rPr>
           <w:rFonts w:hint="cs"/>
@@ -2463,12 +2924,14 @@
         </w:rPr>
         <w:t xml:space="preserve">ים שונים אשר מעבירים </w:t>
       </w:r>
+      <w:proofErr w:type="spellStart"/>
       <w:r>
         <w:rPr>
           <w:lang w:val="en-US"/>
         </w:rPr>
         <w:t>FlowFile</w:t>
       </w:r>
+      <w:proofErr w:type="spellEnd"/>
       <w:r>
         <w:rPr>
           <w:rFonts w:hint="cs"/>
@@ -2583,12 +3046,21 @@
           <w:rtl/>
         </w:rPr>
       </w:pPr>
-      <w:r>
-        <w:rPr>
-          <w:rFonts w:hint="cs"/>
-          <w:rtl/>
-        </w:rPr>
-        <w:t xml:space="preserve">דיבוג קל </w:t>
+      <w:proofErr w:type="spellStart"/>
+      <w:r>
+        <w:rPr>
+          <w:rFonts w:hint="cs"/>
+          <w:rtl/>
+        </w:rPr>
+        <w:t>דיבוג</w:t>
+      </w:r>
+      <w:proofErr w:type="spellEnd"/>
+      <w:r>
+        <w:rPr>
+          <w:rFonts w:hint="cs"/>
+          <w:rtl/>
+        </w:rPr>
+        <w:t xml:space="preserve"> קל </w:t>
       </w:r>
       <w:r>
         <w:rPr>
@@ -2601,7 +3073,23 @@
           <w:rFonts w:hint="cs"/>
           <w:rtl/>
         </w:rPr>
-        <w:t xml:space="preserve"> קל לראות איפה יש שגיאות ומה הן, וקל מאוד לבדוק את המערכת ולראות שהכל עובר בצורה חלקה ושכל חלק עושה את העבודה שלו כמו שצריך</w:t>
+        <w:t xml:space="preserve"> קל לראות איפה יש שגיאות ומה הן, וקל מאוד לבדוק את המערכת ולראות </w:t>
+      </w:r>
+      <w:proofErr w:type="spellStart"/>
+      <w:r>
+        <w:rPr>
+          <w:rFonts w:hint="cs"/>
+          <w:rtl/>
+        </w:rPr>
+        <w:t>שהכל</w:t>
+      </w:r>
+      <w:proofErr w:type="spellEnd"/>
+      <w:r>
+        <w:rPr>
+          <w:rFonts w:hint="cs"/>
+          <w:rtl/>
+        </w:rPr>
+        <w:t xml:space="preserve"> עובר בצורה חלקה ושכל חלק עושה את העבודה שלו כמו שצריך</w:t>
       </w:r>
       <w:r>
         <w:rPr>
@@ -2832,12 +3320,21 @@
         </w:rPr>
         <w:tab/>
       </w:r>
-      <w:r>
-        <w:rPr>
-          <w:rFonts w:hint="cs"/>
-          <w:rtl/>
-        </w:rPr>
-        <w:t xml:space="preserve">דיבוג קל </w:t>
+      <w:proofErr w:type="spellStart"/>
+      <w:r>
+        <w:rPr>
+          <w:rFonts w:hint="cs"/>
+          <w:rtl/>
+        </w:rPr>
+        <w:t>דיבוג</w:t>
+      </w:r>
+      <w:proofErr w:type="spellEnd"/>
+      <w:r>
+        <w:rPr>
+          <w:rFonts w:hint="cs"/>
+          <w:rtl/>
+        </w:rPr>
+        <w:t xml:space="preserve"> קל </w:t>
       </w:r>
       <w:r>
         <w:rPr>
@@ -2950,7 +3447,25 @@
           <w:rtl/>
           <w:lang w:val="en-US"/>
         </w:rPr>
-        <w:t>להרחיב רק את החלקים שצריכים הרחבה במערכת ( למשל הרחבת שטח האחסון רק ל</w:t>
+        <w:t xml:space="preserve">להרחיב רק את החלקים שצריכים הרחבה במערכת </w:t>
+      </w:r>
+      <w:proofErr w:type="gramStart"/>
+      <w:r>
+        <w:rPr>
+          <w:rFonts w:hint="cs"/>
+          <w:rtl/>
+          <w:lang w:val="en-US"/>
+        </w:rPr>
+        <w:t>( למשל</w:t>
+      </w:r>
+      <w:proofErr w:type="gramEnd"/>
+      <w:r>
+        <w:rPr>
+          <w:rFonts w:hint="cs"/>
+          <w:rtl/>
+          <w:lang w:val="en-US"/>
+        </w:rPr>
+        <w:t xml:space="preserve"> הרחבת שטח האחסון רק ל</w:t>
       </w:r>
       <w:r>
         <w:rPr>
@@ -2964,8 +3479,36 @@
           <w:rtl/>
           <w:lang w:val="en-US"/>
         </w:rPr>
-        <w:t xml:space="preserve"> אחד מסויים במערכת )</w:t>
-      </w:r>
+        <w:t xml:space="preserve"> אחד </w:t>
+      </w:r>
+      <w:proofErr w:type="spellStart"/>
+      <w:r>
+        <w:rPr>
+          <w:rFonts w:hint="cs"/>
+          <w:rtl/>
+          <w:lang w:val="en-US"/>
+        </w:rPr>
+        <w:t>מסויים</w:t>
+      </w:r>
+      <w:proofErr w:type="spellEnd"/>
+      <w:r>
+        <w:rPr>
+          <w:rFonts w:hint="cs"/>
+          <w:rtl/>
+          <w:lang w:val="en-US"/>
+        </w:rPr>
+        <w:t xml:space="preserve"> </w:t>
+      </w:r>
+      <w:proofErr w:type="gramStart"/>
+      <w:r>
+        <w:rPr>
+          <w:rFonts w:hint="cs"/>
+          <w:rtl/>
+          <w:lang w:val="en-US"/>
+        </w:rPr>
+        <w:t>במערכת )</w:t>
+      </w:r>
+      <w:proofErr w:type="gramEnd"/>
     </w:p>
     <w:p>
       <w:pPr>
@@ -3271,7 +3814,25 @@
           <w:rtl/>
           <w:lang w:val="en-US"/>
         </w:rPr>
-        <w:t xml:space="preserve"> קיימת הפרדה בין הלקוח אשר מבקש משאבים לבין השרת אשר מספק משאבים, כל אחד מהם לא צריך להיות מודע לאיך השני בנוי, ואת שניהם אפשר לפתח בנפרד</w:t>
+        <w:t xml:space="preserve"> קיימת הפרדה בין הלקוח אשר מבקש משאבים לבין השרת אשר מספק משאבים, כל אחד מהם לא צריך להיות מודע </w:t>
+      </w:r>
+      <w:proofErr w:type="spellStart"/>
+      <w:r>
+        <w:rPr>
+          <w:rFonts w:hint="cs"/>
+          <w:rtl/>
+          <w:lang w:val="en-US"/>
+        </w:rPr>
+        <w:t>לאיך</w:t>
+      </w:r>
+      <w:proofErr w:type="spellEnd"/>
+      <w:r>
+        <w:rPr>
+          <w:rFonts w:hint="cs"/>
+          <w:rtl/>
+          <w:lang w:val="en-US"/>
+        </w:rPr>
+        <w:t xml:space="preserve"> השני בנוי, ואת שניהם אפשר לפתח בנפרד</w:t>
       </w:r>
     </w:p>
     <w:p>
@@ -3348,12 +3909,14 @@
         </w:rPr>
         <w:tab/>
       </w:r>
+      <w:proofErr w:type="spellStart"/>
       <w:r>
         <w:rPr>
           <w:lang w:val="en-US"/>
         </w:rPr>
         <w:t>Cacheability</w:t>
       </w:r>
+      <w:proofErr w:type="spellEnd"/>
       <w:r>
         <w:rPr>
           <w:rFonts w:hint="cs"/>
@@ -3407,6 +3970,7 @@
         </w:rPr>
         <w:t xml:space="preserve"> </w:t>
       </w:r>
+      <w:proofErr w:type="gramStart"/>
       <w:r>
         <w:rPr>
           <w:rtl/>
@@ -3426,7 +3990,16 @@
           <w:rtl/>
           <w:lang w:val="en-US"/>
         </w:rPr>
-        <w:t xml:space="preserve"> עקרון אשר מבטיח </w:t>
+        <w:t xml:space="preserve"> עקרון</w:t>
+      </w:r>
+      <w:proofErr w:type="gramEnd"/>
+      <w:r>
+        <w:rPr>
+          <w:rFonts w:hint="cs"/>
+          <w:rtl/>
+          <w:lang w:val="en-US"/>
+        </w:rPr>
+        <w:t xml:space="preserve"> אשר מבטיח </w:t>
       </w:r>
       <w:r>
         <w:rPr>
@@ -3663,6 +4236,7 @@
           <w:lang w:val="en-US"/>
         </w:rPr>
       </w:pPr>
+      <w:proofErr w:type="gramStart"/>
       <w:r>
         <w:rPr>
           <w:lang w:val="en-US"/>
@@ -3676,7 +4250,16 @@
           <w:rtl/>
           <w:lang w:val="en-US"/>
         </w:rPr>
-        <w:t xml:space="preserve"> - בקשה למחוק מידע מהשרת</w:t>
+        <w:t xml:space="preserve"> -</w:t>
+      </w:r>
+      <w:proofErr w:type="gramEnd"/>
+      <w:r>
+        <w:rPr>
+          <w:rFonts w:hint="cs"/>
+          <w:rtl/>
+          <w:lang w:val="en-US"/>
+        </w:rPr>
+        <w:t xml:space="preserve"> בקשה למחוק מידע מהשרת</w:t>
       </w:r>
     </w:p>
     <w:p>
@@ -4076,22 +4659,56 @@
         <w:rPr>
           <w:lang w:val="en-US"/>
         </w:rPr>
-        <w:t>swagger codgen</w:t>
-      </w:r>
-      <w:r>
-        <w:rPr>
-          <w:rFonts w:hint="cs"/>
-          <w:rtl/>
-          <w:lang w:val="en-US"/>
-        </w:rPr>
-        <w:t xml:space="preserve"> ניתן לג'נרט </w:t>
-      </w:r>
-      <w:r>
-        <w:rPr>
-          <w:lang w:val="en-US"/>
-        </w:rPr>
-        <w:t>client sdk</w:t>
-      </w:r>
+        <w:t xml:space="preserve">swagger </w:t>
+      </w:r>
+      <w:proofErr w:type="spellStart"/>
+      <w:r>
+        <w:rPr>
+          <w:lang w:val="en-US"/>
+        </w:rPr>
+        <w:t>codgen</w:t>
+      </w:r>
+      <w:proofErr w:type="spellEnd"/>
+      <w:r>
+        <w:rPr>
+          <w:rFonts w:hint="cs"/>
+          <w:rtl/>
+          <w:lang w:val="en-US"/>
+        </w:rPr>
+        <w:t xml:space="preserve"> ניתן </w:t>
+      </w:r>
+      <w:proofErr w:type="spellStart"/>
+      <w:r>
+        <w:rPr>
+          <w:rFonts w:hint="cs"/>
+          <w:rtl/>
+          <w:lang w:val="en-US"/>
+        </w:rPr>
+        <w:t>לג'נרט</w:t>
+      </w:r>
+      <w:proofErr w:type="spellEnd"/>
+      <w:r>
+        <w:rPr>
+          <w:rFonts w:hint="cs"/>
+          <w:rtl/>
+          <w:lang w:val="en-US"/>
+        </w:rPr>
+        <w:t xml:space="preserve"> </w:t>
+      </w:r>
+      <w:r>
+        <w:rPr>
+          <w:lang w:val="en-US"/>
+        </w:rPr>
+        <w:t xml:space="preserve">client </w:t>
+      </w:r>
+      <w:proofErr w:type="spellStart"/>
+      <w:r>
+        <w:rPr>
+          <w:lang w:val="en-US"/>
+        </w:rPr>
+        <w:t>sdk</w:t>
+      </w:r>
+      <w:proofErr w:type="spellEnd"/>
       <w:r>
         <w:rPr>
           <w:rFonts w:hint="cs"/>
@@ -4193,12 +4810,14 @@
         </w:rPr>
         <w:t xml:space="preserve"> הוא בדיקה וולידציה של ה</w:t>
       </w:r>
+      <w:proofErr w:type="spellStart"/>
       <w:r>
         <w:rPr>
           <w:lang w:val="en-US"/>
         </w:rPr>
         <w:t>api</w:t>
       </w:r>
+      <w:proofErr w:type="spellEnd"/>
     </w:p>
     <w:p>
       <w:pPr>
@@ -4312,7 +4931,25 @@
           <w:rtl/>
           <w:lang w:val="en-US"/>
         </w:rPr>
-        <w:t xml:space="preserve"> ממשק אינטרקטיבי שניתן להתאים באופן אישי ומאפשר לראות, לנתר, ולנתח מידע ממספר מקורות</w:t>
+        <w:t xml:space="preserve"> ממשק </w:t>
+      </w:r>
+      <w:proofErr w:type="spellStart"/>
+      <w:r>
+        <w:rPr>
+          <w:rFonts w:hint="cs"/>
+          <w:rtl/>
+          <w:lang w:val="en-US"/>
+        </w:rPr>
+        <w:t>אינטרקטיבי</w:t>
+      </w:r>
+      <w:proofErr w:type="spellEnd"/>
+      <w:r>
+        <w:rPr>
+          <w:rFonts w:hint="cs"/>
+          <w:rtl/>
+          <w:lang w:val="en-US"/>
+        </w:rPr>
+        <w:t xml:space="preserve"> שניתן להתאים באופן אישי ומאפשר לראות, לנתר, ולנתח מידע ממספר מקורות</w:t>
       </w:r>
     </w:p>
     <w:p>
@@ -4336,14 +4973,23 @@
           <w:rtl/>
           <w:lang w:val="en-US"/>
         </w:rPr>
-        <w:t xml:space="preserve"> -</w:t>
-      </w:r>
-      <w:r>
-        <w:rPr>
-          <w:lang w:val="en-US"/>
-        </w:rPr>
         <w:t xml:space="preserve"> </w:t>
       </w:r>
+      <w:proofErr w:type="gramStart"/>
+      <w:r>
+        <w:rPr>
+          <w:rFonts w:hint="cs"/>
+          <w:rtl/>
+          <w:lang w:val="en-US"/>
+        </w:rPr>
+        <w:t>-</w:t>
+      </w:r>
+      <w:r>
+        <w:rPr>
+          <w:lang w:val="en-US"/>
+        </w:rPr>
+        <w:t xml:space="preserve"> </w:t>
+      </w:r>
       <w:r>
         <w:rPr>
           <w:rFonts w:hint="cs"/>
@@ -4352,6 +4998,7 @@
         </w:rPr>
         <w:t xml:space="preserve"> ה</w:t>
       </w:r>
+      <w:proofErr w:type="gramEnd"/>
       <w:r>
         <w:rPr>
           <w:lang w:val="en-US"/>
@@ -4434,8 +5081,35 @@
       </w:pPr>
       <w:r>
         <w:tab/>
-        <w:t>mySQL , PostgreSQL,Elasticsearch,openTSDB,prometheus</w:t>
-      </w:r>
+      </w:r>
+      <w:proofErr w:type="spellStart"/>
+      <w:proofErr w:type="gramStart"/>
+      <w:r>
+        <w:t>mySQL</w:t>
+      </w:r>
+      <w:proofErr w:type="spellEnd"/>
+      <w:r>
+        <w:t xml:space="preserve"> ,</w:t>
+      </w:r>
+      <w:proofErr w:type="gramEnd"/>
+      <w:r>
+        <w:t xml:space="preserve"> </w:t>
+      </w:r>
+      <w:proofErr w:type="spellStart"/>
+      <w:proofErr w:type="gramStart"/>
+      <w:r>
+        <w:t>PostgreSQL,Elasticsearch</w:t>
+      </w:r>
+      <w:proofErr w:type="gramEnd"/>
+      <w:r>
+        <w:t>,</w:t>
+      </w:r>
+      <w:proofErr w:type="gramStart"/>
+      <w:r>
+        <w:t>openTSDB,prometheus</w:t>
+      </w:r>
+      <w:proofErr w:type="spellEnd"/>
+      <w:proofErr w:type="gramEnd"/>
     </w:p>
     <w:p>
       <w:pPr>
@@ -4490,6 +5164,75 @@
     <w:p>
       <w:pPr>
         <w:bidi/>
+        <w:rPr>
+          <w:rtl/>
+          <w:lang w:val="en-US"/>
+        </w:rPr>
+      </w:pPr>
+      <w:r>
+        <w:rPr>
+          <w:rtl/>
+        </w:rPr>
+        <w:tab/>
+      </w:r>
+      <w:r>
+        <w:rPr>
+          <w:rFonts w:hint="cs"/>
+          <w:rtl/>
+        </w:rPr>
+        <w:t xml:space="preserve">התפקיד המרכזי של </w:t>
+      </w:r>
+      <w:r>
+        <w:rPr>
+          <w:lang w:val="en-US"/>
+        </w:rPr>
+        <w:t>Message broker</w:t>
+      </w:r>
+      <w:r>
+        <w:rPr>
+          <w:rFonts w:hint="cs"/>
+          <w:rtl/>
+          <w:lang w:val="en-US"/>
+        </w:rPr>
+        <w:t xml:space="preserve"> הוא להעביר הודעות משירות אחד אל שירות אחר,</w:t>
+      </w:r>
+    </w:p>
+    <w:p>
+      <w:pPr>
+        <w:bidi/>
+        <w:ind w:left="720"/>
+        <w:rPr>
+          <w:rFonts w:hint="cs"/>
+          <w:rtl/>
+          <w:lang w:val="en-US"/>
+        </w:rPr>
+      </w:pPr>
+      <w:r>
+        <w:rPr>
+          <w:rFonts w:hint="cs"/>
+          <w:rtl/>
+          <w:lang w:val="en-US"/>
+        </w:rPr>
+        <w:t xml:space="preserve">הבעיה שהוא בא לפתור זה </w:t>
+      </w:r>
+      <w:r>
+        <w:rPr>
+          <w:lang w:val="en-US"/>
+        </w:rPr>
+        <w:t>coupling</w:t>
+      </w:r>
+      <w:r>
+        <w:rPr>
+          <w:rFonts w:hint="cs"/>
+          <w:rtl/>
+          <w:lang w:val="en-US"/>
+        </w:rPr>
+        <w:t xml:space="preserve"> שנוצר בין שני שירותים כאשר הם מדברים אחד אל השני באופן ישיר</w:t>
+      </w:r>
+    </w:p>
+    <w:p>
+      <w:pPr>
+        <w:bidi/>
       </w:pPr>
       <w:r>
         <w:rPr>
@@ -4501,6 +5244,109 @@
     <w:p>
       <w:pPr>
         <w:bidi/>
+        <w:ind w:left="720"/>
+        <w:rPr>
+          <w:rFonts w:hint="cs"/>
+          <w:rtl/>
+          <w:lang w:val="en-US"/>
+        </w:rPr>
+      </w:pPr>
+      <w:r>
+        <w:rPr>
+          <w:rFonts w:hint="cs"/>
+          <w:rtl/>
+        </w:rPr>
+        <w:t xml:space="preserve">סוגי הניתוב המרכזיים הם </w:t>
+      </w:r>
+      <w:r>
+        <w:rPr>
+          <w:lang w:val="en-US"/>
+        </w:rPr>
+        <w:t>Fanout</w:t>
+      </w:r>
+      <w:r>
+        <w:rPr>
+          <w:rFonts w:hint="cs"/>
+          <w:rtl/>
+          <w:lang w:val="en-US"/>
+        </w:rPr>
+        <w:t xml:space="preserve"> </w:t>
+      </w:r>
+      <w:r>
+        <w:rPr>
+          <w:rtl/>
+          <w:lang w:val="en-US"/>
+        </w:rPr>
+        <w:t>–</w:t>
+      </w:r>
+      <w:r>
+        <w:rPr>
+          <w:rFonts w:hint="cs"/>
+          <w:rtl/>
+          <w:lang w:val="en-US"/>
+        </w:rPr>
+        <w:t xml:space="preserve"> סוג ניתוב אשר שולח את ההודעה לכל </w:t>
+      </w:r>
+      <w:r>
+        <w:rPr>
+          <w:rFonts w:hint="cs"/>
+          <w:rtl/>
+          <w:lang w:val="en-US"/>
+        </w:rPr>
+        <w:t>תורים הקיימים(נשתמש בו כאשר נרצה לשלוח הודעה שרלוונטית לכל הצרכנים), ו</w:t>
+      </w:r>
+      <w:r>
+        <w:rPr>
+          <w:lang w:val="en-US"/>
+        </w:rPr>
+        <w:t>Topic</w:t>
+      </w:r>
+      <w:r>
+        <w:rPr>
+          <w:rFonts w:hint="cs"/>
+          <w:rtl/>
+          <w:lang w:val="en-US"/>
+        </w:rPr>
+        <w:t>- סוג ניתוב אשר שולח את ההודעה לצרכן אחד או יותר על בסיס ערך ניתוב</w:t>
+      </w:r>
+      <w:r>
+        <w:rPr>
+          <w:lang w:val="en-US"/>
+        </w:rPr>
+        <w:t xml:space="preserve"> </w:t>
+      </w:r>
+      <w:r>
+        <w:rPr>
+          <w:rFonts w:hint="cs"/>
+          <w:rtl/>
+          <w:lang w:val="en-US"/>
+        </w:rPr>
+        <w:t xml:space="preserve"> </w:t>
+      </w:r>
+      <w:r>
+        <w:rPr>
+          <w:lang w:val="en-US"/>
+        </w:rPr>
+        <w:t>(routing key)</w:t>
+      </w:r>
+    </w:p>
+    <w:p>
+      <w:pPr>
+        <w:bidi/>
+        <w:rPr>
+          <w:lang w:val="en-US"/>
+        </w:rPr>
+      </w:pPr>
+      <w:r>
+        <w:rPr>
+          <w:rtl/>
+        </w:rPr>
+        <w:tab/>
+      </w:r>
+    </w:p>
+    <w:p>
+      <w:pPr>
+        <w:bidi/>
       </w:pPr>
       <w:r>
         <w:rPr>
@@ -4517,7 +5363,60 @@
         <w:rPr>
           <w:rtl/>
         </w:rPr>
+        <w:lastRenderedPageBreak/>
         <w:t>קורס?</w:t>
+      </w:r>
+    </w:p>
+    <w:p>
+      <w:pPr>
+        <w:bidi/>
+        <w:ind w:left="720"/>
+        <w:rPr>
+          <w:rFonts w:hint="cs"/>
+          <w:rtl/>
+        </w:rPr>
+      </w:pPr>
+      <w:r>
+        <w:rPr>
+          <w:rFonts w:hint="cs"/>
+          <w:rtl/>
+        </w:rPr>
+        <w:t xml:space="preserve">מנגנון אישור קבלת הודעה הוא מנגנון </w:t>
+      </w:r>
+      <w:r>
+        <w:rPr>
+          <w:rFonts w:hint="cs"/>
+          <w:rtl/>
+        </w:rPr>
+        <w:t xml:space="preserve">שמוודא שהלקוח מקבל את כל המידע. הוא </w:t>
+      </w:r>
+      <w:r>
+        <w:rPr>
+          <w:rFonts w:hint="cs"/>
+          <w:rtl/>
+        </w:rPr>
+        <w:t>פועל בצורה שבה</w:t>
+      </w:r>
+      <w:r>
+        <w:rPr>
+          <w:rFonts w:hint="cs"/>
+          <w:rtl/>
+        </w:rPr>
+        <w:t xml:space="preserve"> הצרכן מודיע שהוא סיים לקרוא את ההודעה ורק</w:t>
+      </w:r>
+      <w:r>
+        <w:rPr>
+          <w:rFonts w:hint="cs"/>
+          <w:rtl/>
+        </w:rPr>
+        <w:t xml:space="preserve"> </w:t>
+      </w:r>
+      <w:r>
+        <w:rPr>
+          <w:rFonts w:hint="cs"/>
+          <w:rtl/>
+        </w:rPr>
+        <w:t>לאחר מכן ההודעה נמחקת מהתור. כך, גם אם שרת קרס באמצע קריאת הודעה הלקוח לא הודיע שהוא סיים לקרוא ולכן ההודעה לא תימחק</w:t>
       </w:r>
     </w:p>
     <w:p>
@@ -4540,9 +5439,11 @@
       <w:pPr>
         <w:bidi/>
       </w:pPr>
+      <w:proofErr w:type="gramStart"/>
       <w:r>
         <w:t>?BE</w:t>
       </w:r>
+      <w:proofErr w:type="gramEnd"/>
       <w:r>
         <w:rPr>
           <w:rtl/>
@@ -4592,9 +5493,11 @@
       <w:pPr>
         <w:bidi/>
       </w:pPr>
+      <w:proofErr w:type="gramStart"/>
       <w:r>
         <w:t>?API</w:t>
       </w:r>
+      <w:proofErr w:type="gramEnd"/>
       <w:r>
         <w:rPr>
           <w:rtl/>

</xml_diff>

<commit_message>
finished the postman questions
</commit_message>
<xml_diff>
--- a/hfifa_questions_1.docx
+++ b/hfifa_questions_1.docx
@@ -56,13 +56,8 @@
       <w:pPr>
         <w:bidi/>
       </w:pPr>
-      <w:proofErr w:type="gramStart"/>
-      <w:r>
-        <w:t>[ ]</w:t>
-      </w:r>
-      <w:proofErr w:type="gramEnd"/>
-      <w:r>
-        <w:t xml:space="preserve"> word</w:t>
+      <w:r>
+        <w:t>[ ] word</w:t>
       </w:r>
       <w:r>
         <w:rPr>
@@ -79,21 +74,7 @@
         <w:rPr>
           <w:rtl/>
         </w:rPr>
-        <w:t xml:space="preserve">וכל למידה חדשה תוסיפו </w:t>
-      </w:r>
-      <w:proofErr w:type="spellStart"/>
-      <w:r>
-        <w:rPr>
-          <w:rtl/>
-        </w:rPr>
-        <w:t>כברנאץ</w:t>
-      </w:r>
-      <w:proofErr w:type="spellEnd"/>
-      <w:r>
-        <w:rPr>
-          <w:rtl/>
-        </w:rPr>
-        <w:t xml:space="preserve">. </w:t>
+        <w:t xml:space="preserve">וכל למידה חדשה תוסיפו כברנאץ. </w:t>
       </w:r>
       <w:r>
         <w:t>git</w:t>
@@ -130,11 +111,9 @@
       <w:pPr>
         <w:bidi/>
       </w:pPr>
-      <w:proofErr w:type="gramStart"/>
       <w:r>
         <w:t>?SQL</w:t>
       </w:r>
-      <w:proofErr w:type="gramEnd"/>
       <w:r>
         <w:rPr>
           <w:rtl/>
@@ -169,21 +148,7 @@
         <w:rPr>
           <w:rtl/>
         </w:rPr>
-        <w:t xml:space="preserve"> המידע נשמר במבנה </w:t>
-      </w:r>
-      <w:proofErr w:type="spellStart"/>
-      <w:r>
-        <w:rPr>
-          <w:rtl/>
-        </w:rPr>
-        <w:t>רלציוני</w:t>
-      </w:r>
-      <w:proofErr w:type="spellEnd"/>
-      <w:r>
-        <w:rPr>
-          <w:rtl/>
-        </w:rPr>
-        <w:t xml:space="preserve"> בטבל</w:t>
+        <w:t xml:space="preserve"> המידע נשמר במבנה רלציוני בטבל</w:t>
       </w:r>
       <w:r>
         <w:rPr>
@@ -235,16 +200,8 @@
         <w:rPr>
           <w:rtl/>
         </w:rPr>
-        <w:t xml:space="preserve"> מראש), </w:t>
-      </w:r>
-      <w:proofErr w:type="spellStart"/>
-      <w:r>
-        <w:rPr>
-          <w:rtl/>
-        </w:rPr>
-        <w:t>וב</w:t>
-      </w:r>
-      <w:proofErr w:type="spellEnd"/>
+        <w:t xml:space="preserve"> מראש), וב</w:t>
+      </w:r>
       <w:r>
         <w:t>NOSQL</w:t>
       </w:r>
@@ -289,7 +246,6 @@
         </w:rPr>
         <w:t xml:space="preserve">, </w:t>
       </w:r>
-      <w:proofErr w:type="spellStart"/>
       <w:r>
         <w:rPr>
           <w:color w:val="273239"/>
@@ -298,7 +254,6 @@
         </w:rPr>
         <w:t>וכו</w:t>
       </w:r>
-      <w:proofErr w:type="spellEnd"/>
       <w:r>
         <w:rPr>
           <w:color w:val="273239"/>
@@ -370,44 +325,14 @@
         </w:rPr>
         <w:t xml:space="preserve">נעדיף להשתמש ב </w:t>
       </w:r>
-      <w:proofErr w:type="spellStart"/>
       <w:r>
         <w:t>mongoDB</w:t>
       </w:r>
-      <w:proofErr w:type="spellEnd"/>
-      <w:r>
-        <w:rPr>
-          <w:rtl/>
-        </w:rPr>
-        <w:t xml:space="preserve"> כאשר למידע </w:t>
-      </w:r>
-      <w:proofErr w:type="spellStart"/>
-      <w:r>
-        <w:rPr>
-          <w:rtl/>
-        </w:rPr>
-        <w:t>שאחנו</w:t>
-      </w:r>
-      <w:proofErr w:type="spellEnd"/>
-      <w:r>
-        <w:rPr>
-          <w:rtl/>
-        </w:rPr>
-        <w:t xml:space="preserve"> שומרים אין סכמה מוגדרת מראש, וכאשר לא נרצה לשמור מידע </w:t>
-      </w:r>
-      <w:proofErr w:type="spellStart"/>
-      <w:r>
-        <w:rPr>
-          <w:rtl/>
-        </w:rPr>
-        <w:t>רלציוני</w:t>
-      </w:r>
-      <w:proofErr w:type="spellEnd"/>
-      <w:r>
-        <w:rPr>
-          <w:rtl/>
-        </w:rPr>
-        <w:t xml:space="preserve">, בניגוד ל </w:t>
+      <w:r>
+        <w:rPr>
+          <w:rtl/>
+        </w:rPr>
+        <w:t xml:space="preserve"> כאשר למידע שאחנו שומרים אין סכמה מוגדרת מראש, וכאשר לא נרצה לשמור מידע רלציוני, בניגוד ל </w:t>
       </w:r>
       <w:r>
         <w:t>SQL</w:t>
@@ -455,14 +380,7 @@
         <w:rPr>
           <w:rtl/>
         </w:rPr>
-        <w:t xml:space="preserve"> </w:t>
-      </w:r>
-      <w:proofErr w:type="spellStart"/>
-      <w:r>
-        <w:rPr>
-          <w:rtl/>
-        </w:rPr>
-        <w:t>רלציוני</w:t>
+        <w:t xml:space="preserve"> רלציוני</w:t>
       </w:r>
       <w:r>
         <w:rPr>
@@ -471,26 +389,11 @@
         </w:rPr>
         <w:t>ת</w:t>
       </w:r>
-      <w:proofErr w:type="spellEnd"/>
-      <w:r>
-        <w:rPr>
-          <w:rtl/>
-        </w:rPr>
-        <w:t xml:space="preserve"> ( טבלאות שונות מקושרות אחת </w:t>
-      </w:r>
-      <w:proofErr w:type="spellStart"/>
-      <w:r>
-        <w:rPr>
-          <w:rtl/>
-        </w:rPr>
-        <w:t>לשניה</w:t>
-      </w:r>
-      <w:proofErr w:type="spellEnd"/>
-      <w:r>
-        <w:rPr>
-          <w:rtl/>
-        </w:rPr>
-        <w:t xml:space="preserve"> בעזרת </w:t>
+      <w:r>
+        <w:rPr>
+          <w:rtl/>
+        </w:rPr>
+        <w:t xml:space="preserve"> ( טבלאות שונות מקושרות אחת לשניה בעזרת </w:t>
       </w:r>
       <w:r>
         <w:t>foreign keys</w:t>
@@ -788,55 +691,7 @@
           <w:rFonts w:hint="cs"/>
           <w:rtl/>
         </w:rPr>
-        <w:t xml:space="preserve"> </w:t>
-      </w:r>
-      <w:proofErr w:type="spellStart"/>
-      <w:r>
-        <w:rPr>
-          <w:rFonts w:hint="cs"/>
-          <w:rtl/>
-        </w:rPr>
-        <w:t>בניוגד</w:t>
-      </w:r>
-      <w:proofErr w:type="spellEnd"/>
-      <w:r>
-        <w:rPr>
-          <w:rFonts w:hint="cs"/>
-          <w:rtl/>
-        </w:rPr>
-        <w:t xml:space="preserve"> </w:t>
-      </w:r>
-      <w:proofErr w:type="spellStart"/>
-      <w:r>
-        <w:rPr>
-          <w:rFonts w:hint="cs"/>
-          <w:rtl/>
-        </w:rPr>
-        <w:t>לדאטאבייסים</w:t>
-      </w:r>
-      <w:proofErr w:type="spellEnd"/>
-      <w:r>
-        <w:rPr>
-          <w:rFonts w:hint="cs"/>
-          <w:rtl/>
-        </w:rPr>
-        <w:t xml:space="preserve"> </w:t>
-      </w:r>
-      <w:proofErr w:type="spellStart"/>
-      <w:r>
-        <w:rPr>
-          <w:rFonts w:hint="cs"/>
-          <w:rtl/>
-        </w:rPr>
-        <w:t>רלציונים</w:t>
-      </w:r>
-      <w:proofErr w:type="spellEnd"/>
-      <w:r>
-        <w:rPr>
-          <w:rFonts w:hint="cs"/>
-          <w:rtl/>
-        </w:rPr>
-        <w:t xml:space="preserve"> </w:t>
+        <w:t xml:space="preserve"> בניוגד לדאטאבייסים רלציונים </w:t>
       </w:r>
       <w:r>
         <w:rPr>
@@ -894,13 +749,8 @@
         <w:t>מגבלת גודל ל</w:t>
       </w:r>
       <w:r>
-        <w:t xml:space="preserve"> </w:t>
-      </w:r>
-      <w:proofErr w:type="spellStart"/>
-      <w:r>
-        <w:t>Documen</w:t>
-      </w:r>
-      <w:proofErr w:type="spellEnd"/>
+        <w:t xml:space="preserve"> Documen</w:t>
+      </w:r>
       <w:r>
         <w:rPr>
           <w:rFonts w:hint="cs"/>
@@ -989,23 +839,13 @@
           <w:lang w:val="en-US"/>
         </w:rPr>
       </w:pPr>
-      <w:proofErr w:type="spellStart"/>
-      <w:r>
-        <w:rPr>
-          <w:rFonts w:hint="cs"/>
-          <w:rtl/>
-          <w:lang w:val="en-US"/>
-        </w:rPr>
-        <w:t>ברדיס</w:t>
-      </w:r>
-      <w:proofErr w:type="spellEnd"/>
-      <w:r>
-        <w:rPr>
-          <w:rFonts w:hint="cs"/>
-          <w:rtl/>
-          <w:lang w:val="en-US"/>
-        </w:rPr>
-        <w:t xml:space="preserve"> המידע נשמר על זיכרו</w:t>
+      <w:r>
+        <w:rPr>
+          <w:rFonts w:hint="cs"/>
+          <w:rtl/>
+          <w:lang w:val="en-US"/>
+        </w:rPr>
+        <w:t>ברדיס המידע נשמר על זיכרו</w:t>
       </w:r>
       <w:r>
         <w:rPr>
@@ -1035,25 +875,7 @@
           <w:rtl/>
           <w:lang w:val="en-US"/>
         </w:rPr>
-        <w:t xml:space="preserve"> אשר מהיר בהרבה מדיסק אחסון רגיל. בנוסף, </w:t>
-      </w:r>
-      <w:proofErr w:type="spellStart"/>
-      <w:r>
-        <w:rPr>
-          <w:rFonts w:hint="cs"/>
-          <w:rtl/>
-          <w:lang w:val="en-US"/>
-        </w:rPr>
-        <w:t>רדיס</w:t>
-      </w:r>
-      <w:proofErr w:type="spellEnd"/>
-      <w:r>
-        <w:rPr>
-          <w:rFonts w:hint="cs"/>
-          <w:rtl/>
-          <w:lang w:val="en-US"/>
-        </w:rPr>
-        <w:t xml:space="preserve"> פועל על </w:t>
+        <w:t xml:space="preserve"> אשר מהיר בהרבה מדיסק אחסון רגיל. בנוסף, רדיס פועל על </w:t>
       </w:r>
       <w:r>
         <w:rPr>
@@ -1111,11 +933,9 @@
           <w:rtl/>
         </w:rPr>
       </w:pPr>
-      <w:proofErr w:type="gramStart"/>
       <w:r>
         <w:t>?Redis</w:t>
       </w:r>
-      <w:proofErr w:type="gramEnd"/>
       <w:r>
         <w:rPr>
           <w:rtl/>
@@ -1142,23 +962,7 @@
           <w:rFonts w:hint="cs"/>
           <w:rtl/>
         </w:rPr>
-        <w:t xml:space="preserve">הסיבות הנפוצות ביותר לשימוש </w:t>
-      </w:r>
-      <w:proofErr w:type="spellStart"/>
-      <w:r>
-        <w:rPr>
-          <w:rFonts w:hint="cs"/>
-          <w:rtl/>
-        </w:rPr>
-        <w:t>ברדיס</w:t>
-      </w:r>
-      <w:proofErr w:type="spellEnd"/>
-      <w:r>
-        <w:rPr>
-          <w:rFonts w:hint="cs"/>
-          <w:rtl/>
-        </w:rPr>
-        <w:t xml:space="preserve"> הן</w:t>
+        <w:t>הסיבות הנפוצות ביותר לשימוש ברדיס הן</w:t>
       </w:r>
       <w:r>
         <w:rPr>
@@ -1211,25 +1015,7 @@
           <w:rtl/>
           <w:lang w:val="en-US"/>
         </w:rPr>
-        <w:t xml:space="preserve"> שמירת מידע שמשתמשים בו בתדירות גבוהה לזמן מוגבל כדי לאפשר </w:t>
-      </w:r>
-      <w:proofErr w:type="spellStart"/>
-      <w:r>
-        <w:rPr>
-          <w:rFonts w:hint="cs"/>
-          <w:rtl/>
-          <w:lang w:val="en-US"/>
-        </w:rPr>
-        <w:t>איחזור</w:t>
-      </w:r>
-      <w:proofErr w:type="spellEnd"/>
-      <w:r>
-        <w:rPr>
-          <w:rFonts w:hint="cs"/>
-          <w:rtl/>
-          <w:lang w:val="en-US"/>
-        </w:rPr>
-        <w:t xml:space="preserve"> של המידע מהר יותר</w:t>
+        <w:t xml:space="preserve"> שמירת מידע שמשתמשים בו בתדירות גבוהה לזמן מוגבל כדי לאפשר איחזור של המידע מהר יותר</w:t>
       </w:r>
     </w:p>
     <w:p>
@@ -1269,43 +1055,7 @@
           <w:rtl/>
           <w:lang w:val="en-US"/>
         </w:rPr>
-        <w:t xml:space="preserve"> מאפשר למפרסמים לפרסם הודעות לנושאים </w:t>
-      </w:r>
-      <w:proofErr w:type="spellStart"/>
-      <w:r>
-        <w:rPr>
-          <w:rFonts w:hint="cs"/>
-          <w:rtl/>
-          <w:lang w:val="en-US"/>
-        </w:rPr>
-        <w:t>מסויימים</w:t>
-      </w:r>
-      <w:proofErr w:type="spellEnd"/>
-      <w:r>
-        <w:rPr>
-          <w:rFonts w:hint="cs"/>
-          <w:rtl/>
-          <w:lang w:val="en-US"/>
-        </w:rPr>
-        <w:t xml:space="preserve"> ולרשומים להירשם לנושא </w:t>
-      </w:r>
-      <w:proofErr w:type="spellStart"/>
-      <w:r>
-        <w:rPr>
-          <w:rFonts w:hint="cs"/>
-          <w:rtl/>
-          <w:lang w:val="en-US"/>
-        </w:rPr>
-        <w:t>מסויים</w:t>
-      </w:r>
-      <w:proofErr w:type="spellEnd"/>
-      <w:r>
-        <w:rPr>
-          <w:rFonts w:hint="cs"/>
-          <w:rtl/>
-          <w:lang w:val="en-US"/>
-        </w:rPr>
-        <w:t xml:space="preserve"> ולקבל כל הודעה בנושא הזה מבלי שהרשום והמפרסם יכירו אחד את השני (</w:t>
+        <w:t xml:space="preserve"> מאפשר למפרסמים לפרסם הודעות לנושאים מסויימים ולרשומים להירשם לנושא מסויים ולקבל כל הודעה בנושא הזה מבלי שהרשום והמפרסם יכירו אחד את השני (</w:t>
       </w:r>
       <w:r>
         <w:rPr>
@@ -1329,11 +1079,9 @@
           <w:lang w:val="en-US"/>
         </w:rPr>
       </w:pPr>
-      <w:proofErr w:type="gramStart"/>
       <w:r>
         <w:t>?Redis</w:t>
       </w:r>
-      <w:proofErr w:type="gramEnd"/>
       <w:r>
         <w:rPr>
           <w:rtl/>
@@ -1383,43 +1131,7 @@
           <w:rtl/>
           <w:lang w:val="en-US"/>
         </w:rPr>
-        <w:t xml:space="preserve"> מערך של </w:t>
-      </w:r>
-      <w:proofErr w:type="spellStart"/>
-      <w:r>
-        <w:rPr>
-          <w:rFonts w:hint="cs"/>
-          <w:rtl/>
-          <w:lang w:val="en-US"/>
-        </w:rPr>
-        <w:t>ביתים</w:t>
-      </w:r>
-      <w:proofErr w:type="spellEnd"/>
-      <w:r>
-        <w:rPr>
-          <w:rFonts w:hint="cs"/>
-          <w:rtl/>
-          <w:lang w:val="en-US"/>
-        </w:rPr>
-        <w:t xml:space="preserve"> או מילים ששומר </w:t>
-      </w:r>
-      <w:proofErr w:type="gramStart"/>
-      <w:r>
-        <w:rPr>
-          <w:rFonts w:hint="cs"/>
-          <w:rtl/>
-          <w:lang w:val="en-US"/>
-        </w:rPr>
-        <w:t>אלמנטים(</w:t>
-      </w:r>
-      <w:proofErr w:type="gramEnd"/>
-      <w:r>
-        <w:rPr>
-          <w:rFonts w:hint="cs"/>
-          <w:rtl/>
-          <w:lang w:val="en-US"/>
-        </w:rPr>
-        <w:t>בדרך כלל אותיות) בעזרת קידוד</w:t>
+        <w:t xml:space="preserve"> מערך של ביתים או מילים ששומר אלמנטים(בדרך כלל אותיות) בעזרת קידוד</w:t>
       </w:r>
     </w:p>
     <w:p>
@@ -1438,7 +1150,6 @@
         <w:lastRenderedPageBreak/>
         <w:tab/>
       </w:r>
-      <w:proofErr w:type="gramStart"/>
       <w:r>
         <w:rPr>
           <w:lang w:val="en-US"/>
@@ -1451,16 +1162,7 @@
           <w:rtl/>
           <w:lang w:val="en-US"/>
         </w:rPr>
-        <w:t xml:space="preserve"> -</w:t>
-      </w:r>
-      <w:proofErr w:type="gramEnd"/>
-      <w:r>
-        <w:rPr>
-          <w:rFonts w:hint="cs"/>
-          <w:rtl/>
-          <w:lang w:val="en-US"/>
-        </w:rPr>
-        <w:t xml:space="preserve"> מבנה נתונים ששומר סט של אלמנטים ייחודיים</w:t>
+        <w:t xml:space="preserve"> - מבנה נתונים ששומר סט של אלמנטים ייחודיים</w:t>
       </w:r>
     </w:p>
     <w:p>
@@ -1521,18 +1223,8 @@
           <w:rtl/>
           <w:lang w:val="en-US"/>
         </w:rPr>
-        <w:t xml:space="preserve"> המסודרים לפי דירוג </w:t>
-      </w:r>
-      <w:proofErr w:type="spellStart"/>
-      <w:r>
-        <w:rPr>
-          <w:rFonts w:hint="cs"/>
-          <w:rtl/>
-          <w:lang w:val="en-US"/>
-        </w:rPr>
-        <w:t>מסויים</w:t>
-      </w:r>
-      <w:proofErr w:type="spellEnd"/>
+        <w:t xml:space="preserve"> המסודרים לפי דירוג מסויים</w:t>
+      </w:r>
     </w:p>
     <w:p>
       <w:pPr>
@@ -1851,65 +1543,20 @@
           <w:lang w:val="en-US"/>
         </w:rPr>
       </w:pPr>
-      <w:proofErr w:type="spellStart"/>
-      <w:r>
-        <w:rPr>
-          <w:rFonts w:hint="cs"/>
-          <w:rtl/>
-        </w:rPr>
-        <w:t>מנגון</w:t>
-      </w:r>
-      <w:proofErr w:type="spellEnd"/>
-      <w:r>
-        <w:rPr>
-          <w:rFonts w:hint="cs"/>
-          <w:rtl/>
-        </w:rPr>
-        <w:t xml:space="preserve"> פינוי הזיכרון </w:t>
-      </w:r>
-      <w:r>
-        <w:rPr>
-          <w:rFonts w:hint="cs"/>
-          <w:rtl/>
-          <w:lang w:val="en-US"/>
-        </w:rPr>
-        <w:t xml:space="preserve">מונע מהשרת לקרוס עקב עומס בזיכרון, שומר על ביצועיים </w:t>
-      </w:r>
-      <w:proofErr w:type="spellStart"/>
-      <w:r>
-        <w:rPr>
-          <w:rFonts w:hint="cs"/>
-          <w:rtl/>
-          <w:lang w:val="en-US"/>
-        </w:rPr>
-        <w:t>אפטימלים</w:t>
-      </w:r>
-      <w:proofErr w:type="spellEnd"/>
-      <w:r>
-        <w:rPr>
-          <w:rFonts w:hint="cs"/>
-          <w:rtl/>
-          <w:lang w:val="en-US"/>
-        </w:rPr>
-        <w:t xml:space="preserve">, ומונע ממידע לא מעודכן להישאר בשרת. למנגנון יש חשיבות רבה ובלעדיו השרת עלול לקרוס או </w:t>
-      </w:r>
-      <w:proofErr w:type="spellStart"/>
-      <w:r>
-        <w:rPr>
-          <w:rFonts w:hint="cs"/>
-          <w:rtl/>
-          <w:lang w:val="en-US"/>
-        </w:rPr>
-        <w:t>שביצוכעיו</w:t>
-      </w:r>
-      <w:proofErr w:type="spellEnd"/>
-      <w:r>
-        <w:rPr>
-          <w:rFonts w:hint="cs"/>
-          <w:rtl/>
-          <w:lang w:val="en-US"/>
-        </w:rPr>
-        <w:t xml:space="preserve"> יהיו איטיים.</w:t>
+      <w:r>
+        <w:rPr>
+          <w:rFonts w:hint="cs"/>
+          <w:rtl/>
+        </w:rPr>
+        <w:t xml:space="preserve">מנגון פינוי הזיכרון </w:t>
+      </w:r>
+      <w:r>
+        <w:rPr>
+          <w:rFonts w:hint="cs"/>
+          <w:rtl/>
+          <w:lang w:val="en-US"/>
+        </w:rPr>
+        <w:t>מונע מהשרת לקרוס עקב עומס בזיכרון, שומר על ביצועיים אפטימלים, ומונע ממידע לא מעודכן להישאר בשרת. למנגנון יש חשיבות רבה ובלעדיו השרת עלול לקרוס או שביצוכעיו יהיו איטיים.</w:t>
       </w:r>
     </w:p>
     <w:p>
@@ -1947,32 +1594,183 @@
         <w:bidi/>
       </w:pPr>
       <w:r>
-        <w:t>’</w:t>
-      </w:r>
-      <w:proofErr w:type="gramStart"/>
-      <w:r>
-        <w:t>topics</w:t>
-      </w:r>
-      <w:proofErr w:type="gramEnd"/>
-      <w:r>
-        <w:t xml:space="preserve">, partitions, producers, </w:t>
-      </w:r>
-      <w:proofErr w:type="gramStart"/>
-      <w:r>
+        <w:t>’topics, partitions, producers, consumers</w:t>
+      </w:r>
+      <w:r>
+        <w:rPr>
+          <w:rtl/>
+        </w:rPr>
+        <w:t xml:space="preserve"> : - הסבר את המושגים הבאים</w:t>
+      </w:r>
+    </w:p>
+    <w:p>
+      <w:pPr>
+        <w:bidi/>
+        <w:ind w:left="720"/>
+        <w:rPr>
+          <w:rFonts w:hint="cs"/>
+          <w:rtl/>
+          <w:lang w:val="en-US"/>
+        </w:rPr>
+      </w:pPr>
+      <w:r>
+        <w:t>Topic</w:t>
+      </w:r>
+      <w:r>
+        <w:rPr>
+          <w:rFonts w:hint="cs"/>
+          <w:rtl/>
+        </w:rPr>
+        <w:t xml:space="preserve"> </w:t>
+      </w:r>
+      <w:r>
+        <w:rPr>
+          <w:rtl/>
+        </w:rPr>
+        <w:t>–</w:t>
+      </w:r>
+      <w:r>
+        <w:rPr>
+          <w:rFonts w:hint="cs"/>
+          <w:rtl/>
+        </w:rPr>
+        <w:t xml:space="preserve"> נושא מסויים שאליו </w:t>
+      </w:r>
+      <w:r>
+        <w:rPr>
+          <w:lang w:val="en-US"/>
+        </w:rPr>
         <w:t>consumers</w:t>
       </w:r>
       <w:r>
         <w:rPr>
-          <w:rtl/>
-        </w:rPr>
-        <w:t xml:space="preserve"> :</w:t>
-      </w:r>
-      <w:proofErr w:type="gramEnd"/>
-      <w:r>
-        <w:rPr>
-          <w:rtl/>
-        </w:rPr>
-        <w:t xml:space="preserve"> - הסבר את המושגים הבאים</w:t>
+          <w:rFonts w:hint="cs"/>
+          <w:rtl/>
+          <w:lang w:val="en-US"/>
+        </w:rPr>
+        <w:t xml:space="preserve"> נרשמים וממנו הם קוראים הודעות ואליו </w:t>
+      </w:r>
+      <w:r>
+        <w:rPr>
+          <w:lang w:val="en-US"/>
+        </w:rPr>
+        <w:t>producers</w:t>
+      </w:r>
+      <w:r>
+        <w:rPr>
+          <w:rFonts w:hint="cs"/>
+          <w:rtl/>
+          <w:lang w:val="en-US"/>
+        </w:rPr>
+        <w:t xml:space="preserve"> מפרסמים הודעות</w:t>
+      </w:r>
+    </w:p>
+    <w:p>
+      <w:pPr>
+        <w:bidi/>
+        <w:rPr>
+          <w:rtl/>
+          <w:lang w:val="en-US"/>
+        </w:rPr>
+      </w:pPr>
+      <w:r>
+        <w:rPr>
+          <w:rtl/>
+        </w:rPr>
+        <w:tab/>
+      </w:r>
+      <w:r>
+        <w:rPr>
+          <w:lang w:val="en-US"/>
+        </w:rPr>
+        <w:t xml:space="preserve">Producer </w:t>
+      </w:r>
+      <w:r>
+        <w:rPr>
+          <w:rFonts w:hint="cs"/>
+          <w:rtl/>
+          <w:lang w:val="en-US"/>
+        </w:rPr>
+        <w:t xml:space="preserve"> - תוכנה או שירות אשר מפרסמים הודעות אל </w:t>
+      </w:r>
+      <w:r>
+        <w:rPr>
+          <w:lang w:val="en-US"/>
+        </w:rPr>
+        <w:t>topic</w:t>
+      </w:r>
+      <w:r>
+        <w:rPr>
+          <w:rFonts w:hint="cs"/>
+          <w:rtl/>
+          <w:lang w:val="en-US"/>
+        </w:rPr>
+        <w:t xml:space="preserve"> מסויים</w:t>
+      </w:r>
+    </w:p>
+    <w:p>
+      <w:pPr>
+        <w:bidi/>
+        <w:rPr>
+          <w:rtl/>
+          <w:lang w:val="en-US"/>
+        </w:rPr>
+      </w:pPr>
+      <w:r>
+        <w:rPr>
+          <w:rtl/>
+          <w:lang w:val="en-US"/>
+        </w:rPr>
+        <w:tab/>
+      </w:r>
+      <w:r>
+        <w:rPr>
+          <w:lang w:val="en-US"/>
+        </w:rPr>
+        <w:t>Consu</w:t>
+      </w:r>
+      <w:r>
+        <w:rPr>
+          <w:lang w:val="en-US"/>
+        </w:rPr>
+        <w:t>mer</w:t>
+      </w:r>
+      <w:r>
+        <w:rPr>
+          <w:rFonts w:hint="cs"/>
+          <w:rtl/>
+          <w:lang w:val="en-US"/>
+        </w:rPr>
+        <w:t xml:space="preserve"> </w:t>
+      </w:r>
+      <w:r>
+        <w:rPr>
+          <w:rtl/>
+          <w:lang w:val="en-US"/>
+        </w:rPr>
+        <w:t>–</w:t>
+      </w:r>
+      <w:r>
+        <w:rPr>
+          <w:rFonts w:hint="cs"/>
+          <w:rtl/>
+          <w:lang w:val="en-US"/>
+        </w:rPr>
+        <w:t xml:space="preserve"> תוכנה או שירות אשר קורא הודעות מ</w:t>
+      </w:r>
+      <w:r>
+        <w:rPr>
+          <w:lang w:val="en-US"/>
+        </w:rPr>
+        <w:t xml:space="preserve">topic </w:t>
+      </w:r>
+      <w:r>
+        <w:rPr>
+          <w:rFonts w:hint="cs"/>
+          <w:rtl/>
+          <w:lang w:val="en-US"/>
+        </w:rPr>
+        <w:t xml:space="preserve"> אחד או יותר</w:t>
       </w:r>
     </w:p>
     <w:p>
@@ -1986,18 +1784,23 @@
         </w:rPr>
       </w:pPr>
       <w:r>
-        <w:t>Topic</w:t>
-      </w:r>
-      <w:r>
-        <w:rPr>
-          <w:rFonts w:hint="cs"/>
-          <w:rtl/>
+        <w:rPr>
+          <w:lang w:val="en-US"/>
+        </w:rPr>
+        <w:t>Partitions</w:t>
+      </w:r>
+      <w:r>
+        <w:rPr>
+          <w:rFonts w:hint="cs"/>
+          <w:rtl/>
+          <w:lang w:val="en-US"/>
         </w:rPr>
         <w:t xml:space="preserve"> </w:t>
       </w:r>
       <w:r>
         <w:rPr>
           <w:rtl/>
+          <w:lang w:val="en-US"/>
         </w:rPr>
         <w:t>–</w:t>
       </w:r>
@@ -2005,91 +1808,9 @@
         <w:rPr>
           <w:rFonts w:hint="cs"/>
           <w:rtl/>
-        </w:rPr>
-        <w:t xml:space="preserve"> נושא </w:t>
-      </w:r>
-      <w:proofErr w:type="spellStart"/>
-      <w:r>
-        <w:rPr>
-          <w:rFonts w:hint="cs"/>
-          <w:rtl/>
-        </w:rPr>
-        <w:t>מסויים</w:t>
-      </w:r>
-      <w:proofErr w:type="spellEnd"/>
-      <w:r>
-        <w:rPr>
-          <w:rFonts w:hint="cs"/>
-          <w:rtl/>
-        </w:rPr>
-        <w:t xml:space="preserve"> שאליו </w:t>
-      </w:r>
-      <w:r>
-        <w:rPr>
-          <w:lang w:val="en-US"/>
-        </w:rPr>
-        <w:t>consumers</w:t>
-      </w:r>
-      <w:r>
-        <w:rPr>
-          <w:rFonts w:hint="cs"/>
-          <w:rtl/>
-          <w:lang w:val="en-US"/>
-        </w:rPr>
-        <w:t xml:space="preserve"> נרשמים וממנו הם קוראים הודעות ואליו </w:t>
-      </w:r>
-      <w:r>
-        <w:rPr>
-          <w:lang w:val="en-US"/>
-        </w:rPr>
-        <w:t>producers</w:t>
-      </w:r>
-      <w:r>
-        <w:rPr>
-          <w:rFonts w:hint="cs"/>
-          <w:rtl/>
-          <w:lang w:val="en-US"/>
-        </w:rPr>
-        <w:t xml:space="preserve"> מפרסמים הודעות</w:t>
-      </w:r>
-    </w:p>
-    <w:p>
-      <w:pPr>
-        <w:bidi/>
-        <w:rPr>
-          <w:rtl/>
-          <w:lang w:val="en-US"/>
-        </w:rPr>
-      </w:pPr>
-      <w:r>
-        <w:rPr>
-          <w:rtl/>
-        </w:rPr>
-        <w:tab/>
-      </w:r>
-      <w:proofErr w:type="gramStart"/>
-      <w:r>
-        <w:rPr>
-          <w:lang w:val="en-US"/>
-        </w:rPr>
-        <w:t xml:space="preserve">Producer </w:t>
-      </w:r>
-      <w:r>
-        <w:rPr>
-          <w:rFonts w:hint="cs"/>
-          <w:rtl/>
-          <w:lang w:val="en-US"/>
-        </w:rPr>
-        <w:t xml:space="preserve"> -</w:t>
-      </w:r>
-      <w:proofErr w:type="gramEnd"/>
-      <w:r>
-        <w:rPr>
-          <w:rFonts w:hint="cs"/>
-          <w:rtl/>
-          <w:lang w:val="en-US"/>
-        </w:rPr>
-        <w:t xml:space="preserve"> תוכנה או שירות אשר מפרסמים הודעות אל </w:t>
+          <w:lang w:val="en-US"/>
+        </w:rPr>
+        <w:t xml:space="preserve"> חלוקות של </w:t>
       </w:r>
       <w:r>
         <w:rPr>
@@ -2103,92 +1824,247 @@
           <w:rtl/>
           <w:lang w:val="en-US"/>
         </w:rPr>
+        <w:t xml:space="preserve"> . המידע שנמצא ב</w:t>
+      </w:r>
+      <w:r>
+        <w:rPr>
+          <w:lang w:val="en-US"/>
+        </w:rPr>
+        <w:t>topic</w:t>
+      </w:r>
+      <w:r>
+        <w:rPr>
+          <w:rFonts w:hint="cs"/>
+          <w:rtl/>
+          <w:lang w:val="en-US"/>
+        </w:rPr>
+        <w:t xml:space="preserve"> מתחלק בין ה </w:t>
+      </w:r>
+      <w:r>
+        <w:rPr>
+          <w:lang w:val="en-US"/>
+        </w:rPr>
+        <w:t>partition</w:t>
+      </w:r>
+      <w:r>
+        <w:rPr>
+          <w:rFonts w:hint="cs"/>
+          <w:rtl/>
+          <w:lang w:val="en-US"/>
+        </w:rPr>
+        <w:t>-ים וכך אפשר לקרוא את המידע מ</w:t>
+      </w:r>
+      <w:r>
+        <w:rPr>
+          <w:lang w:val="en-US"/>
+        </w:rPr>
+        <w:t>topic</w:t>
+      </w:r>
+      <w:r>
+        <w:rPr>
+          <w:rFonts w:hint="cs"/>
+          <w:rtl/>
+          <w:lang w:val="en-US"/>
+        </w:rPr>
+        <w:t xml:space="preserve"> מהר יותר</w:t>
+      </w:r>
+    </w:p>
+    <w:p>
+      <w:pPr>
+        <w:bidi/>
+        <w:rPr>
+          <w:rtl/>
+        </w:rPr>
+      </w:pPr>
+      <w:r>
+        <w:t>?RabbitMQ</w:t>
+      </w:r>
+      <w:r>
+        <w:rPr>
+          <w:rtl/>
+        </w:rPr>
+        <w:t xml:space="preserve"> ל </w:t>
+      </w:r>
+      <w:r>
+        <w:t>Kafka</w:t>
+      </w:r>
+      <w:r>
+        <w:rPr>
+          <w:rtl/>
+        </w:rPr>
+        <w:t xml:space="preserve"> - מה ההבדל בין</w:t>
+      </w:r>
+    </w:p>
+    <w:p>
+      <w:pPr>
+        <w:bidi/>
+        <w:ind w:left="720"/>
+        <w:rPr>
+          <w:rFonts w:hint="cs"/>
+          <w:rtl/>
+          <w:lang w:val="en-US"/>
+        </w:rPr>
+      </w:pPr>
+      <w:r>
+        <w:rPr>
+          <w:lang w:val="en-US"/>
+        </w:rPr>
+        <w:t>RabbitMQ</w:t>
+      </w:r>
+      <w:r>
+        <w:rPr>
+          <w:rFonts w:hint="cs"/>
+          <w:rtl/>
+          <w:lang w:val="en-US"/>
+        </w:rPr>
+        <w:t xml:space="preserve"> משמש לניתוב מורכב של הודעות </w:t>
+      </w:r>
+      <w:r>
+        <w:rPr>
+          <w:rFonts w:hint="cs"/>
+          <w:rtl/>
+          <w:lang w:val="en-US"/>
+        </w:rPr>
+        <w:t>והעברת משימות לשירותים שונים במערכת וכאשר הודעה נקראת מתור היא נמחקת מאותו התור, בעוד ש</w:t>
+      </w:r>
+      <w:r>
+        <w:rPr>
+          <w:lang w:val="en-US"/>
+        </w:rPr>
+        <w:t>Kafka</w:t>
+      </w:r>
+      <w:r>
+        <w:rPr>
+          <w:rFonts w:hint="cs"/>
+          <w:rtl/>
+          <w:lang w:val="en-US"/>
+        </w:rPr>
+        <w:t xml:space="preserve"> משמש כ</w:t>
+      </w:r>
+      <w:r>
+        <w:rPr>
+          <w:lang w:val="en-US"/>
+        </w:rPr>
+        <w:t>log</w:t>
+      </w:r>
+      <w:r>
+        <w:rPr>
+          <w:rFonts w:hint="cs"/>
+          <w:rtl/>
+          <w:lang w:val="en-US"/>
+        </w:rPr>
+        <w:t xml:space="preserve"> מבוזר וכאשר הודעה נכתבת ל</w:t>
+      </w:r>
+      <w:r>
+        <w:rPr>
+          <w:lang w:val="en-US"/>
+        </w:rPr>
+        <w:t>kafka</w:t>
+      </w:r>
+      <w:r>
+        <w:rPr>
+          <w:rFonts w:hint="cs"/>
+          <w:rtl/>
+          <w:lang w:val="en-US"/>
+        </w:rPr>
+        <w:t xml:space="preserve"> היא נשארת שם לכמות זמן מוגדרת גם אם קראו אותה (מה שמאפשר שמספר צרכנים יקראו את אותה הודעה)</w:t>
+      </w:r>
+    </w:p>
+    <w:p>
+      <w:pPr>
+        <w:bidi/>
+        <w:rPr>
+          <w:rtl/>
+        </w:rPr>
+      </w:pPr>
+      <w:r>
+        <w:rPr>
+          <w:rtl/>
+        </w:rPr>
+        <w:t>- איך מנגנון שמירת ההודעות עובד? מתי הודעה נמחקת?</w:t>
+      </w:r>
+    </w:p>
+    <w:p>
+      <w:pPr>
+        <w:bidi/>
+        <w:ind w:left="720"/>
+        <w:rPr>
+          <w:rFonts w:hint="cs"/>
+          <w:rtl/>
+          <w:lang w:val="en-US"/>
+        </w:rPr>
+      </w:pPr>
+      <w:r>
+        <w:rPr>
+          <w:rFonts w:hint="cs"/>
+          <w:rtl/>
+        </w:rPr>
+        <w:t>הודעות נשמרות כמות מוגדרת של זמן ונמחקות לאחר מכן,</w:t>
+      </w:r>
+      <w:r>
+        <w:rPr>
+          <w:lang w:val="en-US"/>
+        </w:rPr>
         <w:t xml:space="preserve"> </w:t>
       </w:r>
-      <w:proofErr w:type="spellStart"/>
-      <w:r>
-        <w:rPr>
-          <w:rFonts w:hint="cs"/>
-          <w:rtl/>
-          <w:lang w:val="en-US"/>
-        </w:rPr>
-        <w:t>מסויים</w:t>
-      </w:r>
-      <w:proofErr w:type="spellEnd"/>
-    </w:p>
-    <w:p>
-      <w:pPr>
-        <w:bidi/>
-        <w:rPr>
-          <w:rtl/>
-          <w:lang w:val="en-US"/>
-        </w:rPr>
-      </w:pPr>
-      <w:r>
-        <w:rPr>
-          <w:rtl/>
-          <w:lang w:val="en-US"/>
-        </w:rPr>
-        <w:tab/>
-      </w:r>
-      <w:r>
-        <w:rPr>
-          <w:lang w:val="en-US"/>
-        </w:rPr>
-        <w:t>Consu</w:t>
-      </w:r>
-      <w:r>
-        <w:rPr>
-          <w:lang w:val="en-US"/>
-        </w:rPr>
-        <w:t>mer</w:t>
-      </w:r>
-      <w:r>
-        <w:rPr>
-          <w:rFonts w:hint="cs"/>
-          <w:rtl/>
-          <w:lang w:val="en-US"/>
+      <w:r>
+        <w:rPr>
+          <w:rFonts w:hint="cs"/>
+          <w:rtl/>
+          <w:lang w:val="en-US"/>
+        </w:rPr>
+        <w:t xml:space="preserve"> ניתן להגדיר גם שההודעות יישאר</w:t>
+      </w:r>
+      <w:r>
+        <w:rPr>
+          <w:rFonts w:hint="eastAsia"/>
+          <w:rtl/>
+          <w:lang w:val="en-US"/>
+        </w:rPr>
+        <w:t>ו</w:t>
+      </w:r>
+      <w:r>
+        <w:rPr>
+          <w:rFonts w:hint="cs"/>
+          <w:rtl/>
+          <w:lang w:val="en-US"/>
+        </w:rPr>
+        <w:t xml:space="preserve"> לנצח</w:t>
+      </w:r>
+    </w:p>
+    <w:p>
+      <w:pPr>
+        <w:bidi/>
+        <w:rPr>
+          <w:rtl/>
+        </w:rPr>
+      </w:pPr>
+      <w:r>
+        <w:rPr>
+          <w:rtl/>
+        </w:rPr>
+        <w:t xml:space="preserve">מבטיחה שמידע לא יאבד גם אם אחד השרתים קורס? </w:t>
+      </w:r>
+      <w:r>
+        <w:t>Kafka</w:t>
+      </w:r>
+      <w:r>
+        <w:rPr>
+          <w:rtl/>
         </w:rPr>
         <w:t xml:space="preserve"> </w:t>
       </w:r>
       <w:r>
         <w:rPr>
           <w:rtl/>
-          <w:lang w:val="en-US"/>
         </w:rPr>
         <w:t>–</w:t>
       </w:r>
       <w:r>
         <w:rPr>
-          <w:rFonts w:hint="cs"/>
-          <w:rtl/>
-          <w:lang w:val="en-US"/>
-        </w:rPr>
-        <w:t xml:space="preserve"> תוכנה או שירות אשר קורא הודעות מ</w:t>
-      </w:r>
-      <w:proofErr w:type="gramStart"/>
-      <w:r>
-        <w:rPr>
-          <w:lang w:val="en-US"/>
-        </w:rPr>
-        <w:t xml:space="preserve">topic </w:t>
-      </w:r>
-      <w:r>
-        <w:rPr>
-          <w:rFonts w:hint="cs"/>
-          <w:rtl/>
-          <w:lang w:val="en-US"/>
-        </w:rPr>
-        <w:t xml:space="preserve"> אחד</w:t>
-      </w:r>
-      <w:proofErr w:type="gramEnd"/>
-      <w:r>
-        <w:rPr>
-          <w:rFonts w:hint="cs"/>
-          <w:rtl/>
-          <w:lang w:val="en-US"/>
-        </w:rPr>
-        <w:t xml:space="preserve"> או יותר</w:t>
+          <w:rtl/>
+        </w:rPr>
+        <w:t xml:space="preserve"> כיצד</w:t>
       </w:r>
     </w:p>
     <w:p>
@@ -2203,34 +2079,12 @@
       </w:pPr>
       <w:r>
         <w:rPr>
-          <w:lang w:val="en-US"/>
-        </w:rPr>
-        <w:t>Partitions</w:t>
-      </w:r>
-      <w:r>
-        <w:rPr>
-          <w:rFonts w:hint="cs"/>
-          <w:rtl/>
-          <w:lang w:val="en-US"/>
-        </w:rPr>
-        <w:t xml:space="preserve"> </w:t>
-      </w:r>
-      <w:r>
-        <w:rPr>
-          <w:rtl/>
-          <w:lang w:val="en-US"/>
-        </w:rPr>
-        <w:t>–</w:t>
-      </w:r>
-      <w:r>
-        <w:rPr>
-          <w:rFonts w:hint="cs"/>
-          <w:rtl/>
-          <w:lang w:val="en-US"/>
-        </w:rPr>
-        <w:t xml:space="preserve"> חלוקות של </w:t>
-      </w:r>
-      <w:proofErr w:type="gramStart"/>
+          <w:rFonts w:hint="cs"/>
+          <w:rtl/>
+          <w:lang w:val="en-US"/>
+        </w:rPr>
+        <w:t>כשמידע נכנס ל</w:t>
+      </w:r>
       <w:r>
         <w:rPr>
           <w:lang w:val="en-US"/>
@@ -2243,30 +2097,7 @@
           <w:rtl/>
           <w:lang w:val="en-US"/>
         </w:rPr>
-        <w:t xml:space="preserve"> .</w:t>
-      </w:r>
-      <w:proofErr w:type="gramEnd"/>
-      <w:r>
-        <w:rPr>
-          <w:rFonts w:hint="cs"/>
-          <w:rtl/>
-          <w:lang w:val="en-US"/>
-        </w:rPr>
-        <w:t xml:space="preserve"> המידע שנמצא ב</w:t>
-      </w:r>
-      <w:r>
-        <w:rPr>
-          <w:lang w:val="en-US"/>
-        </w:rPr>
-        <w:t>topic</w:t>
-      </w:r>
-      <w:r>
-        <w:rPr>
-          <w:rFonts w:hint="cs"/>
-          <w:rtl/>
-          <w:lang w:val="en-US"/>
-        </w:rPr>
-        <w:t xml:space="preserve"> מתחלק בין ה </w:t>
+        <w:t xml:space="preserve"> הוא מחולק ל</w:t>
       </w:r>
       <w:r>
         <w:rPr>
@@ -2280,256 +2111,7 @@
           <w:rtl/>
           <w:lang w:val="en-US"/>
         </w:rPr>
-        <w:t>-ים וכך אפשר לקרוא את המידע מ</w:t>
-      </w:r>
-      <w:r>
-        <w:rPr>
-          <w:lang w:val="en-US"/>
-        </w:rPr>
-        <w:t>topic</w:t>
-      </w:r>
-      <w:r>
-        <w:rPr>
-          <w:rFonts w:hint="cs"/>
-          <w:rtl/>
-          <w:lang w:val="en-US"/>
-        </w:rPr>
-        <w:t xml:space="preserve"> מהר יותר</w:t>
-      </w:r>
-    </w:p>
-    <w:p>
-      <w:pPr>
-        <w:bidi/>
-        <w:rPr>
-          <w:rtl/>
-        </w:rPr>
-      </w:pPr>
-      <w:proofErr w:type="gramStart"/>
-      <w:r>
-        <w:t>?RabbitMQ</w:t>
-      </w:r>
-      <w:proofErr w:type="gramEnd"/>
-      <w:r>
-        <w:rPr>
-          <w:rtl/>
-        </w:rPr>
-        <w:t xml:space="preserve"> ל </w:t>
-      </w:r>
-      <w:r>
-        <w:t>Kafka</w:t>
-      </w:r>
-      <w:r>
-        <w:rPr>
-          <w:rtl/>
-        </w:rPr>
-        <w:t xml:space="preserve"> - מה ההבדל בין</w:t>
-      </w:r>
-    </w:p>
-    <w:p>
-      <w:pPr>
-        <w:bidi/>
-        <w:ind w:left="720"/>
-        <w:rPr>
-          <w:rFonts w:hint="cs"/>
-          <w:rtl/>
-          <w:lang w:val="en-US"/>
-        </w:rPr>
-      </w:pPr>
-      <w:r>
-        <w:rPr>
-          <w:lang w:val="en-US"/>
-        </w:rPr>
-        <w:t>RabbitMQ</w:t>
-      </w:r>
-      <w:r>
-        <w:rPr>
-          <w:rFonts w:hint="cs"/>
-          <w:rtl/>
-          <w:lang w:val="en-US"/>
-        </w:rPr>
-        <w:t xml:space="preserve"> משמש לניתוב מורכב של הודעות </w:t>
-      </w:r>
-      <w:r>
-        <w:rPr>
-          <w:rFonts w:hint="cs"/>
-          <w:rtl/>
-          <w:lang w:val="en-US"/>
-        </w:rPr>
-        <w:t>והעברת משימות לשירותים שונים במערכת וכאשר הודעה נקראת מתור היא נמחקת מאותו התור, בעוד ש</w:t>
-      </w:r>
-      <w:r>
-        <w:rPr>
-          <w:lang w:val="en-US"/>
-        </w:rPr>
-        <w:t>Kafka</w:t>
-      </w:r>
-      <w:r>
-        <w:rPr>
-          <w:rFonts w:hint="cs"/>
-          <w:rtl/>
-          <w:lang w:val="en-US"/>
-        </w:rPr>
-        <w:t xml:space="preserve"> משמש כ</w:t>
-      </w:r>
-      <w:r>
-        <w:rPr>
-          <w:lang w:val="en-US"/>
-        </w:rPr>
-        <w:t>log</w:t>
-      </w:r>
-      <w:r>
-        <w:rPr>
-          <w:rFonts w:hint="cs"/>
-          <w:rtl/>
-          <w:lang w:val="en-US"/>
-        </w:rPr>
-        <w:t xml:space="preserve"> מבוזר וכאשר הודעה נכתבת ל</w:t>
-      </w:r>
-      <w:proofErr w:type="spellStart"/>
-      <w:r>
-        <w:rPr>
-          <w:lang w:val="en-US"/>
-        </w:rPr>
-        <w:t>kafka</w:t>
-      </w:r>
-      <w:proofErr w:type="spellEnd"/>
-      <w:r>
-        <w:rPr>
-          <w:rFonts w:hint="cs"/>
-          <w:rtl/>
-          <w:lang w:val="en-US"/>
-        </w:rPr>
-        <w:t xml:space="preserve"> היא נשארת שם לכמות זמן מוגדרת גם אם קראו אותה (מה שמאפשר שמספר צרכנים יקראו את אותה הודעה)</w:t>
-      </w:r>
-    </w:p>
-    <w:p>
-      <w:pPr>
-        <w:bidi/>
-        <w:rPr>
-          <w:rtl/>
-        </w:rPr>
-      </w:pPr>
-      <w:r>
-        <w:rPr>
-          <w:rtl/>
-        </w:rPr>
-        <w:t>- איך מנגנון שמירת ההודעות עובד? מתי הודעה נמחקת?</w:t>
-      </w:r>
-    </w:p>
-    <w:p>
-      <w:pPr>
-        <w:bidi/>
-        <w:ind w:left="720"/>
-        <w:rPr>
-          <w:rFonts w:hint="cs"/>
-          <w:rtl/>
-          <w:lang w:val="en-US"/>
-        </w:rPr>
-      </w:pPr>
-      <w:r>
-        <w:rPr>
-          <w:rFonts w:hint="cs"/>
-          <w:rtl/>
-        </w:rPr>
-        <w:t>הודעות נשמרות כמות מוגדרת של זמן ונמחקות לאחר מכן,</w:t>
-      </w:r>
-      <w:r>
-        <w:rPr>
-          <w:lang w:val="en-US"/>
-        </w:rPr>
-        <w:t xml:space="preserve"> </w:t>
-      </w:r>
-      <w:r>
-        <w:rPr>
-          <w:rFonts w:hint="cs"/>
-          <w:rtl/>
-          <w:lang w:val="en-US"/>
-        </w:rPr>
-        <w:t xml:space="preserve"> ניתן להגדיר גם שההודעות יישאר</w:t>
-      </w:r>
-      <w:r>
-        <w:rPr>
-          <w:rFonts w:hint="eastAsia"/>
-          <w:rtl/>
-          <w:lang w:val="en-US"/>
-        </w:rPr>
-        <w:t>ו</w:t>
-      </w:r>
-      <w:r>
-        <w:rPr>
-          <w:rFonts w:hint="cs"/>
-          <w:rtl/>
-          <w:lang w:val="en-US"/>
-        </w:rPr>
-        <w:t xml:space="preserve"> לנצח</w:t>
-      </w:r>
-    </w:p>
-    <w:p>
-      <w:pPr>
-        <w:bidi/>
-        <w:rPr>
-          <w:rtl/>
-        </w:rPr>
-      </w:pPr>
-      <w:r>
-        <w:rPr>
-          <w:rtl/>
-        </w:rPr>
-        <w:t xml:space="preserve">מבטיחה שמידע לא יאבד גם אם אחד השרתים קורס? </w:t>
-      </w:r>
-      <w:r>
-        <w:t>Kafka</w:t>
-      </w:r>
-      <w:r>
-        <w:rPr>
-          <w:rtl/>
-        </w:rPr>
-        <w:t xml:space="preserve"> </w:t>
-      </w:r>
-      <w:r>
-        <w:rPr>
-          <w:rtl/>
-        </w:rPr>
-        <w:t>–</w:t>
-      </w:r>
-      <w:r>
-        <w:rPr>
-          <w:rtl/>
-        </w:rPr>
-        <w:t xml:space="preserve"> כיצד</w:t>
-      </w:r>
-    </w:p>
-    <w:p>
-      <w:pPr>
-        <w:bidi/>
-        <w:ind w:left="720"/>
-        <w:rPr>
-          <w:rFonts w:hint="cs"/>
-          <w:rtl/>
-          <w:lang w:val="en-US"/>
-        </w:rPr>
-      </w:pPr>
-      <w:r>
-        <w:rPr>
-          <w:rFonts w:hint="cs"/>
-          <w:rtl/>
-          <w:lang w:val="en-US"/>
-        </w:rPr>
-        <w:t>כשמידע נכנס ל</w:t>
-      </w:r>
-      <w:r>
-        <w:rPr>
-          <w:lang w:val="en-US"/>
-        </w:rPr>
-        <w:t>topic</w:t>
-      </w:r>
-      <w:r>
-        <w:rPr>
-          <w:rFonts w:hint="cs"/>
-          <w:rtl/>
-          <w:lang w:val="en-US"/>
-        </w:rPr>
-        <w:t xml:space="preserve"> הוא מחולק ל</w:t>
+        <w:t>-ים אשר כל אחד מהם הוא קובץ לוגים אשר שמור על הדיסק וכך גם אם השרת קורס ההודעות נמצאות על הדיסק. בנוסף, ניתן להגדיר שכאשר מידע נכתב ל</w:t>
       </w:r>
       <w:r>
         <w:rPr>
@@ -2543,39 +2125,7 @@
           <w:rtl/>
           <w:lang w:val="en-US"/>
         </w:rPr>
-        <w:t>-ים אשר כל אחד מהם הוא קובץ לוגים אשר שמור על הדיסק וכך גם אם השרת קורס ההודעות נמצאות על הדיסק. בנוסף, ניתן להגדיר שכאשר מידע נכתב ל</w:t>
-      </w:r>
-      <w:r>
-        <w:rPr>
-          <w:lang w:val="en-US"/>
-        </w:rPr>
-        <w:t>partition</w:t>
-      </w:r>
-      <w:r>
-        <w:rPr>
-          <w:rFonts w:hint="cs"/>
-          <w:rtl/>
-          <w:lang w:val="en-US"/>
-        </w:rPr>
-        <w:t xml:space="preserve"> </w:t>
-      </w:r>
-      <w:proofErr w:type="spellStart"/>
-      <w:r>
-        <w:rPr>
-          <w:rFonts w:hint="cs"/>
-          <w:rtl/>
-          <w:lang w:val="en-US"/>
-        </w:rPr>
-        <w:t>מסויים</w:t>
-      </w:r>
-      <w:proofErr w:type="spellEnd"/>
-      <w:r>
-        <w:rPr>
-          <w:rFonts w:hint="cs"/>
-          <w:rtl/>
-          <w:lang w:val="en-US"/>
-        </w:rPr>
-        <w:t xml:space="preserve"> הוא ייכתב גם ל</w:t>
+        <w:t xml:space="preserve"> מסויים הוא ייכתב גם ל</w:t>
       </w:r>
       <w:r>
         <w:rPr>
@@ -2682,13 +2232,8 @@
         </w:rPr>
       </w:pPr>
       <w:r>
-        <w:t xml:space="preserve">connections, processors, </w:t>
-      </w:r>
-      <w:proofErr w:type="spellStart"/>
-      <w:r>
-        <w:t>FlowFiles</w:t>
-      </w:r>
-      <w:proofErr w:type="spellEnd"/>
+        <w:t>connections, processors, FlowFiles</w:t>
+      </w:r>
       <w:r>
         <w:rPr>
           <w:rtl/>
@@ -2763,14 +2308,12 @@
         </w:rPr>
         <w:t xml:space="preserve">-ים מקבלים </w:t>
       </w:r>
-      <w:proofErr w:type="spellStart"/>
       <w:r>
         <w:rPr>
           <w:lang w:val="en-US"/>
         </w:rPr>
         <w:t>FlowFile</w:t>
       </w:r>
-      <w:proofErr w:type="spellEnd"/>
       <w:r>
         <w:rPr>
           <w:rFonts w:hint="cs"/>
@@ -2793,14 +2336,12 @@
         </w:rPr>
         <w:t xml:space="preserve"> שקודם להם ומעבירים </w:t>
       </w:r>
-      <w:proofErr w:type="spellStart"/>
       <w:r>
         <w:rPr>
           <w:lang w:val="en-US"/>
         </w:rPr>
         <w:t>FlowFile</w:t>
       </w:r>
-      <w:proofErr w:type="spellEnd"/>
       <w:r>
         <w:rPr>
           <w:rFonts w:hint="cs"/>
@@ -2833,14 +2374,12 @@
           <w:lang w:val="en-US"/>
         </w:rPr>
       </w:pPr>
-      <w:proofErr w:type="spellStart"/>
       <w:r>
         <w:rPr>
           <w:lang w:val="en-US"/>
         </w:rPr>
         <w:t>FlowFile</w:t>
       </w:r>
-      <w:proofErr w:type="spellEnd"/>
       <w:r>
         <w:rPr>
           <w:rFonts w:hint="cs"/>
@@ -2924,14 +2463,12 @@
         </w:rPr>
         <w:t xml:space="preserve">ים שונים אשר מעבירים </w:t>
       </w:r>
-      <w:proofErr w:type="spellStart"/>
       <w:r>
         <w:rPr>
           <w:lang w:val="en-US"/>
         </w:rPr>
         <w:t>FlowFile</w:t>
       </w:r>
-      <w:proofErr w:type="spellEnd"/>
       <w:r>
         <w:rPr>
           <w:rFonts w:hint="cs"/>
@@ -3046,21 +2583,12 @@
           <w:rtl/>
         </w:rPr>
       </w:pPr>
-      <w:proofErr w:type="spellStart"/>
-      <w:r>
-        <w:rPr>
-          <w:rFonts w:hint="cs"/>
-          <w:rtl/>
-        </w:rPr>
-        <w:t>דיבוג</w:t>
-      </w:r>
-      <w:proofErr w:type="spellEnd"/>
-      <w:r>
-        <w:rPr>
-          <w:rFonts w:hint="cs"/>
-          <w:rtl/>
-        </w:rPr>
-        <w:t xml:space="preserve"> קל </w:t>
+      <w:r>
+        <w:rPr>
+          <w:rFonts w:hint="cs"/>
+          <w:rtl/>
+        </w:rPr>
+        <w:t xml:space="preserve">דיבוג קל </w:t>
       </w:r>
       <w:r>
         <w:rPr>
@@ -3073,23 +2601,7 @@
           <w:rFonts w:hint="cs"/>
           <w:rtl/>
         </w:rPr>
-        <w:t xml:space="preserve"> קל לראות איפה יש שגיאות ומה הן, וקל מאוד לבדוק את המערכת ולראות </w:t>
-      </w:r>
-      <w:proofErr w:type="spellStart"/>
-      <w:r>
-        <w:rPr>
-          <w:rFonts w:hint="cs"/>
-          <w:rtl/>
-        </w:rPr>
-        <w:t>שהכל</w:t>
-      </w:r>
-      <w:proofErr w:type="spellEnd"/>
-      <w:r>
-        <w:rPr>
-          <w:rFonts w:hint="cs"/>
-          <w:rtl/>
-        </w:rPr>
-        <w:t xml:space="preserve"> עובר בצורה חלקה ושכל חלק עושה את העבודה שלו כמו שצריך</w:t>
+        <w:t xml:space="preserve"> קל לראות איפה יש שגיאות ומה הן, וקל מאוד לבדוק את המערכת ולראות שהכל עובר בצורה חלקה ושכל חלק עושה את העבודה שלו כמו שצריך</w:t>
       </w:r>
       <w:r>
         <w:rPr>
@@ -3320,21 +2832,12 @@
         </w:rPr>
         <w:tab/>
       </w:r>
-      <w:proofErr w:type="spellStart"/>
-      <w:r>
-        <w:rPr>
-          <w:rFonts w:hint="cs"/>
-          <w:rtl/>
-        </w:rPr>
-        <w:t>דיבוג</w:t>
-      </w:r>
-      <w:proofErr w:type="spellEnd"/>
-      <w:r>
-        <w:rPr>
-          <w:rFonts w:hint="cs"/>
-          <w:rtl/>
-        </w:rPr>
-        <w:t xml:space="preserve"> קל </w:t>
+      <w:r>
+        <w:rPr>
+          <w:rFonts w:hint="cs"/>
+          <w:rtl/>
+        </w:rPr>
+        <w:t xml:space="preserve">דיבוג קל </w:t>
       </w:r>
       <w:r>
         <w:rPr>
@@ -3447,25 +2950,7 @@
           <w:rtl/>
           <w:lang w:val="en-US"/>
         </w:rPr>
-        <w:t xml:space="preserve">להרחיב רק את החלקים שצריכים הרחבה במערכת </w:t>
-      </w:r>
-      <w:proofErr w:type="gramStart"/>
-      <w:r>
-        <w:rPr>
-          <w:rFonts w:hint="cs"/>
-          <w:rtl/>
-          <w:lang w:val="en-US"/>
-        </w:rPr>
-        <w:t>( למשל</w:t>
-      </w:r>
-      <w:proofErr w:type="gramEnd"/>
-      <w:r>
-        <w:rPr>
-          <w:rFonts w:hint="cs"/>
-          <w:rtl/>
-          <w:lang w:val="en-US"/>
-        </w:rPr>
-        <w:t xml:space="preserve"> הרחבת שטח האחסון רק ל</w:t>
+        <w:t>להרחיב רק את החלקים שצריכים הרחבה במערכת ( למשל הרחבת שטח האחסון רק ל</w:t>
       </w:r>
       <w:r>
         <w:rPr>
@@ -3479,36 +2964,8 @@
           <w:rtl/>
           <w:lang w:val="en-US"/>
         </w:rPr>
-        <w:t xml:space="preserve"> אחד </w:t>
-      </w:r>
-      <w:proofErr w:type="spellStart"/>
-      <w:r>
-        <w:rPr>
-          <w:rFonts w:hint="cs"/>
-          <w:rtl/>
-          <w:lang w:val="en-US"/>
-        </w:rPr>
-        <w:t>מסויים</w:t>
-      </w:r>
-      <w:proofErr w:type="spellEnd"/>
-      <w:r>
-        <w:rPr>
-          <w:rFonts w:hint="cs"/>
-          <w:rtl/>
-          <w:lang w:val="en-US"/>
-        </w:rPr>
-        <w:t xml:space="preserve"> </w:t>
-      </w:r>
-      <w:proofErr w:type="gramStart"/>
-      <w:r>
-        <w:rPr>
-          <w:rFonts w:hint="cs"/>
-          <w:rtl/>
-          <w:lang w:val="en-US"/>
-        </w:rPr>
-        <w:t>במערכת )</w:t>
-      </w:r>
-      <w:proofErr w:type="gramEnd"/>
+        <w:t xml:space="preserve"> אחד מסויים במערכת )</w:t>
+      </w:r>
     </w:p>
     <w:p>
       <w:pPr>
@@ -3814,25 +3271,7 @@
           <w:rtl/>
           <w:lang w:val="en-US"/>
         </w:rPr>
-        <w:t xml:space="preserve"> קיימת הפרדה בין הלקוח אשר מבקש משאבים לבין השרת אשר מספק משאבים, כל אחד מהם לא צריך להיות מודע </w:t>
-      </w:r>
-      <w:proofErr w:type="spellStart"/>
-      <w:r>
-        <w:rPr>
-          <w:rFonts w:hint="cs"/>
-          <w:rtl/>
-          <w:lang w:val="en-US"/>
-        </w:rPr>
-        <w:t>לאיך</w:t>
-      </w:r>
-      <w:proofErr w:type="spellEnd"/>
-      <w:r>
-        <w:rPr>
-          <w:rFonts w:hint="cs"/>
-          <w:rtl/>
-          <w:lang w:val="en-US"/>
-        </w:rPr>
-        <w:t xml:space="preserve"> השני בנוי, ואת שניהם אפשר לפתח בנפרד</w:t>
+        <w:t xml:space="preserve"> קיימת הפרדה בין הלקוח אשר מבקש משאבים לבין השרת אשר מספק משאבים, כל אחד מהם לא צריך להיות מודע לאיך השני בנוי, ואת שניהם אפשר לפתח בנפרד</w:t>
       </w:r>
     </w:p>
     <w:p>
@@ -3909,14 +3348,12 @@
         </w:rPr>
         <w:tab/>
       </w:r>
-      <w:proofErr w:type="spellStart"/>
       <w:r>
         <w:rPr>
           <w:lang w:val="en-US"/>
         </w:rPr>
         <w:t>Cacheability</w:t>
       </w:r>
-      <w:proofErr w:type="spellEnd"/>
       <w:r>
         <w:rPr>
           <w:rFonts w:hint="cs"/>
@@ -3970,7 +3407,6 @@
         </w:rPr>
         <w:t xml:space="preserve"> </w:t>
       </w:r>
-      <w:proofErr w:type="gramStart"/>
       <w:r>
         <w:rPr>
           <w:rtl/>
@@ -3990,16 +3426,7 @@
           <w:rtl/>
           <w:lang w:val="en-US"/>
         </w:rPr>
-        <w:t xml:space="preserve"> עקרון</w:t>
-      </w:r>
-      <w:proofErr w:type="gramEnd"/>
-      <w:r>
-        <w:rPr>
-          <w:rFonts w:hint="cs"/>
-          <w:rtl/>
-          <w:lang w:val="en-US"/>
-        </w:rPr>
-        <w:t xml:space="preserve"> אשר מבטיח </w:t>
+        <w:t xml:space="preserve"> עקרון אשר מבטיח </w:t>
       </w:r>
       <w:r>
         <w:rPr>
@@ -4236,7 +3663,6 @@
           <w:lang w:val="en-US"/>
         </w:rPr>
       </w:pPr>
-      <w:proofErr w:type="gramStart"/>
       <w:r>
         <w:rPr>
           <w:lang w:val="en-US"/>
@@ -4250,16 +3676,7 @@
           <w:rtl/>
           <w:lang w:val="en-US"/>
         </w:rPr>
-        <w:t xml:space="preserve"> -</w:t>
-      </w:r>
-      <w:proofErr w:type="gramEnd"/>
-      <w:r>
-        <w:rPr>
-          <w:rFonts w:hint="cs"/>
-          <w:rtl/>
-          <w:lang w:val="en-US"/>
-        </w:rPr>
-        <w:t xml:space="preserve"> בקשה למחוק מידע מהשרת</w:t>
+        <w:t xml:space="preserve"> - בקשה למחוק מידע מהשרת</w:t>
       </w:r>
     </w:p>
     <w:p>
@@ -4659,165 +4076,129 @@
         <w:rPr>
           <w:lang w:val="en-US"/>
         </w:rPr>
-        <w:t xml:space="preserve">swagger </w:t>
-      </w:r>
-      <w:proofErr w:type="spellStart"/>
-      <w:r>
-        <w:rPr>
-          <w:lang w:val="en-US"/>
-        </w:rPr>
-        <w:t>codgen</w:t>
-      </w:r>
-      <w:proofErr w:type="spellEnd"/>
-      <w:r>
-        <w:rPr>
-          <w:rFonts w:hint="cs"/>
-          <w:rtl/>
-          <w:lang w:val="en-US"/>
-        </w:rPr>
-        <w:t xml:space="preserve"> ניתן </w:t>
-      </w:r>
-      <w:proofErr w:type="spellStart"/>
-      <w:r>
-        <w:rPr>
-          <w:rFonts w:hint="cs"/>
-          <w:rtl/>
-          <w:lang w:val="en-US"/>
-        </w:rPr>
-        <w:t>לג'נרט</w:t>
-      </w:r>
-      <w:proofErr w:type="spellEnd"/>
-      <w:r>
-        <w:rPr>
-          <w:rFonts w:hint="cs"/>
-          <w:rtl/>
+        <w:t>swagger codgen</w:t>
+      </w:r>
+      <w:r>
+        <w:rPr>
+          <w:rFonts w:hint="cs"/>
+          <w:rtl/>
+          <w:lang w:val="en-US"/>
+        </w:rPr>
+        <w:t xml:space="preserve"> ניתן לג'נרט </w:t>
+      </w:r>
+      <w:r>
+        <w:rPr>
+          <w:lang w:val="en-US"/>
+        </w:rPr>
+        <w:t>client sdk</w:t>
+      </w:r>
+      <w:r>
+        <w:rPr>
+          <w:rFonts w:hint="cs"/>
+          <w:rtl/>
+          <w:lang w:val="en-US"/>
+        </w:rPr>
+        <w:t xml:space="preserve"> ל</w:t>
+      </w:r>
+      <w:r>
+        <w:rPr>
+          <w:lang w:val="en-US"/>
+        </w:rPr>
+        <w:t>API</w:t>
+      </w:r>
+      <w:r>
+        <w:rPr>
+          <w:rFonts w:hint="cs"/>
+          <w:rtl/>
+          <w:lang w:val="en-US"/>
+        </w:rPr>
+        <w:t xml:space="preserve"> בצורה אוטומטית.</w:t>
+      </w:r>
+      <w:r>
+        <w:rPr>
           <w:lang w:val="en-US"/>
         </w:rPr>
         <w:t xml:space="preserve"> </w:t>
       </w:r>
-      <w:r>
-        <w:rPr>
-          <w:lang w:val="en-US"/>
-        </w:rPr>
-        <w:t xml:space="preserve">client </w:t>
-      </w:r>
-      <w:proofErr w:type="spellStart"/>
-      <w:r>
-        <w:rPr>
-          <w:lang w:val="en-US"/>
-        </w:rPr>
-        <w:t>sdk</w:t>
-      </w:r>
-      <w:proofErr w:type="spellEnd"/>
-      <w:r>
-        <w:rPr>
-          <w:rFonts w:hint="cs"/>
-          <w:rtl/>
-          <w:lang w:val="en-US"/>
-        </w:rPr>
-        <w:t xml:space="preserve"> ל</w:t>
-      </w:r>
-      <w:r>
-        <w:rPr>
-          <w:lang w:val="en-US"/>
-        </w:rPr>
-        <w:t>API</w:t>
-      </w:r>
-      <w:r>
-        <w:rPr>
-          <w:rFonts w:hint="cs"/>
-          <w:rtl/>
-          <w:lang w:val="en-US"/>
-        </w:rPr>
-        <w:t xml:space="preserve"> בצורה אוטומטית.</w:t>
-      </w:r>
-      <w:r>
-        <w:rPr>
-          <w:lang w:val="en-US"/>
+    </w:p>
+    <w:p>
+      <w:pPr>
+        <w:bidi/>
+        <w:rPr>
+          <w:rtl/>
+        </w:rPr>
+      </w:pPr>
+      <w:r>
+        <w:rPr>
+          <w:rtl/>
+        </w:rPr>
+        <w:t xml:space="preserve">נועד רק לתיעוד? אם לא תאר מה עוד שימוש אפשרי בו </w:t>
+      </w:r>
+      <w:r>
+        <w:t>swagger</w:t>
+      </w:r>
+      <w:r>
+        <w:rPr>
+          <w:rtl/>
         </w:rPr>
         <w:t xml:space="preserve"> </w:t>
       </w:r>
-    </w:p>
-    <w:p>
-      <w:pPr>
-        <w:bidi/>
-        <w:rPr>
-          <w:rtl/>
-        </w:rPr>
-      </w:pPr>
-      <w:r>
-        <w:rPr>
-          <w:rtl/>
-        </w:rPr>
-        <w:t xml:space="preserve">נועד רק לתיעוד? אם לא תאר מה עוד שימוש אפשרי בו </w:t>
-      </w:r>
-      <w:r>
+      <w:r>
+        <w:rPr>
+          <w:rtl/>
+        </w:rPr>
+        <w:t>–</w:t>
+      </w:r>
+      <w:r>
+        <w:rPr>
+          <w:rtl/>
+        </w:rPr>
+        <w:t xml:space="preserve"> האם</w:t>
+      </w:r>
+    </w:p>
+    <w:p>
+      <w:pPr>
+        <w:bidi/>
+        <w:rPr>
+          <w:rFonts w:hint="cs"/>
+          <w:rtl/>
+          <w:lang w:val="en-US"/>
+        </w:rPr>
+      </w:pPr>
+      <w:r>
+        <w:rPr>
+          <w:rtl/>
+        </w:rPr>
+        <w:tab/>
+      </w:r>
+      <w:r>
+        <w:rPr>
+          <w:rFonts w:hint="cs"/>
+          <w:rtl/>
+          <w:lang w:val="en-US"/>
+        </w:rPr>
+        <w:t>שימוש נוסף ל</w:t>
+      </w:r>
+      <w:r>
+        <w:rPr>
+          <w:lang w:val="en-US"/>
+        </w:rPr>
         <w:t>swagger</w:t>
       </w:r>
       <w:r>
         <w:rPr>
-          <w:rtl/>
-        </w:rPr>
-        <w:t xml:space="preserve"> </w:t>
-      </w:r>
-      <w:r>
-        <w:rPr>
-          <w:rtl/>
-        </w:rPr>
-        <w:t>–</w:t>
-      </w:r>
-      <w:r>
-        <w:rPr>
-          <w:rtl/>
-        </w:rPr>
-        <w:t xml:space="preserve"> האם</w:t>
-      </w:r>
-    </w:p>
-    <w:p>
-      <w:pPr>
-        <w:bidi/>
-        <w:rPr>
-          <w:rFonts w:hint="cs"/>
-          <w:rtl/>
-          <w:lang w:val="en-US"/>
-        </w:rPr>
-      </w:pPr>
-      <w:r>
-        <w:rPr>
-          <w:rtl/>
-        </w:rPr>
-        <w:tab/>
-      </w:r>
-      <w:r>
-        <w:rPr>
-          <w:rFonts w:hint="cs"/>
-          <w:rtl/>
-          <w:lang w:val="en-US"/>
-        </w:rPr>
-        <w:t>שימוש נוסף ל</w:t>
-      </w:r>
-      <w:r>
-        <w:rPr>
-          <w:lang w:val="en-US"/>
-        </w:rPr>
-        <w:t>swagger</w:t>
-      </w:r>
-      <w:r>
-        <w:rPr>
           <w:rFonts w:hint="cs"/>
           <w:rtl/>
           <w:lang w:val="en-US"/>
         </w:rPr>
         <w:t xml:space="preserve"> הוא בדיקה וולידציה של ה</w:t>
       </w:r>
-      <w:proofErr w:type="spellStart"/>
       <w:r>
         <w:rPr>
           <w:lang w:val="en-US"/>
         </w:rPr>
         <w:t>api</w:t>
       </w:r>
-      <w:proofErr w:type="spellEnd"/>
     </w:p>
     <w:p>
       <w:pPr>
@@ -4931,25 +4312,7 @@
           <w:rtl/>
           <w:lang w:val="en-US"/>
         </w:rPr>
-        <w:t xml:space="preserve"> ממשק </w:t>
-      </w:r>
-      <w:proofErr w:type="spellStart"/>
-      <w:r>
-        <w:rPr>
-          <w:rFonts w:hint="cs"/>
-          <w:rtl/>
-          <w:lang w:val="en-US"/>
-        </w:rPr>
-        <w:t>אינטרקטיבי</w:t>
-      </w:r>
-      <w:proofErr w:type="spellEnd"/>
-      <w:r>
-        <w:rPr>
-          <w:rFonts w:hint="cs"/>
-          <w:rtl/>
-          <w:lang w:val="en-US"/>
-        </w:rPr>
-        <w:t xml:space="preserve"> שניתן להתאים באופן אישי ומאפשר לראות, לנתר, ולנתח מידע ממספר מקורות</w:t>
+        <w:t xml:space="preserve"> ממשק אינטרקטיבי שניתן להתאים באופן אישי ומאפשר לראות, לנתר, ולנתח מידע ממספר מקורות</w:t>
       </w:r>
     </w:p>
     <w:p>
@@ -4973,23 +4336,14 @@
           <w:rtl/>
           <w:lang w:val="en-US"/>
         </w:rPr>
+        <w:t xml:space="preserve"> -</w:t>
+      </w:r>
+      <w:r>
+        <w:rPr>
+          <w:lang w:val="en-US"/>
+        </w:rPr>
         <w:t xml:space="preserve"> </w:t>
       </w:r>
-      <w:proofErr w:type="gramStart"/>
-      <w:r>
-        <w:rPr>
-          <w:rFonts w:hint="cs"/>
-          <w:rtl/>
-          <w:lang w:val="en-US"/>
-        </w:rPr>
-        <w:t>-</w:t>
-      </w:r>
-      <w:r>
-        <w:rPr>
-          <w:lang w:val="en-US"/>
-        </w:rPr>
-        <w:t xml:space="preserve"> </w:t>
-      </w:r>
       <w:r>
         <w:rPr>
           <w:rFonts w:hint="cs"/>
@@ -4998,7 +4352,6 @@
         </w:rPr>
         <w:t xml:space="preserve"> ה</w:t>
       </w:r>
-      <w:proofErr w:type="gramEnd"/>
       <w:r>
         <w:rPr>
           <w:lang w:val="en-US"/>
@@ -5081,35 +4434,8 @@
       </w:pPr>
       <w:r>
         <w:tab/>
-      </w:r>
-      <w:proofErr w:type="spellStart"/>
-      <w:proofErr w:type="gramStart"/>
-      <w:r>
-        <w:t>mySQL</w:t>
-      </w:r>
-      <w:proofErr w:type="spellEnd"/>
-      <w:r>
-        <w:t xml:space="preserve"> ,</w:t>
-      </w:r>
-      <w:proofErr w:type="gramEnd"/>
-      <w:r>
-        <w:t xml:space="preserve"> </w:t>
-      </w:r>
-      <w:proofErr w:type="spellStart"/>
-      <w:proofErr w:type="gramStart"/>
-      <w:r>
-        <w:t>PostgreSQL,Elasticsearch</w:t>
-      </w:r>
-      <w:proofErr w:type="gramEnd"/>
-      <w:r>
-        <w:t>,</w:t>
-      </w:r>
-      <w:proofErr w:type="gramStart"/>
-      <w:r>
-        <w:t>openTSDB,prometheus</w:t>
-      </w:r>
-      <w:proofErr w:type="spellEnd"/>
-      <w:proofErr w:type="gramEnd"/>
+        <w:t>mySQL , PostgreSQL,Elasticsearch,openTSDB,prometheus</w:t>
+      </w:r>
     </w:p>
     <w:p>
       <w:pPr>
@@ -5439,11 +4765,9 @@
       <w:pPr>
         <w:bidi/>
       </w:pPr>
-      <w:proofErr w:type="gramStart"/>
       <w:r>
         <w:t>?BE</w:t>
       </w:r>
-      <w:proofErr w:type="gramEnd"/>
       <w:r>
         <w:rPr>
           <w:rtl/>
@@ -5463,6 +4787,32 @@
     <w:p>
       <w:pPr>
         <w:bidi/>
+        <w:rPr>
+          <w:rFonts w:hint="cs"/>
+          <w:rtl/>
+          <w:lang w:val="en-US"/>
+        </w:rPr>
+      </w:pPr>
+      <w:r>
+        <w:tab/>
+      </w:r>
+      <w:r>
+        <w:rPr>
+          <w:rFonts w:hint="cs"/>
+          <w:rtl/>
+        </w:rPr>
+        <w:t xml:space="preserve">לצורך בדיקה ודיבוג של </w:t>
+      </w:r>
+      <w:r>
+        <w:rPr>
+          <w:lang w:val="en-US"/>
+        </w:rPr>
+        <w:t>APIs</w:t>
+      </w:r>
+    </w:p>
+    <w:p>
+      <w:pPr>
+        <w:bidi/>
       </w:pPr>
       <w:r>
         <w:rPr>
@@ -5492,12 +4842,13 @@
     <w:p>
       <w:pPr>
         <w:bidi/>
-      </w:pPr>
-      <w:proofErr w:type="gramStart"/>
+        <w:rPr>
+          <w:rtl/>
+        </w:rPr>
+      </w:pPr>
       <w:r>
         <w:t>?API</w:t>
       </w:r>
-      <w:proofErr w:type="gramEnd"/>
       <w:r>
         <w:rPr>
           <w:rtl/>
@@ -5508,6 +4859,65 @@
     <w:p>
       <w:pPr>
         <w:bidi/>
+        <w:ind w:left="720"/>
+        <w:rPr>
+          <w:rFonts w:hint="cs"/>
+          <w:rtl/>
+          <w:lang w:val="en-US"/>
+        </w:rPr>
+      </w:pPr>
+      <w:r>
+        <w:rPr>
+          <w:lang w:val="en-US"/>
+        </w:rPr>
+        <w:t>Postman collections</w:t>
+      </w:r>
+      <w:r>
+        <w:rPr>
+          <w:rFonts w:hint="cs"/>
+          <w:rtl/>
+          <w:lang w:val="en-US"/>
+        </w:rPr>
+        <w:t xml:space="preserve"> הם אוסף של בקשות </w:t>
+      </w:r>
+      <w:r>
+        <w:rPr>
+          <w:lang w:val="en-US"/>
+        </w:rPr>
+        <w:t>API</w:t>
+      </w:r>
+      <w:r>
+        <w:rPr>
+          <w:rFonts w:hint="cs"/>
+          <w:rtl/>
+          <w:lang w:val="en-US"/>
+        </w:rPr>
+        <w:t xml:space="preserve"> שאפשר להשתמש בהם, להריץ אותם בצורה אוטומטית, ולחלוק עם מפתחים אחרים. ככה צוות הפיתוח יכול ליצור אוסף של בקשות על מנת לבדוק את ה</w:t>
+      </w:r>
+      <w:r>
+        <w:rPr>
+          <w:lang w:val="en-US"/>
+        </w:rPr>
+        <w:t>API</w:t>
+      </w:r>
+      <w:r>
+        <w:rPr>
+          <w:rFonts w:hint="cs"/>
+          <w:rtl/>
+          <w:lang w:val="en-US"/>
+        </w:rPr>
+        <w:t xml:space="preserve"> , וכל אחד מהמפתחים יוכל להריץ בצורה אוטומטית את כל הבקשות וכך לחסוך זמן בבדיקת ה</w:t>
+      </w:r>
+      <w:r>
+        <w:rPr>
+          <w:lang w:val="en-US"/>
+        </w:rPr>
+        <w:t>API</w:t>
+      </w:r>
+    </w:p>
+    <w:p>
+      <w:pPr>
+        <w:bidi/>
       </w:pPr>
       <w:r>
         <w:rPr>
@@ -5519,9 +4929,66 @@
     <w:p>
       <w:pPr>
         <w:bidi/>
-      </w:pPr>
-    </w:p>
-    <w:p/>
+        <w:ind w:left="720"/>
+        <w:rPr>
+          <w:rFonts w:hint="cs"/>
+          <w:rtl/>
+          <w:lang w:val="en-US"/>
+        </w:rPr>
+      </w:pPr>
+      <w:r>
+        <w:rPr>
+          <w:rFonts w:hint="cs"/>
+          <w:rtl/>
+        </w:rPr>
+        <w:t xml:space="preserve">מנגנון משתני הסביבה מאפשר לנו להגדיר סביבות ובתוך סביבה להגדיר משתנים שונים עם ערכים שונים. </w:t>
+      </w:r>
+      <w:r>
+        <w:rPr>
+          <w:rFonts w:hint="cs"/>
+          <w:rtl/>
+          <w:lang w:val="en-US"/>
+        </w:rPr>
+        <w:t>דבר זה שימושי לנו כאשר אנחנו עובדים על סביבת פיתוח לוקאלית מכיוון שאנחנו יכולים להגדיר שלמשתנ</w:t>
+      </w:r>
+      <w:r>
+        <w:rPr>
+          <w:rFonts w:hint="cs"/>
+          <w:rtl/>
+          <w:lang w:val="en-US"/>
+        </w:rPr>
+        <w:t xml:space="preserve">ה מסוים יהיה ערכים שונים בסביבת הפיתוח ובסביבה המבצעית, וכך להשתמש באותן בקשות </w:t>
+      </w:r>
+      <w:r>
+        <w:rPr>
+          <w:lang w:val="en-US"/>
+        </w:rPr>
+        <w:t>API</w:t>
+      </w:r>
+      <w:r>
+        <w:rPr>
+          <w:rFonts w:hint="cs"/>
+          <w:rtl/>
+          <w:lang w:val="en-US"/>
+        </w:rPr>
+        <w:t xml:space="preserve"> בסביבות השונות.</w:t>
+      </w:r>
+    </w:p>
+    <w:p>
+      <w:pPr>
+        <w:bidi/>
+        <w:ind w:left="720" w:hanging="720"/>
+        <w:rPr>
+          <w:lang w:val="en-US"/>
+        </w:rPr>
+      </w:pPr>
+      <w:r>
+        <w:rPr>
+          <w:rtl/>
+        </w:rPr>
+        <w:tab/>
+      </w:r>
+    </w:p>
     <w:sectPr>
       <w:pgSz w:w="11909" w:h="16834"/>
       <w:pgMar w:top="1440" w:right="1440" w:bottom="1440" w:left="1440" w:header="720" w:footer="720" w:gutter="0"/>

</xml_diff>